<commit_message>
Deploying to gh-pages from @ Morrison-Lab/mds@8dee5acc32c98aa976db34ee9506bdad7b0bef5f 🚀
</commit_message>
<xml_diff>
--- a/notation.docx
+++ b/notation.docx
@@ -15,7 +15,7 @@
         <w:pStyle w:val="Date"/>
       </w:pPr>
       <w:r>
-        <w:t xml:space="preserve">Last modified: 2026-09-30 14:50:05 (PDT)</w:t>
+        <w:t xml:space="preserve">Last modified: 2026-09-30 15:10:34 (PDT)</w:t>
       </w:r>
     </w:p>
     <w:p>
@@ -3769,7 +3769,7 @@
       </w:r>
     </w:p>
     <w:bookmarkEnd w:id="28"/>
-    <w:bookmarkStart w:id="48" w:name="sec-indicator-functions"/>
+    <w:bookmarkStart w:id="47" w:name="sec-indicator-functions"/>
     <w:p>
       <w:pPr>
         <w:pStyle w:val="Heading2"/>
@@ -6494,7 +6494,7 @@
     </w:p>
     <w:bookmarkEnd w:id="34"/>
     <w:bookmarkEnd w:id="35"/>
-    <w:bookmarkStart w:id="42" w:name="iverson-bracket-notation"/>
+    <w:bookmarkStart w:id="41" w:name="iverson-bracket-notation"/>
     <w:p>
       <w:pPr>
         <w:pStyle w:val="Heading3"/>
@@ -7430,7 +7430,7 @@
       </w:r>
     </w:p>
     <w:bookmarkEnd w:id="39"/>
-    <w:bookmarkStart w:id="41" w:name="exm-kronecker-delta"/>
+    <w:bookmarkStart w:id="40" w:name="exm-kronecker-delta"/>
     <w:p>
       <w:pPr>
         <w:pStyle w:val="BodyText"/>
@@ -7466,7 +7466,7 @@
           </m:e>
           <m:sub>
             <m:r>
-              <m:t>22</m:t>
+              <m:t>11</m:t>
             </m:r>
           </m:sub>
         </m:sSub>
@@ -7483,7 +7483,7 @@
           <m:t>[</m:t>
         </m:r>
         <m:r>
-          <m:t>2</m:t>
+          <m:t>1</m:t>
         </m:r>
         <m:r>
           <m:rPr>
@@ -7492,7 +7492,7 @@
           <m:t>=</m:t>
         </m:r>
         <m:r>
-          <m:t>2</m:t>
+          <m:t>1</m:t>
         </m:r>
         <m:r>
           <m:rPr>
@@ -7531,7 +7531,7 @@
           </m:e>
           <m:sub>
             <m:r>
-              <m:t>23</m:t>
+              <m:t>12</m:t>
             </m:r>
           </m:sub>
         </m:sSub>
@@ -7548,16 +7548,16 @@
           <m:t>[</m:t>
         </m:r>
         <m:r>
+          <m:t>1</m:t>
+        </m:r>
+        <m:r>
+          <m:rPr>
+            <m:sty m:val="p"/>
+          </m:rPr>
+          <m:t>=</m:t>
+        </m:r>
+        <m:r>
           <m:t>2</m:t>
-        </m:r>
-        <m:r>
-          <m:rPr>
-            <m:sty m:val="p"/>
-          </m:rPr>
-          <m:t>=</m:t>
-        </m:r>
-        <m:r>
-          <m:t>3</m:t>
         </m:r>
         <m:r>
           <m:rPr>
@@ -7587,78 +7587,81 @@
           <w:numId w:val="1011"/>
         </w:numPr>
       </w:pPr>
-      <w:r>
-        <w:t xml:space="preserve">The entries of the</w:t>
-      </w:r>
-      <w:r>
-        <w:t xml:space="preserve"> </w:t>
-      </w:r>
-      <m:oMath>
-        <m:r>
-          <m:t>p</m:t>
-        </m:r>
-        <m:r>
-          <m:rPr>
-            <m:sty m:val="p"/>
-          </m:rPr>
-          <m:t>×</m:t>
-        </m:r>
-        <m:r>
-          <m:t>p</m:t>
-        </m:r>
-      </m:oMath>
-      <w:r>
-        <w:t xml:space="preserve"> </w:t>
-      </w:r>
-      <w:r>
-        <w:t xml:space="preserve">identity matrix</w:t>
-      </w:r>
-      <w:r>
-        <w:t xml:space="preserve"> </w:t>
-      </w:r>
-      <w:r>
-        <w:t xml:space="preserve">are Kronecker deltas:</w:t>
-      </w:r>
-      <w:r>
-        <w:t xml:space="preserve"> </w:t>
-      </w:r>
-      <m:oMath>
-        <m:r>
-          <m:rPr>
-            <m:sty m:val="p"/>
-          </m:rPr>
-          <m:t>(</m:t>
-        </m:r>
+      <m:oMath>
         <m:sSub>
           <m:e>
             <m:r>
-              <m:rPr>
-                <m:sty m:val="bi"/>
-              </m:rPr>
-              <m:t>I</m:t>
+              <m:t>δ</m:t>
             </m:r>
           </m:e>
           <m:sub>
             <m:r>
-              <m:t>p</m:t>
+              <m:t>22</m:t>
             </m:r>
           </m:sub>
         </m:sSub>
+        <m:r>
+          <m:rPr>
+            <m:sty m:val="p"/>
+          </m:rPr>
+          <m:t>=</m:t>
+        </m:r>
+        <m:r>
+          <m:rPr>
+            <m:sty m:val="p"/>
+          </m:rPr>
+          <m:t>[</m:t>
+        </m:r>
+        <m:r>
+          <m:t>2</m:t>
+        </m:r>
+        <m:r>
+          <m:rPr>
+            <m:sty m:val="p"/>
+          </m:rPr>
+          <m:t>=</m:t>
+        </m:r>
+        <m:r>
+          <m:t>2</m:t>
+        </m:r>
+        <m:r>
+          <m:rPr>
+            <m:sty m:val="p"/>
+          </m:rPr>
+          <m:t>]</m:t>
+        </m:r>
+        <m:r>
+          <m:rPr>
+            <m:sty m:val="p"/>
+          </m:rPr>
+          <m:t>=</m:t>
+        </m:r>
+        <m:r>
+          <m:t>1</m:t>
+        </m:r>
+      </m:oMath>
+      <w:r>
+        <w:t xml:space="preserve">.</w:t>
+      </w:r>
+    </w:p>
+    <w:p>
+      <w:pPr>
+        <w:pStyle w:val="Compact"/>
+        <w:numPr>
+          <w:ilvl w:val="0"/>
+          <w:numId w:val="1011"/>
+        </w:numPr>
+      </w:pPr>
+      <m:oMath>
         <m:sSub>
           <m:e>
             <m:r>
-              <m:rPr>
-                <m:sty m:val="p"/>
-              </m:rPr>
-              <m:t>)</m:t>
+              <m:t>δ</m:t>
             </m:r>
           </m:e>
           <m:sub>
             <m:r>
-              <m:t>i</m:t>
-            </m:r>
-            <m:r>
-              <m:t>j</m:t>
+              <m:t>23</m:t>
             </m:r>
           </m:sub>
         </m:sSub>
@@ -7668,46 +7671,47 @@
           </m:rPr>
           <m:t>=</m:t>
         </m:r>
-        <m:sSub>
-          <m:e>
-            <m:r>
-              <m:t>δ</m:t>
-            </m:r>
-          </m:e>
-          <m:sub>
-            <m:r>
-              <m:t>i</m:t>
-            </m:r>
-            <m:r>
-              <m:t>j</m:t>
-            </m:r>
-          </m:sub>
-        </m:sSub>
-      </m:oMath>
-      <w:r>
-        <w:t xml:space="preserve"> </w:t>
-      </w:r>
-      <w:r>
-        <w:t xml:space="preserve">(see</w:t>
-      </w:r>
-      <w:r>
-        <w:t xml:space="preserve"> </w:t>
-      </w:r>
-      <w:hyperlink r:id="rId40">
-        <w:r>
-          <w:rPr>
-            <w:rStyle w:val="Hyperlink"/>
-          </w:rPr>
-          <w:t xml:space="preserve">identity matrix</w:t>
-        </w:r>
-      </w:hyperlink>
-      <w:r>
-        <w:t xml:space="preserve">).</w:t>
+        <m:r>
+          <m:rPr>
+            <m:sty m:val="p"/>
+          </m:rPr>
+          <m:t>[</m:t>
+        </m:r>
+        <m:r>
+          <m:t>2</m:t>
+        </m:r>
+        <m:r>
+          <m:rPr>
+            <m:sty m:val="p"/>
+          </m:rPr>
+          <m:t>=</m:t>
+        </m:r>
+        <m:r>
+          <m:t>3</m:t>
+        </m:r>
+        <m:r>
+          <m:rPr>
+            <m:sty m:val="p"/>
+          </m:rPr>
+          <m:t>]</m:t>
+        </m:r>
+        <m:r>
+          <m:rPr>
+            <m:sty m:val="p"/>
+          </m:rPr>
+          <m:t>=</m:t>
+        </m:r>
+        <m:r>
+          <m:t>0</m:t>
+        </m:r>
+      </m:oMath>
+      <w:r>
+        <w:t xml:space="preserve">.</w:t>
       </w:r>
     </w:p>
+    <w:bookmarkEnd w:id="40"/>
     <w:bookmarkEnd w:id="41"/>
-    <w:bookmarkEnd w:id="42"/>
-    <w:bookmarkStart w:id="43" w:name="Xd6f58182005cccf55080a628cd9152d2b1165ed"/>
+    <w:bookmarkStart w:id="42" w:name="Xd6f58182005cccf55080a628cd9152d2b1165ed"/>
     <w:p>
       <w:pPr>
         <w:pStyle w:val="Heading3"/>
@@ -8215,8 +8219,8 @@
         <w:t xml:space="preserve">rather than the bare Iverson bracket.</w:t>
       </w:r>
     </w:p>
-    <w:bookmarkEnd w:id="43"/>
-    <w:bookmarkStart w:id="45" w:name="summary-of-indicator-notations"/>
+    <w:bookmarkEnd w:id="42"/>
+    <w:bookmarkStart w:id="44" w:name="summary-of-indicator-notations"/>
     <w:p>
       <w:pPr>
         <w:pStyle w:val="Heading3"/>
@@ -8257,7 +8261,7 @@
       <w:tr>
         <w:tc>
           <w:tcPr/>
-          <w:bookmarkStart w:id="44" w:name="tbl-indicator-notations"/>
+          <w:bookmarkStart w:id="43" w:name="tbl-indicator-notations"/>
           <w:p>
             <w:pPr>
               <w:jc w:val="center"/>
@@ -9125,13 +9129,13 @@
               </w:tc>
             </w:tr>
           </w:tbl>
-          <w:bookmarkEnd w:id="44"/>
+          <w:bookmarkEnd w:id="43"/>
           <w:p/>
         </w:tc>
       </w:tr>
     </w:tbl>
-    <w:bookmarkEnd w:id="45"/>
-    <w:bookmarkStart w:id="46" w:name="conventions-in-this-book"/>
+    <w:bookmarkEnd w:id="44"/>
+    <w:bookmarkStart w:id="45" w:name="conventions-in-this-book"/>
     <w:p>
       <w:pPr>
         <w:pStyle w:val="Heading3"/>
@@ -9485,8 +9489,8 @@
         <w:t xml:space="preserve">).</w:t>
       </w:r>
     </w:p>
-    <w:bookmarkEnd w:id="46"/>
-    <w:bookmarkStart w:id="47" w:name="key-algebraic-properties"/>
+    <w:bookmarkEnd w:id="45"/>
+    <w:bookmarkStart w:id="46" w:name="key-algebraic-properties"/>
     <w:p>
       <w:pPr>
         <w:pStyle w:val="Heading3"/>
@@ -10476,9 +10480,9 @@
         <w:t xml:space="preserve">and regression models for binary outcomes.</w:t>
       </w:r>
     </w:p>
+    <w:bookmarkEnd w:id="46"/>
     <w:bookmarkEnd w:id="47"/>
-    <w:bookmarkEnd w:id="48"/>
-    <w:bookmarkStart w:id="55" w:name="X93a3d4ef5e06a67ae6b891e46b41b74b3674f55"/>
+    <w:bookmarkStart w:id="54" w:name="X93a3d4ef5e06a67ae6b891e46b41b74b3674f55"/>
     <w:p>
       <w:pPr>
         <w:pStyle w:val="Heading2"/>
@@ -10607,7 +10611,7 @@
       <w:r>
         <w:t xml:space="preserve"> </w:t>
       </w:r>
-      <w:hyperlink r:id="rId49">
+      <w:hyperlink r:id="rId48">
         <w:r>
           <w:rPr>
             <w:rStyle w:val="Hyperlink"/>
@@ -10627,7 +10631,7 @@
       <w:r>
         <w:t xml:space="preserve"> </w:t>
       </w:r>
-      <w:hyperlink r:id="rId50">
+      <w:hyperlink r:id="rId49">
         <w:r>
           <w:rPr>
             <w:rStyle w:val="Hyperlink"/>
@@ -10647,7 +10651,7 @@
       <w:r>
         <w:t xml:space="preserve"> </w:t>
       </w:r>
-      <w:hyperlink r:id="rId51">
+      <w:hyperlink r:id="rId50">
         <w:r>
           <w:rPr>
             <w:rStyle w:val="Hyperlink"/>
@@ -10667,7 +10671,7 @@
       <w:r>
         <w:t xml:space="preserve"> </w:t>
       </w:r>
-      <w:hyperlink r:id="rId52">
+      <w:hyperlink r:id="rId51">
         <w:r>
           <w:rPr>
             <w:rStyle w:val="Hyperlink"/>
@@ -10687,7 +10691,7 @@
       <w:r>
         <w:t xml:space="preserve"> </w:t>
       </w:r>
-      <w:hyperlink r:id="rId53">
+      <w:hyperlink r:id="rId52">
         <w:r>
           <w:rPr>
             <w:rStyle w:val="Hyperlink"/>
@@ -10728,7 +10732,7 @@
       <w:r>
         <w:t xml:space="preserve"> </w:t>
       </w:r>
-      <w:hyperlink r:id="rId54">
+      <w:hyperlink r:id="rId53">
         <w:r>
           <w:rPr>
             <w:rStyle w:val="Hyperlink"/>
@@ -10740,8 +10744,8 @@
         <w:t xml:space="preserve">.</w:t>
       </w:r>
     </w:p>
-    <w:bookmarkEnd w:id="55"/>
-    <w:bookmarkStart w:id="59" w:name="references"/>
+    <w:bookmarkEnd w:id="54"/>
+    <w:bookmarkStart w:id="58" w:name="references"/>
     <w:p>
       <w:pPr>
         <w:pStyle w:val="Heading2"/>
@@ -10750,8 +10754,8 @@
         <w:t xml:space="preserve">References</w:t>
       </w:r>
     </w:p>
-    <w:bookmarkStart w:id="58" w:name="refs"/>
-    <w:bookmarkStart w:id="57" w:name="ref-nelder1972generalized"/>
+    <w:bookmarkStart w:id="57" w:name="refs"/>
+    <w:bookmarkStart w:id="56" w:name="ref-nelder1972generalized"/>
     <w:p>
       <w:pPr>
         <w:pStyle w:val="Bibliography"/>
@@ -10784,7 +10788,7 @@
       <w:r>
         <w:t xml:space="preserve"> </w:t>
       </w:r>
-      <w:hyperlink r:id="rId56">
+      <w:hyperlink r:id="rId55">
         <w:r>
           <w:rPr>
             <w:rStyle w:val="Hyperlink"/>
@@ -10796,9 +10800,9 @@
         <w:t xml:space="preserve">.</w:t>
       </w:r>
     </w:p>
+    <w:bookmarkEnd w:id="56"/>
     <w:bookmarkEnd w:id="57"/>
     <w:bookmarkEnd w:id="58"/>
-    <w:bookmarkEnd w:id="59"/>
     <w:sectPr>
       <w:footnotePr>
         <w:numRestart w:val="eachSect"/>

</xml_diff>

<commit_message>
Deploying to gh-pages from @ Morrison-Lab/mds@e01159463f914cd1b70763f617db5ec589bb3d7f 🚀
</commit_message>
<xml_diff>
--- a/notation.docx
+++ b/notation.docx
@@ -15,7 +15,7 @@
         <w:pStyle w:val="Date"/>
       </w:pPr>
       <w:r>
-        <w:t xml:space="preserve">Last modified: 2026-10-09 10:43:26 (PDT)</w:t>
+        <w:t xml:space="preserve">Last modified: 2026-10-09 11:00:09 (PDT)</w:t>
       </w:r>
     </w:p>
     <w:p>
@@ -11177,95 +11177,122 @@
       <w:r>
         <w:t xml:space="preserve">For example,</w:t>
       </w:r>
-      <w:r>
-        <w:t xml:space="preserve"> </w:t>
-      </w:r>
-      <m:oMath>
-        <m:r>
-          <m:t>4</m:t>
-        </m:r>
-        <m:r>
-          <m:rPr>
-            <m:sty m:val="p"/>
-          </m:rPr>
-          <m:t>+</m:t>
-        </m:r>
-        <m:r>
-          <m:t>10</m:t>
-        </m:r>
-        <m:r>
-          <m:rPr>
-            <m:sty m:val="p"/>
-          </m:rPr>
-          <m:t>=</m:t>
-        </m:r>
-        <m:r>
-          <m:t>2</m:t>
-        </m:r>
-        <m:r>
-          <m:rPr>
-            <m:sty m:val="p"/>
-          </m:rPr>
-          <m:t>⋅</m:t>
-        </m:r>
-        <m:r>
-          <m:t>2</m:t>
-        </m:r>
-        <m:r>
-          <m:rPr>
-            <m:sty m:val="p"/>
-          </m:rPr>
-          <m:t>+</m:t>
-        </m:r>
-        <m:r>
-          <m:t>2</m:t>
-        </m:r>
-        <m:r>
-          <m:rPr>
-            <m:sty m:val="p"/>
-          </m:rPr>
-          <m:t>⋅</m:t>
-        </m:r>
-        <m:r>
-          <m:t>5</m:t>
-        </m:r>
-        <m:r>
-          <m:rPr>
-            <m:sty m:val="p"/>
-          </m:rPr>
-          <m:t>=</m:t>
-        </m:r>
-        <m:r>
-          <m:t>2</m:t>
-        </m:r>
-        <m:r>
-          <m:rPr>
-            <m:sty m:val="p"/>
-          </m:rPr>
-          <m:t>⋅</m:t>
-        </m:r>
-        <m:r>
-          <m:t>7</m:t>
-        </m:r>
-        <m:r>
-          <m:rPr>
-            <m:sty m:val="p"/>
-          </m:rPr>
-          <m:t>=</m:t>
-        </m:r>
-        <m:r>
-          <m:t>14</m:t>
-        </m:r>
-      </m:oMath>
-      <w:r>
-        <w:t xml:space="preserve">.</w:t>
-      </w:r>
+    </w:p>
+    <w:p>
+      <w:pPr>
+        <w:pStyle w:val="BodyText"/>
+      </w:pPr>
+      <m:oMathPara>
+        <m:oMathParaPr>
+          <m:jc m:val="center"/>
+        </m:oMathParaPr>
+        <m:oMath>
+          <m:eqArr>
+            <m:e>
+              <m:r>
+                <m:t>4</m:t>
+              </m:r>
+              <m:r>
+                <m:rPr>
+                  <m:sty m:val="p"/>
+                </m:rPr>
+                <m:t>+</m:t>
+              </m:r>
+              <m:r>
+                <m:t>10</m:t>
+              </m:r>
+              <m:r>
+                <m:t>&amp;</m:t>
+              </m:r>
+              <m:r>
+                <m:rPr>
+                  <m:sty m:val="p"/>
+                </m:rPr>
+                <m:t>=</m:t>
+              </m:r>
+              <m:r>
+                <m:t>2</m:t>
+              </m:r>
+              <m:r>
+                <m:rPr>
+                  <m:sty m:val="p"/>
+                </m:rPr>
+                <m:t>⋅</m:t>
+              </m:r>
+              <m:r>
+                <m:t>2</m:t>
+              </m:r>
+              <m:r>
+                <m:rPr>
+                  <m:sty m:val="p"/>
+                </m:rPr>
+                <m:t>+</m:t>
+              </m:r>
+              <m:r>
+                <m:t>2</m:t>
+              </m:r>
+              <m:r>
+                <m:rPr>
+                  <m:sty m:val="p"/>
+                </m:rPr>
+                <m:t>⋅</m:t>
+              </m:r>
+              <m:r>
+                <m:t>5</m:t>
+              </m:r>
+            </m:e>
+            <m:e>
+              <m:r>
+                <m:t>&amp;</m:t>
+              </m:r>
+              <m:r>
+                <m:rPr>
+                  <m:sty m:val="p"/>
+                </m:rPr>
+                <m:t>=</m:t>
+              </m:r>
+              <m:r>
+                <m:t>2</m:t>
+              </m:r>
+              <m:r>
+                <m:rPr>
+                  <m:sty m:val="p"/>
+                </m:rPr>
+                <m:t>⋅</m:t>
+              </m:r>
+              <m:r>
+                <m:t>7</m:t>
+              </m:r>
+            </m:e>
+            <m:e>
+              <m:r>
+                <m:t>&amp;</m:t>
+              </m:r>
+              <m:r>
+                <m:rPr>
+                  <m:sty m:val="p"/>
+                </m:rPr>
+                <m:t>=</m:t>
+              </m:r>
+              <m:r>
+                <m:t>14</m:t>
+              </m:r>
+              <m:r>
+                <m:rPr>
+                  <m:sty m:val="p"/>
+                </m:rPr>
+                <m:t>.</m:t>
+              </m:r>
+            </m:e>
+          </m:eqArr>
+        </m:oMath>
+      </m:oMathPara>
     </w:p>
     <w:bookmarkEnd w:id="66"/>
     <w:bookmarkStart w:id="67" w:name="def-derivation"/>
     <w:p>
       <w:pPr>
-        <w:pStyle w:val="BodyText"/>
+        <w:pStyle w:val="FirstParagraph"/>
       </w:pPr>
       <w:r>
         <w:rPr>
@@ -12592,100 +12619,135 @@
       <w:r>
         <w:t xml:space="preserve">For example,</w:t>
       </w:r>
-      <w:r>
-        <w:t xml:space="preserve"> </w:t>
-      </w:r>
-      <m:oMath>
-        <m:r>
-          <m:t>2</m:t>
-        </m:r>
-        <m:r>
-          <m:rPr>
-            <m:sty m:val="p"/>
-          </m:rPr>
-          <m:t>+</m:t>
-        </m:r>
-        <m:r>
-          <m:t>4</m:t>
-        </m:r>
-        <m:r>
-          <m:rPr>
-            <m:sty m:val="p"/>
-          </m:rPr>
-          <m:t>+</m:t>
-        </m:r>
-        <m:r>
-          <m:t>6</m:t>
-        </m:r>
-        <m:r>
-          <m:rPr>
-            <m:sty m:val="p"/>
-          </m:rPr>
-          <m:t>=</m:t>
-        </m:r>
-        <m:r>
-          <m:rPr>
-            <m:sty m:val="p"/>
-          </m:rPr>
-          <m:t>(</m:t>
-        </m:r>
-        <m:r>
-          <m:t>2</m:t>
-        </m:r>
-        <m:r>
-          <m:rPr>
-            <m:sty m:val="p"/>
-          </m:rPr>
-          <m:t>+</m:t>
-        </m:r>
-        <m:r>
-          <m:t>4</m:t>
-        </m:r>
-        <m:r>
-          <m:rPr>
-            <m:sty m:val="p"/>
-          </m:rPr>
-          <m:t>)</m:t>
-        </m:r>
-        <m:r>
-          <m:rPr>
-            <m:sty m:val="p"/>
-          </m:rPr>
-          <m:t>+</m:t>
-        </m:r>
-        <m:r>
-          <m:t>6</m:t>
-        </m:r>
-        <m:r>
-          <m:rPr>
-            <m:sty m:val="p"/>
-          </m:rPr>
-          <m:t>=</m:t>
-        </m:r>
-        <m:r>
-          <m:t>6</m:t>
-        </m:r>
-        <m:r>
-          <m:rPr>
-            <m:sty m:val="p"/>
-          </m:rPr>
-          <m:t>+</m:t>
-        </m:r>
-        <m:r>
-          <m:t>6</m:t>
-        </m:r>
-        <m:r>
-          <m:rPr>
-            <m:sty m:val="p"/>
-          </m:rPr>
-          <m:t>=</m:t>
-        </m:r>
-        <m:r>
-          <m:t>12</m:t>
-        </m:r>
-      </m:oMath>
-      <w:r>
-        <w:t xml:space="preserve">, which is even.</w:t>
+    </w:p>
+    <w:p>
+      <w:pPr>
+        <w:pStyle w:val="BodyText"/>
+      </w:pPr>
+      <m:oMathPara>
+        <m:oMathParaPr>
+          <m:jc m:val="center"/>
+        </m:oMathParaPr>
+        <m:oMath>
+          <m:eqArr>
+            <m:e>
+              <m:r>
+                <m:t>2</m:t>
+              </m:r>
+              <m:r>
+                <m:rPr>
+                  <m:sty m:val="p"/>
+                </m:rPr>
+                <m:t>+</m:t>
+              </m:r>
+              <m:r>
+                <m:t>4</m:t>
+              </m:r>
+              <m:r>
+                <m:rPr>
+                  <m:sty m:val="p"/>
+                </m:rPr>
+                <m:t>+</m:t>
+              </m:r>
+              <m:r>
+                <m:t>6</m:t>
+              </m:r>
+              <m:r>
+                <m:t>&amp;</m:t>
+              </m:r>
+              <m:r>
+                <m:rPr>
+                  <m:sty m:val="p"/>
+                </m:rPr>
+                <m:t>=</m:t>
+              </m:r>
+              <m:r>
+                <m:rPr>
+                  <m:sty m:val="p"/>
+                </m:rPr>
+                <m:t>(</m:t>
+              </m:r>
+              <m:r>
+                <m:t>2</m:t>
+              </m:r>
+              <m:r>
+                <m:rPr>
+                  <m:sty m:val="p"/>
+                </m:rPr>
+                <m:t>+</m:t>
+              </m:r>
+              <m:r>
+                <m:t>4</m:t>
+              </m:r>
+              <m:r>
+                <m:rPr>
+                  <m:sty m:val="p"/>
+                </m:rPr>
+                <m:t>)</m:t>
+              </m:r>
+              <m:r>
+                <m:rPr>
+                  <m:sty m:val="p"/>
+                </m:rPr>
+                <m:t>+</m:t>
+              </m:r>
+              <m:r>
+                <m:t>6</m:t>
+              </m:r>
+            </m:e>
+            <m:e>
+              <m:r>
+                <m:t>&amp;</m:t>
+              </m:r>
+              <m:r>
+                <m:rPr>
+                  <m:sty m:val="p"/>
+                </m:rPr>
+                <m:t>=</m:t>
+              </m:r>
+              <m:r>
+                <m:t>6</m:t>
+              </m:r>
+              <m:r>
+                <m:rPr>
+                  <m:sty m:val="p"/>
+                </m:rPr>
+                <m:t>+</m:t>
+              </m:r>
+              <m:r>
+                <m:t>6</m:t>
+              </m:r>
+            </m:e>
+            <m:e>
+              <m:r>
+                <m:t>&amp;</m:t>
+              </m:r>
+              <m:r>
+                <m:rPr>
+                  <m:sty m:val="p"/>
+                </m:rPr>
+                <m:t>=</m:t>
+              </m:r>
+              <m:r>
+                <m:t>12</m:t>
+              </m:r>
+              <m:r>
+                <m:rPr>
+                  <m:sty m:val="p"/>
+                </m:rPr>
+                <m:t>,</m:t>
+              </m:r>
+            </m:e>
+          </m:eqArr>
+        </m:oMath>
+      </m:oMathPara>
+    </w:p>
+    <w:p>
+      <w:pPr>
+        <w:pStyle w:val="FirstParagraph"/>
+      </w:pPr>
+      <w:r>
+        <w:t xml:space="preserve">which is even.</w:t>
       </w:r>
     </w:p>
     <w:bookmarkEnd w:id="72"/>
@@ -13327,7 +13389,6 @@
     </w:p>
     <w:p>
       <w:pPr>
-        <w:pStyle w:val="Compact"/>
         <w:numPr>
           <w:ilvl w:val="0"/>
           <w:numId w:val="1022"/>
@@ -13381,83 +13442,115 @@
       <w:r>
         <w:t xml:space="preserve">is true:</w:t>
       </w:r>
-      <w:r>
-        <w:t xml:space="preserve"> </w:t>
-      </w:r>
-      <m:oMath>
-        <m:r>
-          <m:t>n</m:t>
-        </m:r>
-        <m:r>
-          <m:rPr>
-            <m:sty m:val="p"/>
-          </m:rPr>
-          <m:t>=</m:t>
-        </m:r>
-        <m:r>
-          <m:t>4</m:t>
-        </m:r>
-        <m:r>
-          <m:t>k</m:t>
-        </m:r>
-        <m:r>
-          <m:rPr>
-            <m:sty m:val="p"/>
-          </m:rPr>
-          <m:t>=</m:t>
-        </m:r>
-        <m:r>
-          <m:t>2</m:t>
-        </m:r>
-        <m:r>
-          <m:rPr>
-            <m:sty m:val="p"/>
-          </m:rPr>
-          <m:t>⋅</m:t>
-        </m:r>
-        <m:r>
-          <m:rPr>
-            <m:sty m:val="p"/>
-          </m:rPr>
-          <m:t>(</m:t>
-        </m:r>
-        <m:r>
-          <m:t>2</m:t>
-        </m:r>
-        <m:r>
-          <m:t>k</m:t>
-        </m:r>
-        <m:r>
-          <m:rPr>
-            <m:sty m:val="p"/>
-          </m:rPr>
-          <m:t>)</m:t>
-        </m:r>
-      </m:oMath>
-      <w:r>
-        <w:t xml:space="preserve">, and</w:t>
-      </w:r>
-      <w:r>
-        <w:t xml:space="preserve"> </w:t>
-      </w:r>
-      <m:oMath>
-        <m:r>
-          <m:t>2</m:t>
-        </m:r>
-        <m:r>
-          <m:t>k</m:t>
-        </m:r>
-      </m:oMath>
-      <w:r>
-        <w:t xml:space="preserve"> </w:t>
-      </w:r>
-      <w:r>
-        <w:t xml:space="preserve">is an integer.</w:t>
-      </w:r>
     </w:p>
     <w:p>
       <w:pPr>
-        <w:pStyle w:val="Compact"/>
+        <w:pStyle w:val="BodyText"/>
+      </w:pPr>
+      <m:oMathPara>
+        <m:oMathParaPr>
+          <m:jc m:val="center"/>
+        </m:oMathParaPr>
+        <m:oMath>
+          <m:eqArr>
+            <m:e>
+              <m:r>
+                <m:t>n</m:t>
+              </m:r>
+              <m:r>
+                <m:t>&amp;</m:t>
+              </m:r>
+              <m:r>
+                <m:rPr>
+                  <m:sty m:val="p"/>
+                </m:rPr>
+                <m:t>=</m:t>
+              </m:r>
+              <m:r>
+                <m:t>4</m:t>
+              </m:r>
+              <m:r>
+                <m:t>k</m:t>
+              </m:r>
+            </m:e>
+            <m:e>
+              <m:r>
+                <m:t>&amp;</m:t>
+              </m:r>
+              <m:r>
+                <m:rPr>
+                  <m:sty m:val="p"/>
+                </m:rPr>
+                <m:t>=</m:t>
+              </m:r>
+              <m:r>
+                <m:t>2</m:t>
+              </m:r>
+              <m:r>
+                <m:rPr>
+                  <m:sty m:val="p"/>
+                </m:rPr>
+                <m:t>⋅</m:t>
+              </m:r>
+              <m:r>
+                <m:rPr>
+                  <m:sty m:val="p"/>
+                </m:rPr>
+                <m:t>(</m:t>
+              </m:r>
+              <m:r>
+                <m:t>2</m:t>
+              </m:r>
+              <m:r>
+                <m:t>k</m:t>
+              </m:r>
+              <m:r>
+                <m:rPr>
+                  <m:sty m:val="p"/>
+                </m:rPr>
+                <m:t>)</m:t>
+              </m:r>
+              <m:r>
+                <m:rPr>
+                  <m:sty m:val="p"/>
+                </m:rPr>
+                <m:t>,</m:t>
+              </m:r>
+            </m:e>
+          </m:eqArr>
+        </m:oMath>
+      </m:oMathPara>
+    </w:p>
+    <w:p>
+      <w:pPr>
+        <w:numPr>
+          <w:ilvl w:val="0"/>
+          <w:numId w:val="1000"/>
+        </w:numPr>
+      </w:pPr>
+      <w:r>
+        <w:t xml:space="preserve">and</w:t>
+      </w:r>
+      <w:r>
+        <w:t xml:space="preserve"> </w:t>
+      </w:r>
+      <m:oMath>
+        <m:r>
+          <m:t>2</m:t>
+        </m:r>
+        <m:r>
+          <m:t>k</m:t>
+        </m:r>
+      </m:oMath>
+      <w:r>
+        <w:t xml:space="preserve"> </w:t>
+      </w:r>
+      <w:r>
+        <w:t xml:space="preserve">is an integer.</w:t>
+      </w:r>
+    </w:p>
+    <w:p>
+      <w:pPr>
         <w:numPr>
           <w:ilvl w:val="0"/>
           <w:numId w:val="1022"/>
@@ -20021,10 +20114,125 @@
       <w:r>
         <w:t xml:space="preserve">become</w:t>
       </w:r>
-      <w:r>
-        <w:t xml:space="preserve"> </w:t>
-      </w:r>
-      <m:oMath>
+    </w:p>
+    <w:p>
+      <w:pPr>
+        <w:pStyle w:val="BodyText"/>
+      </w:pPr>
+      <m:oMathPara>
+        <m:oMathParaPr>
+          <m:jc m:val="center"/>
+        </m:oMathParaPr>
+        <m:oMath>
+          <m:eqArr>
+            <m:e>
+              <m:r>
+                <m:rPr>
+                  <m:sty m:val="p"/>
+                </m:rPr>
+                <m:t>[</m:t>
+              </m:r>
+              <m:r>
+                <m:t>7.2</m:t>
+              </m:r>
+              <m:r>
+                <m:rPr>
+                  <m:sty m:val="p"/>
+                </m:rPr>
+                <m:t>&gt;</m:t>
+              </m:r>
+              <m:r>
+                <m:t>5</m:t>
+              </m:r>
+              <m:r>
+                <m:rPr>
+                  <m:sty m:val="p"/>
+                </m:rPr>
+                <m:t>]</m:t>
+              </m:r>
+              <m:r>
+                <m:t>&amp;</m:t>
+              </m:r>
+              <m:r>
+                <m:rPr>
+                  <m:sty m:val="p"/>
+                </m:rPr>
+                <m:t>=</m:t>
+              </m:r>
+              <m:r>
+                <m:rPr>
+                  <m:scr m:val="double-struck"/>
+                  <m:sty m:val="p"/>
+                </m:rPr>
+                <m:t>1</m:t>
+              </m:r>
+              <m:r>
+                <m:t>​</m:t>
+              </m:r>
+              <m:d>
+                <m:dPr>
+                  <m:begChr m:val="("/>
+                  <m:sepChr m:val=""/>
+                  <m:endChr m:val=")"/>
+                  <m:grow/>
+                </m:dPr>
+                <m:e>
+                  <m:r>
+                    <m:t>7.2</m:t>
+                  </m:r>
+                  <m:r>
+                    <m:rPr>
+                      <m:sty m:val="p"/>
+                    </m:rPr>
+                    <m:t>&gt;</m:t>
+                  </m:r>
+                  <m:r>
+                    <m:t>5</m:t>
+                  </m:r>
+                </m:e>
+              </m:d>
+              <m:r>
+                <m:t>​</m:t>
+              </m:r>
+            </m:e>
+            <m:e>
+              <m:r>
+                <m:t>&amp;</m:t>
+              </m:r>
+              <m:r>
+                <m:rPr>
+                  <m:sty m:val="p"/>
+                </m:rPr>
+                <m:t>=</m:t>
+              </m:r>
+              <m:r>
+                <m:t>1</m:t>
+              </m:r>
+            </m:e>
+          </m:eqArr>
+        </m:oMath>
+      </m:oMathPara>
+    </w:p>
+    <w:p>
+      <w:pPr>
+        <w:pStyle w:val="FirstParagraph"/>
+      </w:pPr>
+      <w:r>
+        <w:t xml:space="preserve">and, with</w:t>
+      </w:r>
+      <w:r>
+        <w:t xml:space="preserve"> </w:t>
+      </w:r>
+      <m:oMath>
+        <m:r>
+          <m:t>A</m:t>
+        </m:r>
+        <m:r>
+          <m:rPr>
+            <m:sty m:val="p"/>
+          </m:rPr>
+          <m:t>=</m:t>
+        </m:r>
         <m:r>
           <m:rPr>
             <m:sty m:val="p"/>
@@ -20032,100 +20240,6 @@
           <m:t>[</m:t>
         </m:r>
         <m:r>
-          <m:t>7.2</m:t>
-        </m:r>
-        <m:r>
-          <m:rPr>
-            <m:sty m:val="p"/>
-          </m:rPr>
-          <m:t>&gt;</m:t>
-        </m:r>
-        <m:r>
-          <m:t>5</m:t>
-        </m:r>
-        <m:r>
-          <m:rPr>
-            <m:sty m:val="p"/>
-          </m:rPr>
-          <m:t>]</m:t>
-        </m:r>
-        <m:r>
-          <m:rPr>
-            <m:sty m:val="p"/>
-          </m:rPr>
-          <m:t>=</m:t>
-        </m:r>
-        <m:r>
-          <m:rPr>
-            <m:scr m:val="double-struck"/>
-            <m:sty m:val="p"/>
-          </m:rPr>
-          <m:t>1</m:t>
-        </m:r>
-        <m:r>
-          <m:t>​</m:t>
-        </m:r>
-        <m:d>
-          <m:dPr>
-            <m:begChr m:val="("/>
-            <m:sepChr m:val=""/>
-            <m:endChr m:val=")"/>
-            <m:grow/>
-          </m:dPr>
-          <m:e>
-            <m:r>
-              <m:t>7.2</m:t>
-            </m:r>
-            <m:r>
-              <m:rPr>
-                <m:sty m:val="p"/>
-              </m:rPr>
-              <m:t>&gt;</m:t>
-            </m:r>
-            <m:r>
-              <m:t>5</m:t>
-            </m:r>
-          </m:e>
-        </m:d>
-        <m:r>
-          <m:t>​</m:t>
-        </m:r>
-        <m:r>
-          <m:rPr>
-            <m:sty m:val="p"/>
-          </m:rPr>
-          <m:t>=</m:t>
-        </m:r>
-        <m:r>
-          <m:t>1</m:t>
-        </m:r>
-      </m:oMath>
-      <w:r>
-        <w:t xml:space="preserve"> </w:t>
-      </w:r>
-      <w:r>
-        <w:t xml:space="preserve">and, with</w:t>
-      </w:r>
-      <w:r>
-        <w:t xml:space="preserve"> </w:t>
-      </w:r>
-      <m:oMath>
-        <m:r>
-          <m:t>A</m:t>
-        </m:r>
-        <m:r>
-          <m:rPr>
-            <m:sty m:val="p"/>
-          </m:rPr>
-          <m:t>=</m:t>
-        </m:r>
-        <m:r>
-          <m:rPr>
-            <m:sty m:val="p"/>
-          </m:rPr>
-          <m:t>[</m:t>
-        </m:r>
-        <m:r>
           <m:t>0</m:t>
         </m:r>
         <m:r>
@@ -20150,102 +20264,124 @@
       <w:r>
         <w:t xml:space="preserve">,</w:t>
       </w:r>
-      <w:r>
-        <w:t xml:space="preserve"> </w:t>
-      </w:r>
-      <m:oMath>
-        <m:r>
-          <m:rPr>
-            <m:sty m:val="p"/>
-          </m:rPr>
-          <m:t>[</m:t>
-        </m:r>
-        <m:r>
-          <m:rPr>
-            <m:sty m:val="p"/>
-          </m:rPr>
-          <m:t>−</m:t>
-        </m:r>
-        <m:r>
-          <m:t>2.1</m:t>
-        </m:r>
-        <m:r>
-          <m:rPr>
-            <m:sty m:val="p"/>
-          </m:rPr>
-          <m:t>∈</m:t>
-        </m:r>
-        <m:r>
-          <m:t>A</m:t>
-        </m:r>
-        <m:r>
-          <m:rPr>
-            <m:sty m:val="p"/>
-          </m:rPr>
-          <m:t>]</m:t>
-        </m:r>
-        <m:r>
-          <m:rPr>
-            <m:sty m:val="p"/>
-          </m:rPr>
-          <m:t>=</m:t>
-        </m:r>
-        <m:sSub>
-          <m:e>
-            <m:r>
-              <m:rPr>
-                <m:scr m:val="double-struck"/>
-                <m:sty m:val="p"/>
-              </m:rPr>
-              <m:t>1</m:t>
-            </m:r>
-          </m:e>
-          <m:sub>
-            <m:r>
-              <m:t>A</m:t>
-            </m:r>
-          </m:sub>
-        </m:sSub>
-        <m:r>
-          <m:rPr>
-            <m:sty m:val="p"/>
-          </m:rPr>
-          <m:t>(</m:t>
-        </m:r>
-        <m:r>
-          <m:rPr>
-            <m:sty m:val="p"/>
-          </m:rPr>
-          <m:t>−</m:t>
-        </m:r>
-        <m:r>
-          <m:t>2.1</m:t>
-        </m:r>
-        <m:r>
-          <m:rPr>
-            <m:sty m:val="p"/>
-          </m:rPr>
-          <m:t>)</m:t>
-        </m:r>
-        <m:r>
-          <m:rPr>
-            <m:sty m:val="p"/>
-          </m:rPr>
-          <m:t>=</m:t>
-        </m:r>
-        <m:r>
-          <m:t>0</m:t>
-        </m:r>
-      </m:oMath>
-      <w:r>
-        <w:t xml:space="preserve">.</w:t>
-      </w:r>
+    </w:p>
+    <w:p>
+      <w:pPr>
+        <w:pStyle w:val="BodyText"/>
+      </w:pPr>
+      <m:oMathPara>
+        <m:oMathParaPr>
+          <m:jc m:val="center"/>
+        </m:oMathParaPr>
+        <m:oMath>
+          <m:eqArr>
+            <m:e>
+              <m:r>
+                <m:rPr>
+                  <m:sty m:val="p"/>
+                </m:rPr>
+                <m:t>[</m:t>
+              </m:r>
+              <m:r>
+                <m:rPr>
+                  <m:sty m:val="p"/>
+                </m:rPr>
+                <m:t>−</m:t>
+              </m:r>
+              <m:r>
+                <m:t>2.1</m:t>
+              </m:r>
+              <m:r>
+                <m:rPr>
+                  <m:sty m:val="p"/>
+                </m:rPr>
+                <m:t>∈</m:t>
+              </m:r>
+              <m:r>
+                <m:t>A</m:t>
+              </m:r>
+              <m:r>
+                <m:rPr>
+                  <m:sty m:val="p"/>
+                </m:rPr>
+                <m:t>]</m:t>
+              </m:r>
+              <m:r>
+                <m:t>&amp;</m:t>
+              </m:r>
+              <m:r>
+                <m:rPr>
+                  <m:sty m:val="p"/>
+                </m:rPr>
+                <m:t>=</m:t>
+              </m:r>
+              <m:sSub>
+                <m:e>
+                  <m:r>
+                    <m:rPr>
+                      <m:scr m:val="double-struck"/>
+                      <m:sty m:val="p"/>
+                    </m:rPr>
+                    <m:t>1</m:t>
+                  </m:r>
+                </m:e>
+                <m:sub>
+                  <m:r>
+                    <m:t>A</m:t>
+                  </m:r>
+                </m:sub>
+              </m:sSub>
+              <m:r>
+                <m:rPr>
+                  <m:sty m:val="p"/>
+                </m:rPr>
+                <m:t>(</m:t>
+              </m:r>
+              <m:r>
+                <m:rPr>
+                  <m:sty m:val="p"/>
+                </m:rPr>
+                <m:t>−</m:t>
+              </m:r>
+              <m:r>
+                <m:t>2.1</m:t>
+              </m:r>
+              <m:r>
+                <m:rPr>
+                  <m:sty m:val="p"/>
+                </m:rPr>
+                <m:t>)</m:t>
+              </m:r>
+            </m:e>
+            <m:e>
+              <m:r>
+                <m:t>&amp;</m:t>
+              </m:r>
+              <m:r>
+                <m:rPr>
+                  <m:sty m:val="p"/>
+                </m:rPr>
+                <m:t>=</m:t>
+              </m:r>
+              <m:r>
+                <m:t>0</m:t>
+              </m:r>
+              <m:r>
+                <m:rPr>
+                  <m:sty m:val="p"/>
+                </m:rPr>
+                <m:t>.</m:t>
+              </m:r>
+            </m:e>
+          </m:eqArr>
+        </m:oMath>
+      </m:oMathPara>
     </w:p>
     <w:bookmarkEnd w:id="97"/>
     <w:bookmarkStart w:id="98" w:name="def-kronecker-delta"/>
     <w:p>
       <w:pPr>
-        <w:pStyle w:val="BodyText"/>
+        <w:pStyle w:val="FirstParagraph"/>
       </w:pPr>
       <w:r>
         <w:rPr>
@@ -20535,263 +20671,327 @@
     </w:p>
     <w:p>
       <w:pPr>
-        <w:pStyle w:val="Compact"/>
-        <w:numPr>
-          <w:ilvl w:val="0"/>
-          <w:numId w:val="1032"/>
-        </w:numPr>
+        <w:pStyle w:val="BodyText"/>
       </w:pPr>
-      <m:oMath>
-        <m:sSub>
-          <m:e>
-            <m:r>
-              <m:t>δ</m:t>
-            </m:r>
-          </m:e>
-          <m:sub>
-            <m:r>
-              <m:t>11</m:t>
-            </m:r>
-          </m:sub>
-        </m:sSub>
-        <m:r>
-          <m:rPr>
-            <m:sty m:val="p"/>
-          </m:rPr>
-          <m:t>=</m:t>
-        </m:r>
-        <m:r>
-          <m:rPr>
-            <m:sty m:val="p"/>
-          </m:rPr>
-          <m:t>[</m:t>
-        </m:r>
-        <m:r>
-          <m:t>1</m:t>
-        </m:r>
-        <m:r>
-          <m:rPr>
-            <m:sty m:val="p"/>
-          </m:rPr>
-          <m:t>=</m:t>
-        </m:r>
-        <m:r>
-          <m:t>1</m:t>
-        </m:r>
-        <m:r>
-          <m:rPr>
-            <m:sty m:val="p"/>
-          </m:rPr>
-          <m:t>]</m:t>
-        </m:r>
-        <m:r>
-          <m:rPr>
-            <m:sty m:val="p"/>
-          </m:rPr>
-          <m:t>=</m:t>
-        </m:r>
-        <m:r>
-          <m:t>1</m:t>
-        </m:r>
-      </m:oMath>
-      <w:r>
-        <w:t xml:space="preserve">.</w:t>
-      </w:r>
+      <m:oMathPara>
+        <m:oMathParaPr>
+          <m:jc m:val="center"/>
+        </m:oMathParaPr>
+        <m:oMath>
+          <m:eqArr>
+            <m:e>
+              <m:sSub>
+                <m:e>
+                  <m:r>
+                    <m:t>δ</m:t>
+                  </m:r>
+                </m:e>
+                <m:sub>
+                  <m:r>
+                    <m:t>11</m:t>
+                  </m:r>
+                </m:sub>
+              </m:sSub>
+              <m:r>
+                <m:t>&amp;</m:t>
+              </m:r>
+              <m:r>
+                <m:rPr>
+                  <m:sty m:val="p"/>
+                </m:rPr>
+                <m:t>=</m:t>
+              </m:r>
+              <m:r>
+                <m:rPr>
+                  <m:sty m:val="p"/>
+                </m:rPr>
+                <m:t>[</m:t>
+              </m:r>
+              <m:r>
+                <m:t>1</m:t>
+              </m:r>
+              <m:r>
+                <m:rPr>
+                  <m:sty m:val="p"/>
+                </m:rPr>
+                <m:t>=</m:t>
+              </m:r>
+              <m:r>
+                <m:t>1</m:t>
+              </m:r>
+              <m:r>
+                <m:rPr>
+                  <m:sty m:val="p"/>
+                </m:rPr>
+                <m:t>]</m:t>
+              </m:r>
+            </m:e>
+            <m:e>
+              <m:r>
+                <m:t>&amp;</m:t>
+              </m:r>
+              <m:r>
+                <m:rPr>
+                  <m:sty m:val="p"/>
+                </m:rPr>
+                <m:t>=</m:t>
+              </m:r>
+              <m:r>
+                <m:t>1</m:t>
+              </m:r>
+              <m:r>
+                <m:rPr>
+                  <m:sty m:val="p"/>
+                </m:rPr>
+                <m:t>.</m:t>
+              </m:r>
+            </m:e>
+          </m:eqArr>
+        </m:oMath>
+      </m:oMathPara>
     </w:p>
     <w:p>
       <w:pPr>
-        <w:pStyle w:val="Compact"/>
-        <w:numPr>
-          <w:ilvl w:val="0"/>
-          <w:numId w:val="1032"/>
-        </w:numPr>
+        <w:pStyle w:val="FirstParagraph"/>
       </w:pPr>
-      <m:oMath>
-        <m:sSub>
-          <m:e>
-            <m:r>
-              <m:t>δ</m:t>
-            </m:r>
-          </m:e>
-          <m:sub>
-            <m:r>
-              <m:t>12</m:t>
-            </m:r>
-          </m:sub>
-        </m:sSub>
-        <m:r>
-          <m:rPr>
-            <m:sty m:val="p"/>
-          </m:rPr>
-          <m:t>=</m:t>
-        </m:r>
-        <m:r>
-          <m:rPr>
-            <m:sty m:val="p"/>
-          </m:rPr>
-          <m:t>[</m:t>
-        </m:r>
-        <m:r>
-          <m:t>1</m:t>
-        </m:r>
-        <m:r>
-          <m:rPr>
-            <m:sty m:val="p"/>
-          </m:rPr>
-          <m:t>=</m:t>
-        </m:r>
-        <m:r>
-          <m:t>2</m:t>
-        </m:r>
-        <m:r>
-          <m:rPr>
-            <m:sty m:val="p"/>
-          </m:rPr>
-          <m:t>]</m:t>
-        </m:r>
-        <m:r>
-          <m:rPr>
-            <m:sty m:val="p"/>
-          </m:rPr>
-          <m:t>=</m:t>
-        </m:r>
-        <m:r>
-          <m:t>0</m:t>
-        </m:r>
-      </m:oMath>
-      <w:r>
-        <w:t xml:space="preserve">.</w:t>
-      </w:r>
+      <m:oMathPara>
+        <m:oMathParaPr>
+          <m:jc m:val="center"/>
+        </m:oMathParaPr>
+        <m:oMath>
+          <m:eqArr>
+            <m:e>
+              <m:sSub>
+                <m:e>
+                  <m:r>
+                    <m:t>δ</m:t>
+                  </m:r>
+                </m:e>
+                <m:sub>
+                  <m:r>
+                    <m:t>12</m:t>
+                  </m:r>
+                </m:sub>
+              </m:sSub>
+              <m:r>
+                <m:t>&amp;</m:t>
+              </m:r>
+              <m:r>
+                <m:rPr>
+                  <m:sty m:val="p"/>
+                </m:rPr>
+                <m:t>=</m:t>
+              </m:r>
+              <m:r>
+                <m:rPr>
+                  <m:sty m:val="p"/>
+                </m:rPr>
+                <m:t>[</m:t>
+              </m:r>
+              <m:r>
+                <m:t>1</m:t>
+              </m:r>
+              <m:r>
+                <m:rPr>
+                  <m:sty m:val="p"/>
+                </m:rPr>
+                <m:t>=</m:t>
+              </m:r>
+              <m:r>
+                <m:t>2</m:t>
+              </m:r>
+              <m:r>
+                <m:rPr>
+                  <m:sty m:val="p"/>
+                </m:rPr>
+                <m:t>]</m:t>
+              </m:r>
+            </m:e>
+            <m:e>
+              <m:r>
+                <m:t>&amp;</m:t>
+              </m:r>
+              <m:r>
+                <m:rPr>
+                  <m:sty m:val="p"/>
+                </m:rPr>
+                <m:t>=</m:t>
+              </m:r>
+              <m:r>
+                <m:t>0</m:t>
+              </m:r>
+              <m:r>
+                <m:rPr>
+                  <m:sty m:val="p"/>
+                </m:rPr>
+                <m:t>.</m:t>
+              </m:r>
+            </m:e>
+          </m:eqArr>
+        </m:oMath>
+      </m:oMathPara>
     </w:p>
     <w:p>
       <w:pPr>
-        <w:pStyle w:val="Compact"/>
-        <w:numPr>
-          <w:ilvl w:val="0"/>
-          <w:numId w:val="1032"/>
-        </w:numPr>
+        <w:pStyle w:val="FirstParagraph"/>
       </w:pPr>
-      <m:oMath>
-        <m:sSub>
-          <m:e>
-            <m:r>
-              <m:t>δ</m:t>
-            </m:r>
-          </m:e>
-          <m:sub>
-            <m:r>
-              <m:t>22</m:t>
-            </m:r>
-          </m:sub>
-        </m:sSub>
-        <m:r>
-          <m:rPr>
-            <m:sty m:val="p"/>
-          </m:rPr>
-          <m:t>=</m:t>
-        </m:r>
-        <m:r>
-          <m:rPr>
-            <m:sty m:val="p"/>
-          </m:rPr>
-          <m:t>[</m:t>
-        </m:r>
-        <m:r>
-          <m:t>2</m:t>
-        </m:r>
-        <m:r>
-          <m:rPr>
-            <m:sty m:val="p"/>
-          </m:rPr>
-          <m:t>=</m:t>
-        </m:r>
-        <m:r>
-          <m:t>2</m:t>
-        </m:r>
-        <m:r>
-          <m:rPr>
-            <m:sty m:val="p"/>
-          </m:rPr>
-          <m:t>]</m:t>
-        </m:r>
-        <m:r>
-          <m:rPr>
-            <m:sty m:val="p"/>
-          </m:rPr>
-          <m:t>=</m:t>
-        </m:r>
-        <m:r>
-          <m:t>1</m:t>
-        </m:r>
-      </m:oMath>
-      <w:r>
-        <w:t xml:space="preserve">.</w:t>
-      </w:r>
+      <m:oMathPara>
+        <m:oMathParaPr>
+          <m:jc m:val="center"/>
+        </m:oMathParaPr>
+        <m:oMath>
+          <m:eqArr>
+            <m:e>
+              <m:sSub>
+                <m:e>
+                  <m:r>
+                    <m:t>δ</m:t>
+                  </m:r>
+                </m:e>
+                <m:sub>
+                  <m:r>
+                    <m:t>22</m:t>
+                  </m:r>
+                </m:sub>
+              </m:sSub>
+              <m:r>
+                <m:t>&amp;</m:t>
+              </m:r>
+              <m:r>
+                <m:rPr>
+                  <m:sty m:val="p"/>
+                </m:rPr>
+                <m:t>=</m:t>
+              </m:r>
+              <m:r>
+                <m:rPr>
+                  <m:sty m:val="p"/>
+                </m:rPr>
+                <m:t>[</m:t>
+              </m:r>
+              <m:r>
+                <m:t>2</m:t>
+              </m:r>
+              <m:r>
+                <m:rPr>
+                  <m:sty m:val="p"/>
+                </m:rPr>
+                <m:t>=</m:t>
+              </m:r>
+              <m:r>
+                <m:t>2</m:t>
+              </m:r>
+              <m:r>
+                <m:rPr>
+                  <m:sty m:val="p"/>
+                </m:rPr>
+                <m:t>]</m:t>
+              </m:r>
+            </m:e>
+            <m:e>
+              <m:r>
+                <m:t>&amp;</m:t>
+              </m:r>
+              <m:r>
+                <m:rPr>
+                  <m:sty m:val="p"/>
+                </m:rPr>
+                <m:t>=</m:t>
+              </m:r>
+              <m:r>
+                <m:t>1</m:t>
+              </m:r>
+              <m:r>
+                <m:rPr>
+                  <m:sty m:val="p"/>
+                </m:rPr>
+                <m:t>.</m:t>
+              </m:r>
+            </m:e>
+          </m:eqArr>
+        </m:oMath>
+      </m:oMathPara>
     </w:p>
     <w:p>
       <w:pPr>
-        <w:pStyle w:val="Compact"/>
-        <w:numPr>
-          <w:ilvl w:val="0"/>
-          <w:numId w:val="1032"/>
-        </w:numPr>
+        <w:pStyle w:val="FirstParagraph"/>
       </w:pPr>
-      <m:oMath>
-        <m:sSub>
-          <m:e>
-            <m:r>
-              <m:t>δ</m:t>
-            </m:r>
-          </m:e>
-          <m:sub>
-            <m:r>
-              <m:t>23</m:t>
-            </m:r>
-          </m:sub>
-        </m:sSub>
-        <m:r>
-          <m:rPr>
-            <m:sty m:val="p"/>
-          </m:rPr>
-          <m:t>=</m:t>
-        </m:r>
-        <m:r>
-          <m:rPr>
-            <m:sty m:val="p"/>
-          </m:rPr>
-          <m:t>[</m:t>
-        </m:r>
-        <m:r>
-          <m:t>2</m:t>
-        </m:r>
-        <m:r>
-          <m:rPr>
-            <m:sty m:val="p"/>
-          </m:rPr>
-          <m:t>=</m:t>
-        </m:r>
-        <m:r>
-          <m:t>3</m:t>
-        </m:r>
-        <m:r>
-          <m:rPr>
-            <m:sty m:val="p"/>
-          </m:rPr>
-          <m:t>]</m:t>
-        </m:r>
-        <m:r>
-          <m:rPr>
-            <m:sty m:val="p"/>
-          </m:rPr>
-          <m:t>=</m:t>
-        </m:r>
-        <m:r>
-          <m:t>0</m:t>
-        </m:r>
-      </m:oMath>
-      <w:r>
-        <w:t xml:space="preserve">.</w:t>
-      </w:r>
+      <m:oMathPara>
+        <m:oMathParaPr>
+          <m:jc m:val="center"/>
+        </m:oMathParaPr>
+        <m:oMath>
+          <m:eqArr>
+            <m:e>
+              <m:sSub>
+                <m:e>
+                  <m:r>
+                    <m:t>δ</m:t>
+                  </m:r>
+                </m:e>
+                <m:sub>
+                  <m:r>
+                    <m:t>23</m:t>
+                  </m:r>
+                </m:sub>
+              </m:sSub>
+              <m:r>
+                <m:t>&amp;</m:t>
+              </m:r>
+              <m:r>
+                <m:rPr>
+                  <m:sty m:val="p"/>
+                </m:rPr>
+                <m:t>=</m:t>
+              </m:r>
+              <m:r>
+                <m:rPr>
+                  <m:sty m:val="p"/>
+                </m:rPr>
+                <m:t>[</m:t>
+              </m:r>
+              <m:r>
+                <m:t>2</m:t>
+              </m:r>
+              <m:r>
+                <m:rPr>
+                  <m:sty m:val="p"/>
+                </m:rPr>
+                <m:t>=</m:t>
+              </m:r>
+              <m:r>
+                <m:t>3</m:t>
+              </m:r>
+              <m:r>
+                <m:rPr>
+                  <m:sty m:val="p"/>
+                </m:rPr>
+                <m:t>]</m:t>
+              </m:r>
+            </m:e>
+            <m:e>
+              <m:r>
+                <m:t>&amp;</m:t>
+              </m:r>
+              <m:r>
+                <m:rPr>
+                  <m:sty m:val="p"/>
+                </m:rPr>
+                <m:t>=</m:t>
+              </m:r>
+              <m:r>
+                <m:t>0</m:t>
+              </m:r>
+              <m:r>
+                <m:rPr>
+                  <m:sty m:val="p"/>
+                </m:rPr>
+                <m:t>.</m:t>
+              </m:r>
+            </m:e>
+          </m:eqArr>
+        </m:oMath>
+      </m:oMathPara>
     </w:p>
     <w:bookmarkEnd w:id="99"/>
     <w:bookmarkEnd w:id="100"/>
@@ -23026,7 +23226,6 @@
     </w:p>
     <w:p>
       <w:pPr>
-        <w:pStyle w:val="Compact"/>
         <w:numPr>
           <w:ilvl w:val="0"/>
           <w:numId w:val="1034"/>
@@ -23121,7 +23320,6 @@
     </w:p>
     <w:p>
       <w:pPr>
-        <w:pStyle w:val="Compact"/>
         <w:numPr>
           <w:ilvl w:val="0"/>
           <w:numId w:val="1034"/>
@@ -23179,7 +23377,6 @@
     </w:p>
     <w:p>
       <w:pPr>
-        <w:pStyle w:val="Compact"/>
         <w:numPr>
           <w:ilvl w:val="0"/>
           <w:numId w:val="1034"/>
@@ -23296,146 +23493,173 @@
       <w:r>
         <w:t xml:space="preserve">,</w:t>
       </w:r>
-      <w:r>
-        <w:t xml:space="preserve"> </w:t>
-      </w:r>
-      <m:oMath>
-        <m:sSub>
-          <m:e>
-            <m:r>
-              <m:rPr>
-                <m:scr m:val="double-struck"/>
-                <m:sty m:val="p"/>
-              </m:rPr>
-              <m:t>1</m:t>
-            </m:r>
-          </m:e>
-          <m:sub>
-            <m:r>
-              <m:t>A</m:t>
-            </m:r>
-          </m:sub>
-        </m:sSub>
-        <m:r>
-          <m:rPr>
-            <m:sty m:val="p"/>
-          </m:rPr>
-          <m:t>(</m:t>
-        </m:r>
-        <m:r>
-          <m:t>3.5</m:t>
-        </m:r>
-        <m:r>
-          <m:rPr>
-            <m:sty m:val="p"/>
-          </m:rPr>
-          <m:t>)</m:t>
-        </m:r>
-        <m:r>
-          <m:rPr>
-            <m:sty m:val="p"/>
-          </m:rPr>
-          <m:t>⋅</m:t>
-        </m:r>
-        <m:sSub>
-          <m:e>
-            <m:r>
-              <m:rPr>
-                <m:scr m:val="double-struck"/>
-                <m:sty m:val="p"/>
-              </m:rPr>
-              <m:t>1</m:t>
-            </m:r>
-          </m:e>
-          <m:sub>
-            <m:r>
-              <m:t>A</m:t>
-            </m:r>
-          </m:sub>
-        </m:sSub>
-        <m:r>
-          <m:rPr>
-            <m:sty m:val="p"/>
-          </m:rPr>
-          <m:t>(</m:t>
-        </m:r>
-        <m:r>
-          <m:t>3.5</m:t>
-        </m:r>
-        <m:r>
-          <m:rPr>
-            <m:sty m:val="p"/>
-          </m:rPr>
-          <m:t>)</m:t>
-        </m:r>
-        <m:r>
-          <m:rPr>
-            <m:sty m:val="p"/>
-          </m:rPr>
-          <m:t>=</m:t>
-        </m:r>
-        <m:r>
-          <m:t>1</m:t>
-        </m:r>
-        <m:r>
-          <m:rPr>
-            <m:sty m:val="p"/>
-          </m:rPr>
-          <m:t>⋅</m:t>
-        </m:r>
-        <m:r>
-          <m:t>1</m:t>
-        </m:r>
-        <m:r>
-          <m:rPr>
-            <m:sty m:val="p"/>
-          </m:rPr>
-          <m:t>=</m:t>
-        </m:r>
-        <m:r>
-          <m:t>1</m:t>
-        </m:r>
-        <m:r>
-          <m:rPr>
-            <m:sty m:val="p"/>
-          </m:rPr>
-          <m:t>=</m:t>
-        </m:r>
-        <m:sSub>
-          <m:e>
-            <m:r>
-              <m:rPr>
-                <m:scr m:val="double-struck"/>
-                <m:sty m:val="p"/>
-              </m:rPr>
-              <m:t>1</m:t>
-            </m:r>
-          </m:e>
-          <m:sub>
-            <m:r>
-              <m:t>A</m:t>
-            </m:r>
-          </m:sub>
-        </m:sSub>
-        <m:r>
-          <m:rPr>
-            <m:sty m:val="p"/>
-          </m:rPr>
-          <m:t>(</m:t>
-        </m:r>
-        <m:r>
-          <m:t>3.5</m:t>
-        </m:r>
-        <m:r>
-          <m:rPr>
-            <m:sty m:val="p"/>
-          </m:rPr>
-          <m:t>)</m:t>
-        </m:r>
-      </m:oMath>
-      <w:r>
-        <w:t xml:space="preserve">.</w:t>
-      </w:r>
+    </w:p>
+    <w:p>
+      <w:pPr>
+        <w:pStyle w:val="BodyText"/>
+      </w:pPr>
+      <m:oMathPara>
+        <m:oMathParaPr>
+          <m:jc m:val="center"/>
+        </m:oMathParaPr>
+        <m:oMath>
+          <m:eqArr>
+            <m:e>
+              <m:sSub>
+                <m:e>
+                  <m:r>
+                    <m:rPr>
+                      <m:scr m:val="double-struck"/>
+                      <m:sty m:val="p"/>
+                    </m:rPr>
+                    <m:t>1</m:t>
+                  </m:r>
+                </m:e>
+                <m:sub>
+                  <m:r>
+                    <m:t>A</m:t>
+                  </m:r>
+                </m:sub>
+              </m:sSub>
+              <m:r>
+                <m:rPr>
+                  <m:sty m:val="p"/>
+                </m:rPr>
+                <m:t>(</m:t>
+              </m:r>
+              <m:r>
+                <m:t>3.5</m:t>
+              </m:r>
+              <m:r>
+                <m:rPr>
+                  <m:sty m:val="p"/>
+                </m:rPr>
+                <m:t>)</m:t>
+              </m:r>
+              <m:r>
+                <m:rPr>
+                  <m:sty m:val="p"/>
+                </m:rPr>
+                <m:t>⋅</m:t>
+              </m:r>
+              <m:sSub>
+                <m:e>
+                  <m:r>
+                    <m:rPr>
+                      <m:scr m:val="double-struck"/>
+                      <m:sty m:val="p"/>
+                    </m:rPr>
+                    <m:t>1</m:t>
+                  </m:r>
+                </m:e>
+                <m:sub>
+                  <m:r>
+                    <m:t>A</m:t>
+                  </m:r>
+                </m:sub>
+              </m:sSub>
+              <m:r>
+                <m:rPr>
+                  <m:sty m:val="p"/>
+                </m:rPr>
+                <m:t>(</m:t>
+              </m:r>
+              <m:r>
+                <m:t>3.5</m:t>
+              </m:r>
+              <m:r>
+                <m:rPr>
+                  <m:sty m:val="p"/>
+                </m:rPr>
+                <m:t>)</m:t>
+              </m:r>
+              <m:r>
+                <m:t>&amp;</m:t>
+              </m:r>
+              <m:r>
+                <m:rPr>
+                  <m:sty m:val="p"/>
+                </m:rPr>
+                <m:t>=</m:t>
+              </m:r>
+              <m:r>
+                <m:t>1</m:t>
+              </m:r>
+              <m:r>
+                <m:rPr>
+                  <m:sty m:val="p"/>
+                </m:rPr>
+                <m:t>⋅</m:t>
+              </m:r>
+              <m:r>
+                <m:t>1</m:t>
+              </m:r>
+            </m:e>
+            <m:e>
+              <m:r>
+                <m:t>&amp;</m:t>
+              </m:r>
+              <m:r>
+                <m:rPr>
+                  <m:sty m:val="p"/>
+                </m:rPr>
+                <m:t>=</m:t>
+              </m:r>
+              <m:r>
+                <m:t>1</m:t>
+              </m:r>
+            </m:e>
+            <m:e>
+              <m:r>
+                <m:t>&amp;</m:t>
+              </m:r>
+              <m:r>
+                <m:rPr>
+                  <m:sty m:val="p"/>
+                </m:rPr>
+                <m:t>=</m:t>
+              </m:r>
+              <m:sSub>
+                <m:e>
+                  <m:r>
+                    <m:rPr>
+                      <m:scr m:val="double-struck"/>
+                      <m:sty m:val="p"/>
+                    </m:rPr>
+                    <m:t>1</m:t>
+                  </m:r>
+                </m:e>
+                <m:sub>
+                  <m:r>
+                    <m:t>A</m:t>
+                  </m:r>
+                </m:sub>
+              </m:sSub>
+              <m:r>
+                <m:rPr>
+                  <m:sty m:val="p"/>
+                </m:rPr>
+                <m:t>(</m:t>
+              </m:r>
+              <m:r>
+                <m:t>3.5</m:t>
+              </m:r>
+              <m:r>
+                <m:rPr>
+                  <m:sty m:val="p"/>
+                </m:rPr>
+                <m:t>)</m:t>
+              </m:r>
+              <m:r>
+                <m:rPr>
+                  <m:sty m:val="p"/>
+                </m:rPr>
+                <m:t>.</m:t>
+              </m:r>
+            </m:e>
+          </m:eqArr>
+        </m:oMath>
+      </m:oMathPara>
     </w:p>
     <w:p>
       <w:pPr>

</xml_diff>

<commit_message>
Deploying to gh-pages from @ Morrison-Lab/mds@9156253510658df7f0f7be7632f0fb2e30bef1dd 🚀
</commit_message>
<xml_diff>
--- a/notation.docx
+++ b/notation.docx
@@ -15,7 +15,7 @@
         <w:pStyle w:val="Date"/>
       </w:pPr>
       <w:r>
-        <w:t xml:space="preserve">Last modified: 2026-10-13 15:25:57 (PDT)</w:t>
+        <w:t xml:space="preserve">Last modified: 2026-10-13 16:09:33 (PDT)</w:t>
       </w:r>
     </w:p>
     <w:p>
@@ -6212,7 +6212,7 @@
       </w:r>
     </w:p>
     <w:bookmarkEnd w:id="53"/>
-    <w:bookmarkStart w:id="92" w:name="sec-indicator-functions"/>
+    <w:bookmarkStart w:id="93" w:name="sec-indicator-functions"/>
     <w:p>
       <w:pPr>
         <w:pStyle w:val="Heading2"/>
@@ -6319,7 +6319,7 @@
           <w:rPr>
             <w:rStyle w:val="Hyperlink"/>
           </w:rPr>
-          <w:t xml:space="preserve">Definition 10</w:t>
+          <w:t xml:space="preserve">Definition 11</w:t>
         </w:r>
       </w:hyperlink>
       <w:r>
@@ -6422,7 +6422,7 @@
           <w:b/>
           <w:bCs/>
         </w:rPr>
-        <w:t xml:space="preserve">Definition 9 (Indicator function (set indicator, predicate indicator))</w:t>
+        <w:t xml:space="preserve">Definition 9 (Indicator function (set indicator))</w:t>
       </w:r>
       <w:r>
         <w:t xml:space="preserve"> </w:t>
@@ -6744,18 +6744,24 @@
         </m:oMath>
       </m:oMathPara>
     </w:p>
+    <w:bookmarkEnd w:id="54"/>
+    <w:bookmarkStart w:id="55" w:name="def-predicate-indicator"/>
     <w:p>
       <w:pPr>
         <w:pStyle w:val="FirstParagraph"/>
       </w:pPr>
       <w:r>
-        <w:t xml:space="preserve">More generally,</w:t>
-      </w:r>
-      <w:r>
-        <w:t xml:space="preserve"> </w:t>
-      </w:r>
-      <w:r>
-        <w:t xml:space="preserve">for any logical proposition or predicate</w:t>
+        <w:rPr>
+          <w:b/>
+          <w:bCs/>
+        </w:rPr>
+        <w:t xml:space="preserve">Definition 10 (Predicate indicator)</w:t>
+      </w:r>
+      <w:r>
+        <w:t xml:space="preserve"> </w:t>
+      </w:r>
+      <w:r>
+        <w:t xml:space="preserve">For any logical proposition or predicate</w:t>
       </w:r>
       <w:r>
         <w:t xml:space="preserve"> </w:t>
@@ -7040,8 +7046,8 @@
         </m:oMath>
       </m:oMathPara>
     </w:p>
-    <w:bookmarkEnd w:id="54"/>
-    <w:bookmarkStart w:id="55" w:name="exm-indicator-numerical"/>
+    <w:bookmarkEnd w:id="55"/>
+    <w:bookmarkStart w:id="56" w:name="exm-indicator-numerical"/>
     <w:p>
       <w:pPr>
         <w:pStyle w:val="FirstParagraph"/>
@@ -7778,8 +7784,8 @@
         <w:t xml:space="preserve">.</w:t>
       </w:r>
     </w:p>
-    <w:bookmarkEnd w:id="55"/>
-    <w:bookmarkStart w:id="56" w:name="def-binary-variable"/>
+    <w:bookmarkEnd w:id="56"/>
+    <w:bookmarkStart w:id="57" w:name="def-binary-variable"/>
     <w:p>
       <w:pPr>
         <w:pStyle w:val="FirstParagraph"/>
@@ -7789,7 +7795,7 @@
           <w:b/>
           <w:bCs/>
         </w:rPr>
-        <w:t xml:space="preserve">Definition 10 (Binary variable)</w:t>
+        <w:t xml:space="preserve">Definition 11 (Binary variable)</w:t>
       </w:r>
       <w:r>
         <w:t xml:space="preserve"> </w:t>
@@ -7839,8 +7845,8 @@
         <w:t xml:space="preserve">.</w:t>
       </w:r>
     </w:p>
-    <w:bookmarkEnd w:id="56"/>
-    <w:bookmarkStart w:id="57" w:name="exm-binary-variable"/>
+    <w:bookmarkEnd w:id="57"/>
+    <w:bookmarkStart w:id="58" w:name="exm-binary-variable"/>
     <w:p>
       <w:pPr>
         <w:pStyle w:val="BodyText"/>
@@ -8053,7 +8059,7 @@
           <w:rPr>
             <w:rStyle w:val="Hyperlink"/>
           </w:rPr>
-          <w:t xml:space="preserve">Definition 10</w:t>
+          <w:t xml:space="preserve">Definition 11</w:t>
         </w:r>
       </w:hyperlink>
       <w:r>
@@ -8346,8 +8352,8 @@
         <w:t xml:space="preserve">.</w:t>
       </w:r>
     </w:p>
-    <w:bookmarkEnd w:id="57"/>
-    <w:bookmarkStart w:id="67" w:name="X156504d913efc1f49ad7c2e43ace68824d2fb5d"/>
+    <w:bookmarkEnd w:id="58"/>
+    <w:bookmarkStart w:id="68" w:name="X156504d913efc1f49ad7c2e43ace68824d2fb5d"/>
     <w:p>
       <w:pPr>
         <w:pStyle w:val="Heading3"/>
@@ -8370,7 +8376,7 @@
         <w:t xml:space="preserve">set notation or predicate notation.</w:t>
       </w:r>
     </w:p>
-    <w:bookmarkStart w:id="59" w:name="def-set-predicate-notation"/>
+    <w:bookmarkStart w:id="60" w:name="def-set-predicate-notation"/>
     <w:p>
       <w:pPr>
         <w:pStyle w:val="BodyText"/>
@@ -8380,7 +8386,7 @@
           <w:b/>
           <w:bCs/>
         </w:rPr>
-        <w:t xml:space="preserve">Definition 11 (Set notation and predicate notation for indicators)</w:t>
+        <w:t xml:space="preserve">Definition 12 (Set notation and predicate notation for indicators)</w:t>
       </w:r>
       <w:r>
         <w:t xml:space="preserve"> </w:t>
@@ -8510,7 +8516,7 @@
       <w:r>
         <w:t xml:space="preserve">(</w:t>
       </w:r>
-      <w:hyperlink r:id="rId58">
+      <w:hyperlink r:id="rId59">
         <w:r>
           <w:rPr>
             <w:rStyle w:val="Hyperlink"/>
@@ -8608,8 +8614,8 @@
         <w:t xml:space="preserve">.</w:t>
       </w:r>
     </w:p>
-    <w:bookmarkEnd w:id="59"/>
-    <w:bookmarkStart w:id="60" w:name="exm-set-predicate-notation"/>
+    <w:bookmarkEnd w:id="60"/>
+    <w:bookmarkStart w:id="61" w:name="exm-set-predicate-notation"/>
     <w:p>
       <w:pPr>
         <w:pStyle w:val="BodyText"/>
@@ -8842,7 +8848,7 @@
           <w:rPr>
             <w:rStyle w:val="Hyperlink"/>
           </w:rPr>
-          <w:t xml:space="preserve">Definition 11</w:t>
+          <w:t xml:space="preserve">Definition 12</w:t>
         </w:r>
       </w:hyperlink>
       <w:r>
@@ -8929,8 +8935,8 @@
         <w:t xml:space="preserve">.</w:t>
       </w:r>
     </w:p>
-    <w:bookmarkEnd w:id="60"/>
-    <w:bookmarkStart w:id="61" w:name="set-notation"/>
+    <w:bookmarkEnd w:id="61"/>
+    <w:bookmarkStart w:id="62" w:name="set-notation"/>
     <w:p>
       <w:pPr>
         <w:pStyle w:val="Heading4"/>
@@ -9452,8 +9458,8 @@
         <w:t xml:space="preserve">.</w:t>
       </w:r>
     </w:p>
-    <w:bookmarkEnd w:id="61"/>
-    <w:bookmarkStart w:id="63" w:name="predicate-notation"/>
+    <w:bookmarkEnd w:id="62"/>
+    <w:bookmarkStart w:id="64" w:name="predicate-notation"/>
     <w:p>
       <w:pPr>
         <w:pStyle w:val="Heading4"/>
@@ -9880,7 +9886,7 @@
       <w:r>
         <w:t xml:space="preserve">where indicators frequently depend on inequalities (</w:t>
       </w:r>
-      <w:hyperlink r:id="rId62">
+      <w:hyperlink r:id="rId63">
         <w:r>
           <w:rPr>
             <w:rStyle w:val="Hyperlink"/>
@@ -10025,8 +10031,8 @@
         <w:t xml:space="preserve">(a binary outcome).</w:t>
       </w:r>
     </w:p>
-    <w:bookmarkEnd w:id="63"/>
-    <w:bookmarkStart w:id="66" w:name="equivalence-between-paradigms"/>
+    <w:bookmarkEnd w:id="64"/>
+    <w:bookmarkStart w:id="67" w:name="equivalence-between-paradigms"/>
     <w:p>
       <w:pPr>
         <w:pStyle w:val="Heading4"/>
@@ -10148,7 +10154,7 @@
         </m:oMath>
       </m:oMathPara>
     </w:p>
-    <w:bookmarkStart w:id="64" w:name="def-support"/>
+    <w:bookmarkStart w:id="65" w:name="def-support"/>
     <w:p>
       <w:pPr>
         <w:pStyle w:val="FirstParagraph"/>
@@ -10158,7 +10164,7 @@
           <w:b/>
           <w:bCs/>
         </w:rPr>
-        <w:t xml:space="preserve">Definition 12 (Support of a distribution)</w:t>
+        <w:t xml:space="preserve">Definition 13 (Support of a distribution)</w:t>
       </w:r>
       <w:r>
         <w:t xml:space="preserve"> </w:t>
@@ -10201,8 +10207,8 @@
         <w:t xml:space="preserve">is the set of values where its density is positive.</w:t>
       </w:r>
     </w:p>
-    <w:bookmarkEnd w:id="64"/>
-    <w:bookmarkStart w:id="65" w:name="exm-support"/>
+    <w:bookmarkEnd w:id="65"/>
+    <w:bookmarkStart w:id="66" w:name="exm-support"/>
     <w:p>
       <w:pPr>
         <w:pStyle w:val="BodyText"/>
@@ -10543,7 +10549,7 @@
         <w:t xml:space="preserve">.</w:t>
       </w:r>
     </w:p>
-    <w:bookmarkEnd w:id="65"/>
+    <w:bookmarkEnd w:id="66"/>
     <w:p>
       <w:pPr>
         <w:pStyle w:val="FirstParagraph"/>
@@ -10576,7 +10582,7 @@
           <w:rPr>
             <w:rStyle w:val="Hyperlink"/>
           </w:rPr>
-          <w:t xml:space="preserve">Definition 12</w:t>
+          <w:t xml:space="preserve">Definition 13</w:t>
         </w:r>
       </w:hyperlink>
       <w:r>
@@ -10653,9 +10659,9 @@
         <w:t xml:space="preserve">.</w:t>
       </w:r>
     </w:p>
-    <w:bookmarkEnd w:id="66"/>
     <w:bookmarkEnd w:id="67"/>
-    <w:bookmarkStart w:id="74" w:name="iverson-bracket-notation"/>
+    <w:bookmarkEnd w:id="68"/>
+    <w:bookmarkStart w:id="75" w:name="iverson-bracket-notation"/>
     <w:p>
       <w:pPr>
         <w:pStyle w:val="Heading3"/>
@@ -10692,7 +10698,7 @@
       <w:r>
         <w:t xml:space="preserve"> </w:t>
       </w:r>
-      <w:hyperlink r:id="rId68">
+      <w:hyperlink r:id="rId69">
         <w:r>
           <w:rPr>
             <w:rStyle w:val="Hyperlink"/>
@@ -10704,7 +10710,7 @@
         <w:t xml:space="preserve">.</w:t>
       </w:r>
     </w:p>
-    <w:bookmarkStart w:id="69" w:name="def-iverson-bracket"/>
+    <w:bookmarkStart w:id="70" w:name="def-iverson-bracket"/>
     <w:p>
       <w:pPr>
         <w:pStyle w:val="BodyText"/>
@@ -10714,7 +10720,7 @@
           <w:b/>
           <w:bCs/>
         </w:rPr>
-        <w:t xml:space="preserve">Definition 13 (Iverson bracket)</w:t>
+        <w:t xml:space="preserve">Definition 14 (Iverson bracket)</w:t>
       </w:r>
       <w:r>
         <w:t xml:space="preserve"> </w:t>
@@ -10910,8 +10916,8 @@
         </m:oMath>
       </m:oMathPara>
     </w:p>
-    <w:bookmarkEnd w:id="69"/>
-    <w:bookmarkStart w:id="70" w:name="exm-iverson-bracket"/>
+    <w:bookmarkEnd w:id="70"/>
+    <w:bookmarkStart w:id="71" w:name="exm-iverson-bracket"/>
     <w:p>
       <w:pPr>
         <w:pStyle w:val="FirstParagraph"/>
@@ -11192,8 +11198,8 @@
         <w:t xml:space="preserve">.</w:t>
       </w:r>
     </w:p>
-    <w:bookmarkEnd w:id="70"/>
-    <w:bookmarkStart w:id="71" w:name="rem-iverson-indicator"/>
+    <w:bookmarkEnd w:id="71"/>
+    <w:bookmarkStart w:id="72" w:name="rem-iverson-indicator"/>
     <w:p>
       <w:pPr>
         <w:pStyle w:val="FirstParagraph"/>
@@ -11690,8 +11696,8 @@
         </m:oMath>
       </m:oMathPara>
     </w:p>
-    <w:bookmarkEnd w:id="71"/>
-    <w:bookmarkStart w:id="72" w:name="def-kronecker-delta"/>
+    <w:bookmarkEnd w:id="72"/>
+    <w:bookmarkStart w:id="73" w:name="def-kronecker-delta"/>
     <w:p>
       <w:pPr>
         <w:pStyle w:val="FirstParagraph"/>
@@ -11701,7 +11707,7 @@
           <w:b/>
           <w:bCs/>
         </w:rPr>
-        <w:t xml:space="preserve">Definition 14 (Kronecker delta)</w:t>
+        <w:t xml:space="preserve">Definition 15 (Kronecker delta)</w:t>
       </w:r>
       <w:r>
         <w:t xml:space="preserve"> </w:t>
@@ -11955,15 +11961,15 @@
           <w:rPr>
             <w:rStyle w:val="Hyperlink"/>
           </w:rPr>
-          <w:t xml:space="preserve">Definition 13</w:t>
+          <w:t xml:space="preserve">Definition 14</w:t>
         </w:r>
       </w:hyperlink>
       <w:r>
         <w:t xml:space="preserve">).</w:t>
       </w:r>
     </w:p>
-    <w:bookmarkEnd w:id="72"/>
-    <w:bookmarkStart w:id="73" w:name="exm-kronecker-delta"/>
+    <w:bookmarkEnd w:id="73"/>
+    <w:bookmarkStart w:id="74" w:name="exm-kronecker-delta"/>
     <w:p>
       <w:pPr>
         <w:pStyle w:val="BodyText"/>
@@ -12306,9 +12312,9 @@
         </m:oMath>
       </m:oMathPara>
     </w:p>
-    <w:bookmarkEnd w:id="73"/>
     <w:bookmarkEnd w:id="74"/>
-    <w:bookmarkStart w:id="78" w:name="Xd6f58182005cccf55080a628cd9152d2b1165ed"/>
+    <w:bookmarkEnd w:id="75"/>
+    <w:bookmarkStart w:id="79" w:name="Xd6f58182005cccf55080a628cd9152d2b1165ed"/>
     <w:p>
       <w:pPr>
         <w:pStyle w:val="Heading3"/>
@@ -12365,7 +12371,7 @@
       <w:r>
         <w:t xml:space="preserve"> </w:t>
       </w:r>
-      <w:hyperlink r:id="rId75">
+      <w:hyperlink r:id="rId76">
         <w:r>
           <w:rPr>
             <w:rStyle w:val="Hyperlink"/>
@@ -12750,7 +12756,7 @@
       <w:r>
         <w:t xml:space="preserve"> </w:t>
       </w:r>
-      <w:hyperlink r:id="rId76">
+      <w:hyperlink r:id="rId77">
         <w:r>
           <w:rPr>
             <w:rStyle w:val="Hyperlink"/>
@@ -12793,7 +12799,7 @@
       <w:r>
         <w:t xml:space="preserve"> </w:t>
       </w:r>
-      <w:hyperlink r:id="rId77">
+      <w:hyperlink r:id="rId78">
         <w:r>
           <w:rPr>
             <w:rStyle w:val="Hyperlink"/>
@@ -12893,8 +12899,8 @@
         <w:t xml:space="preserve">rather than the bare Iverson bracket.</w:t>
       </w:r>
     </w:p>
-    <w:bookmarkEnd w:id="78"/>
-    <w:bookmarkStart w:id="80" w:name="summary-of-indicator-notations"/>
+    <w:bookmarkEnd w:id="79"/>
+    <w:bookmarkStart w:id="81" w:name="summary-of-indicator-notations"/>
     <w:p>
       <w:pPr>
         <w:pStyle w:val="Heading3"/>
@@ -12935,7 +12941,7 @@
       <w:tr>
         <w:tc>
           <w:tcPr/>
-          <w:bookmarkStart w:id="79" w:name="tbl-indicator-notations"/>
+          <w:bookmarkStart w:id="80" w:name="tbl-indicator-notations"/>
           <w:p>
             <w:pPr>
               <w:jc w:val="center"/>
@@ -13870,13 +13876,13 @@
               </w:tc>
             </w:tr>
           </w:tbl>
-          <w:bookmarkEnd w:id="79"/>
+          <w:bookmarkEnd w:id="80"/>
           <w:p/>
         </w:tc>
       </w:tr>
     </w:tbl>
-    <w:bookmarkEnd w:id="80"/>
-    <w:bookmarkStart w:id="81" w:name="conventions-in-this-book"/>
+    <w:bookmarkEnd w:id="81"/>
+    <w:bookmarkStart w:id="82" w:name="conventions-in-this-book"/>
     <w:p>
       <w:pPr>
         <w:pStyle w:val="Heading3"/>
@@ -14230,8 +14236,8 @@
         <w:t xml:space="preserve">).</w:t>
       </w:r>
     </w:p>
-    <w:bookmarkEnd w:id="81"/>
-    <w:bookmarkStart w:id="91" w:name="key-algebraic-properties"/>
+    <w:bookmarkEnd w:id="82"/>
+    <w:bookmarkStart w:id="92" w:name="key-algebraic-properties"/>
     <w:p>
       <w:pPr>
         <w:pStyle w:val="Heading3"/>
@@ -14298,7 +14304,7 @@
         <w:t xml:space="preserve">One of the identities below uses idempotence:</w:t>
       </w:r>
     </w:p>
-    <w:bookmarkStart w:id="83" w:name="def-idempotent"/>
+    <w:bookmarkStart w:id="84" w:name="def-idempotent"/>
     <w:p>
       <w:pPr>
         <w:pStyle w:val="BodyText"/>
@@ -14308,7 +14314,7 @@
           <w:b/>
           <w:bCs/>
         </w:rPr>
-        <w:t xml:space="preserve">Definition 15 (Idempotent)</w:t>
+        <w:t xml:space="preserve">Definition 16 (Idempotent)</w:t>
       </w:r>
       <w:r>
         <w:t xml:space="preserve"> </w:t>
@@ -14505,7 +14511,7 @@
       <w:r>
         <w:t xml:space="preserve"> </w:t>
       </w:r>
-      <w:hyperlink r:id="rId82">
+      <w:hyperlink r:id="rId83">
         <w:r>
           <w:rPr>
             <w:rStyle w:val="Hyperlink"/>
@@ -14517,8 +14523,8 @@
         <w:t xml:space="preserve">.</w:t>
       </w:r>
     </w:p>
-    <w:bookmarkEnd w:id="83"/>
-    <w:bookmarkStart w:id="85" w:name="exm-idempotent-indicator"/>
+    <w:bookmarkEnd w:id="84"/>
+    <w:bookmarkStart w:id="86" w:name="exm-idempotent-indicator"/>
     <w:p>
       <w:pPr>
         <w:pStyle w:val="BodyText"/>
@@ -14984,7 +14990,7 @@
       <w:r>
         <w:t xml:space="preserve"> </w:t>
       </w:r>
-      <w:hyperlink r:id="rId84">
+      <w:hyperlink r:id="rId85">
         <w:r>
           <w:rPr>
             <w:rStyle w:val="Hyperlink"/>
@@ -15051,7 +15057,7 @@
         <w:t xml:space="preserve">.</w:t>
       </w:r>
     </w:p>
-    <w:bookmarkEnd w:id="85"/>
+    <w:bookmarkEnd w:id="86"/>
     <w:p>
       <w:pPr>
         <w:pStyle w:val="BodyText"/>
@@ -15110,7 +15116,7 @@
       <w:r>
         <w:t xml:space="preserve"> </w:t>
       </w:r>
-      <w:hyperlink r:id="rId86">
+      <w:hyperlink r:id="rId87">
         <w:r>
           <w:rPr>
             <w:rStyle w:val="Hyperlink"/>
@@ -15713,7 +15719,7 @@
             <w:b/>
             <w:bCs/>
           </w:rPr>
-          <w:t xml:space="preserve">Definition 15</w:t>
+          <w:t xml:space="preserve">Definition 16</w:t>
         </w:r>
       </w:hyperlink>
       <w:r>
@@ -15858,7 +15864,7 @@
       <w:r>
         <w:t xml:space="preserve"> </w:t>
       </w:r>
-      <w:hyperlink r:id="rId87">
+      <w:hyperlink r:id="rId88">
         <w:r>
           <w:rPr>
             <w:rStyle w:val="Hyperlink"/>
@@ -15889,7 +15895,7 @@
       <w:r>
         <w:t xml:space="preserve"> </w:t>
       </w:r>
-      <w:hyperlink r:id="rId88">
+      <w:hyperlink r:id="rId89">
         <w:r>
           <w:rPr>
             <w:rStyle w:val="Hyperlink"/>
@@ -15926,7 +15932,7 @@
       <w:r>
         <w:t xml:space="preserve"> </w:t>
       </w:r>
-      <w:hyperlink r:id="rId89">
+      <w:hyperlink r:id="rId90">
         <w:r>
           <w:rPr>
             <w:rStyle w:val="Hyperlink"/>
@@ -16123,7 +16129,7 @@
       <w:r>
         <w:t xml:space="preserve"> </w:t>
       </w:r>
-      <w:hyperlink r:id="rId90">
+      <w:hyperlink r:id="rId91">
         <w:r>
           <w:rPr>
             <w:rStyle w:val="Hyperlink"/>
@@ -16186,9 +16192,9 @@
         <w:t xml:space="preserve">regression models for binary outcomes.</w:t>
       </w:r>
     </w:p>
-    <w:bookmarkEnd w:id="91"/>
     <w:bookmarkEnd w:id="92"/>
-    <w:bookmarkStart w:id="112" w:name="sec-notational-shorthands"/>
+    <w:bookmarkEnd w:id="93"/>
+    <w:bookmarkStart w:id="113" w:name="sec-notational-shorthands"/>
     <w:p>
       <w:pPr>
         <w:pStyle w:val="Heading2"/>
@@ -16197,7 +16203,7 @@
         <w:t xml:space="preserve">6 Notational shorthands</w:t>
       </w:r>
     </w:p>
-    <w:bookmarkStart w:id="95" w:name="def-lower-upper-limits"/>
+    <w:bookmarkStart w:id="96" w:name="def-lower-upper-limits"/>
     <w:p>
       <w:pPr>
         <w:pStyle w:val="FirstParagraph"/>
@@ -16207,7 +16213,7 @@
           <w:b/>
           <w:bCs/>
         </w:rPr>
-        <w:t xml:space="preserve">Definition 16 (Lower and upper limits of a sum or integral)</w:t>
+        <w:t xml:space="preserve">Definition 17 (Lower and upper limits of a sum or integral)</w:t>
       </w:r>
       <w:r>
         <w:t xml:space="preserve"> </w:t>
@@ -16218,7 +16224,7 @@
       <w:r>
         <w:t xml:space="preserve"> </w:t>
       </w:r>
-      <w:hyperlink r:id="rId93">
+      <w:hyperlink r:id="rId94">
         <w:r>
           <w:rPr>
             <w:rStyle w:val="Hyperlink"/>
@@ -16355,7 +16361,7 @@
       <w:r>
         <w:t xml:space="preserve"> </w:t>
       </w:r>
-      <w:hyperlink r:id="rId94">
+      <w:hyperlink r:id="rId95">
         <w:r>
           <w:rPr>
             <w:rStyle w:val="Hyperlink"/>
@@ -16510,8 +16516,8 @@
         <w:t xml:space="preserve">and the upper limit above it.</w:t>
       </w:r>
     </w:p>
-    <w:bookmarkEnd w:id="95"/>
-    <w:bookmarkStart w:id="96" w:name="exm-lower-upper-limits"/>
+    <w:bookmarkEnd w:id="96"/>
+    <w:bookmarkStart w:id="97" w:name="exm-lower-upper-limits"/>
     <w:p>
       <w:pPr>
         <w:pStyle w:val="BodyText"/>
@@ -16782,8 +16788,8 @@
         <w:t xml:space="preserve">.</w:t>
       </w:r>
     </w:p>
-    <w:bookmarkEnd w:id="96"/>
-    <w:bookmarkStart w:id="99" w:name="rem-limits-two-meanings"/>
+    <w:bookmarkEnd w:id="97"/>
+    <w:bookmarkStart w:id="100" w:name="rem-limits-two-meanings"/>
     <w:p>
       <w:pPr>
         <w:pStyle w:val="FirstParagraph"/>
@@ -16815,7 +16821,7 @@
           <w:rPr>
             <w:rStyle w:val="Hyperlink"/>
           </w:rPr>
-          <w:t xml:space="preserve">Definition 16</w:t>
+          <w:t xml:space="preserve">Definition 17</w:t>
         </w:r>
       </w:hyperlink>
       <w:r>
@@ -16836,7 +16842,7 @@
       <w:r>
         <w:t xml:space="preserve"> </w:t>
       </w:r>
-      <w:hyperlink r:id="rId97">
+      <w:hyperlink r:id="rId98">
         <w:r>
           <w:rPr>
             <w:rStyle w:val="Hyperlink"/>
@@ -16853,7 +16859,7 @@
       <w:r>
         <w:t xml:space="preserve"> </w:t>
       </w:r>
-      <w:hyperlink r:id="rId98">
+      <w:hyperlink r:id="rId99">
         <w:r>
           <w:rPr>
             <w:rStyle w:val="Hyperlink"/>
@@ -17043,8 +17049,8 @@
         <w:t xml:space="preserve">is sent to infinity by a calculus limit.</w:t>
       </w:r>
     </w:p>
-    <w:bookmarkEnd w:id="99"/>
-    <w:bookmarkStart w:id="100" w:name="def-notational-shorthand"/>
+    <w:bookmarkEnd w:id="100"/>
+    <w:bookmarkStart w:id="101" w:name="def-notational-shorthand"/>
     <w:p>
       <w:pPr>
         <w:pStyle w:val="BodyText"/>
@@ -17054,7 +17060,7 @@
           <w:b/>
           <w:bCs/>
         </w:rPr>
-        <w:t xml:space="preserve">Definition 17 (Notational shorthand)</w:t>
+        <w:t xml:space="preserve">Definition 18 (Notational shorthand)</w:t>
       </w:r>
       <w:r>
         <w:t xml:space="preserve"> </w:t>
@@ -17116,7 +17122,7 @@
         <w:t xml:space="preserve">.</w:t>
       </w:r>
     </w:p>
-    <w:bookmarkEnd w:id="100"/>
+    <w:bookmarkEnd w:id="101"/>
     <w:tbl>
       <w:tblPr>
         <w:tblStyle w:val="Table"/>
@@ -17158,12 +17164,12 @@
                 <wp:inline>
                   <wp:extent cx="152400" cy="152400"/>
                   <wp:effectExtent b="0" l="0" r="0" t="0"/>
-                  <wp:docPr descr="" title="" id="101" name="Picture"/>
+                  <wp:docPr descr="" title="" id="102" name="Picture"/>
                   <a:graphic>
                     <a:graphicData uri="http://schemas.openxmlformats.org/drawingml/2006/picture">
                       <pic:pic>
                         <pic:nvPicPr>
-                          <pic:cNvPr descr="/opt/quarto/share/formats/docx/note.png" id="102" name="Picture"/>
+                          <pic:cNvPr descr="/opt/quarto/share/formats/docx/note.png" id="103" name="Picture"/>
                           <pic:cNvPicPr>
                             <a:picLocks noChangeArrowheads="1" noChangeAspect="1"/>
                           </pic:cNvPicPr>
@@ -17569,7 +17575,7 @@
         </w:tc>
       </w:tr>
     </w:tbl>
-    <w:bookmarkStart w:id="103" w:name="def-range-of-variable"/>
+    <w:bookmarkStart w:id="104" w:name="def-range-of-variable"/>
     <w:p>
       <w:pPr>
         <w:pStyle w:val="FirstParagraph"/>
@@ -17579,7 +17585,7 @@
           <w:b/>
           <w:bCs/>
         </w:rPr>
-        <w:t xml:space="preserve">Definition 18 (Range of a variable)</w:t>
+        <w:t xml:space="preserve">Definition 19 (Range of a variable)</w:t>
       </w:r>
       <w:r>
         <w:t xml:space="preserve"> </w:t>
@@ -17665,7 +17671,7 @@
         <w:t xml:space="preserve">can take.</w:t>
       </w:r>
     </w:p>
-    <w:bookmarkEnd w:id="103"/>
+    <w:bookmarkEnd w:id="104"/>
     <w:p>
       <w:pPr>
         <w:pStyle w:val="BodyText"/>
@@ -17812,7 +17818,7 @@
       <w:r>
         <w:t xml:space="preserve"> </w:t>
       </w:r>
-      <w:hyperlink r:id="rId104">
+      <w:hyperlink r:id="rId105">
         <w:r>
           <w:rPr>
             <w:rStyle w:val="Hyperlink"/>
@@ -17882,7 +17888,7 @@
       <w:r>
         <w:t xml:space="preserve"> </w:t>
       </w:r>
-      <w:hyperlink r:id="rId105">
+      <w:hyperlink r:id="rId106">
         <w:r>
           <w:rPr>
             <w:rStyle w:val="Hyperlink"/>
@@ -17949,7 +17955,7 @@
       <w:r>
         <w:t xml:space="preserve">(</w:t>
       </w:r>
-      <w:hyperlink r:id="rId106">
+      <w:hyperlink r:id="rId107">
         <w:r>
           <w:rPr>
             <w:rStyle w:val="Hyperlink"/>
@@ -18311,7 +18317,7 @@
       <w:r>
         <w:t xml:space="preserve"> </w:t>
       </w:r>
-      <w:hyperlink r:id="rId104">
+      <w:hyperlink r:id="rId105">
         <w:r>
           <w:rPr>
             <w:rStyle w:val="Hyperlink"/>
@@ -18411,7 +18417,7 @@
       <w:tr>
         <w:tc>
           <w:tcPr/>
-          <w:bookmarkStart w:id="108" w:name="tbl-notational-shorthands"/>
+          <w:bookmarkStart w:id="109" w:name="tbl-notational-shorthands"/>
           <w:p>
             <w:pPr>
               <w:jc w:val="center"/>
@@ -18627,7 +18633,7 @@
                   <w:r>
                     <w:t xml:space="preserve">the set the sum runs over (</w:t>
                   </w:r>
-                  <w:hyperlink r:id="rId107">
+                  <w:hyperlink r:id="rId108">
                     <w:r>
                       <w:rPr>
                         <w:rStyle w:val="Hyperlink"/>
@@ -18756,7 +18762,7 @@
                   <w:r>
                     <w:t xml:space="preserve">the lower and upper limits of the index (</w:t>
                   </w:r>
-                  <w:hyperlink r:id="rId93">
+                  <w:hyperlink r:id="rId94">
                     <w:r>
                       <w:rPr>
                         <w:rStyle w:val="Hyperlink"/>
@@ -20057,12 +20063,12 @@
               </w:tc>
             </w:tr>
           </w:tbl>
-          <w:bookmarkEnd w:id="108"/>
+          <w:bookmarkEnd w:id="109"/>
           <w:p/>
         </w:tc>
       </w:tr>
     </w:tbl>
-    <w:bookmarkStart w:id="110" w:name="rem-indefinite-integral-not-shorthand"/>
+    <w:bookmarkStart w:id="111" w:name="rem-indefinite-integral-not-shorthand"/>
     <w:p>
       <w:pPr>
         <w:pStyle w:val="BodyText"/>
@@ -20174,7 +20180,7 @@
       <w:r>
         <w:t xml:space="preserve"> </w:t>
       </w:r>
-      <w:hyperlink r:id="rId109">
+      <w:hyperlink r:id="rId110">
         <w:r>
           <w:rPr>
             <w:rStyle w:val="Hyperlink"/>
@@ -20335,8 +20341,8 @@
         <w:t xml:space="preserve">Writing the limits out tells the reader which of the two is meant.</w:t>
       </w:r>
     </w:p>
-    <w:bookmarkEnd w:id="110"/>
-    <w:bookmarkStart w:id="111" w:name="exm-expand-index-shorthand"/>
+    <w:bookmarkEnd w:id="111"/>
+    <w:bookmarkStart w:id="112" w:name="exm-expand-index-shorthand"/>
     <w:p>
       <w:pPr>
         <w:pStyle w:val="BodyText"/>
@@ -20782,9 +20788,9 @@
         </m:oMath>
       </m:oMathPara>
     </w:p>
-    <w:bookmarkEnd w:id="111"/>
     <w:bookmarkEnd w:id="112"/>
-    <w:bookmarkStart w:id="119" w:name="X93a3d4ef5e06a67ae6b891e46b41b74b3674f55"/>
+    <w:bookmarkEnd w:id="113"/>
+    <w:bookmarkStart w:id="120" w:name="X93a3d4ef5e06a67ae6b891e46b41b74b3674f55"/>
     <w:p>
       <w:pPr>
         <w:pStyle w:val="Heading2"/>
@@ -20913,7 +20919,7 @@
       <w:r>
         <w:t xml:space="preserve"> </w:t>
       </w:r>
-      <w:hyperlink r:id="rId113">
+      <w:hyperlink r:id="rId114">
         <w:r>
           <w:rPr>
             <w:rStyle w:val="Hyperlink"/>
@@ -20933,7 +20939,7 @@
       <w:r>
         <w:t xml:space="preserve"> </w:t>
       </w:r>
-      <w:hyperlink r:id="rId114">
+      <w:hyperlink r:id="rId115">
         <w:r>
           <w:rPr>
             <w:rStyle w:val="Hyperlink"/>
@@ -20953,7 +20959,7 @@
       <w:r>
         <w:t xml:space="preserve"> </w:t>
       </w:r>
-      <w:hyperlink r:id="rId115">
+      <w:hyperlink r:id="rId116">
         <w:r>
           <w:rPr>
             <w:rStyle w:val="Hyperlink"/>
@@ -20973,7 +20979,7 @@
       <w:r>
         <w:t xml:space="preserve"> </w:t>
       </w:r>
-      <w:hyperlink r:id="rId116">
+      <w:hyperlink r:id="rId117">
         <w:r>
           <w:rPr>
             <w:rStyle w:val="Hyperlink"/>
@@ -20993,7 +20999,7 @@
       <w:r>
         <w:t xml:space="preserve"> </w:t>
       </w:r>
-      <w:hyperlink r:id="rId117">
+      <w:hyperlink r:id="rId118">
         <w:r>
           <w:rPr>
             <w:rStyle w:val="Hyperlink"/>
@@ -21034,7 +21040,7 @@
       <w:r>
         <w:t xml:space="preserve"> </w:t>
       </w:r>
-      <w:hyperlink r:id="rId118">
+      <w:hyperlink r:id="rId119">
         <w:r>
           <w:rPr>
             <w:rStyle w:val="Hyperlink"/>
@@ -21046,8 +21052,8 @@
         <w:t xml:space="preserve">.</w:t>
       </w:r>
     </w:p>
-    <w:bookmarkEnd w:id="119"/>
-    <w:bookmarkStart w:id="122" w:name="sec-further-reading"/>
+    <w:bookmarkEnd w:id="120"/>
+    <w:bookmarkStart w:id="123" w:name="sec-further-reading"/>
     <w:p>
       <w:pPr>
         <w:pStyle w:val="Heading2"/>
@@ -21072,7 +21078,7 @@
       <w:r>
         <w:t xml:space="preserve"> </w:t>
       </w:r>
-      <w:hyperlink r:id="rId120">
+      <w:hyperlink r:id="rId121">
         <w:r>
           <w:rPr>
             <w:rStyle w:val="Hyperlink"/>
@@ -21179,7 +21185,7 @@
       <w:r>
         <w:t xml:space="preserve"> </w:t>
       </w:r>
-      <w:hyperlink r:id="rId121">
+      <w:hyperlink r:id="rId122">
         <w:r>
           <w:rPr>
             <w:rStyle w:val="Hyperlink"/>
@@ -21194,8 +21200,8 @@
         <w:t xml:space="preserve">page.</w:t>
       </w:r>
     </w:p>
-    <w:bookmarkEnd w:id="122"/>
-    <w:bookmarkStart w:id="131" w:name="references"/>
+    <w:bookmarkEnd w:id="123"/>
+    <w:bookmarkStart w:id="132" w:name="references"/>
     <w:p>
       <w:pPr>
         <w:pStyle w:val="Heading2"/>
@@ -21204,8 +21210,8 @@
         <w:t xml:space="preserve">References</w:t>
       </w:r>
     </w:p>
-    <w:bookmarkStart w:id="130" w:name="refs"/>
-    <w:bookmarkStart w:id="124" w:name="ref-barkerplummer2011language"/>
+    <w:bookmarkStart w:id="131" w:name="refs"/>
+    <w:bookmarkStart w:id="125" w:name="ref-barkerplummer2011language"/>
     <w:p>
       <w:pPr>
         <w:pStyle w:val="Bibliography"/>
@@ -21229,7 +21235,7 @@
       <w:r>
         <w:t xml:space="preserve"> </w:t>
       </w:r>
-      <w:hyperlink r:id="rId123">
+      <w:hyperlink r:id="rId124">
         <w:r>
           <w:rPr>
             <w:rStyle w:val="Hyperlink"/>
@@ -21241,8 +21247,8 @@
         <w:t xml:space="preserve">.</w:t>
       </w:r>
     </w:p>
-    <w:bookmarkEnd w:id="124"/>
-    <w:bookmarkStart w:id="126" w:name="ref-nelder1972generalized"/>
+    <w:bookmarkEnd w:id="125"/>
+    <w:bookmarkStart w:id="127" w:name="ref-nelder1972generalized"/>
     <w:p>
       <w:pPr>
         <w:pStyle w:val="Bibliography"/>
@@ -21275,7 +21281,7 @@
       <w:r>
         <w:t xml:space="preserve"> </w:t>
       </w:r>
-      <w:hyperlink r:id="rId125">
+      <w:hyperlink r:id="rId126">
         <w:r>
           <w:rPr>
             <w:rStyle w:val="Hyperlink"/>
@@ -21287,8 +21293,8 @@
         <w:t xml:space="preserve">.</w:t>
       </w:r>
     </w:p>
-    <w:bookmarkEnd w:id="126"/>
-    <w:bookmarkStart w:id="127" w:name="ref-rudin1976principles"/>
+    <w:bookmarkEnd w:id="127"/>
+    <w:bookmarkStart w:id="128" w:name="ref-rudin1976principles"/>
     <w:p>
       <w:pPr>
         <w:pStyle w:val="Bibliography"/>
@@ -21310,8 +21316,8 @@
         <w:t xml:space="preserve">. 3rd ed. International Series in Pure and Applied Mathematics. McGraw-Hill.</w:t>
       </w:r>
     </w:p>
-    <w:bookmarkEnd w:id="127"/>
-    <w:bookmarkStart w:id="129" w:name="ref-velleman2019prove"/>
+    <w:bookmarkEnd w:id="128"/>
+    <w:bookmarkStart w:id="130" w:name="ref-velleman2019prove"/>
     <w:p>
       <w:pPr>
         <w:pStyle w:val="Bibliography"/>
@@ -21335,7 +21341,7 @@
       <w:r>
         <w:t xml:space="preserve"> </w:t>
       </w:r>
-      <w:hyperlink r:id="rId128">
+      <w:hyperlink r:id="rId129">
         <w:r>
           <w:rPr>
             <w:rStyle w:val="Hyperlink"/>
@@ -21347,9 +21353,9 @@
         <w:t xml:space="preserve">.</w:t>
       </w:r>
     </w:p>
-    <w:bookmarkEnd w:id="129"/>
     <w:bookmarkEnd w:id="130"/>
     <w:bookmarkEnd w:id="131"/>
+    <w:bookmarkEnd w:id="132"/>
     <w:sectPr>
       <w:footnotePr>
         <w:numRestart w:val="eachSect"/>

</xml_diff>

<commit_message>
Deploying to gh-pages from @ Morrison-Lab/mds@02aad8fbe1e4957db4e83c08460491b694791fd2 🚀
</commit_message>
<xml_diff>
--- a/notation.docx
+++ b/notation.docx
@@ -15,7 +15,7 @@
         <w:pStyle w:val="Date"/>
       </w:pPr>
       <w:r>
-        <w:t xml:space="preserve">Last modified: 2026-10-17 02:34:23 (PDT)</w:t>
+        <w:t xml:space="preserve">Last modified: 2026-10-17 03:46:15 (PDT)</w:t>
       </w:r>
     </w:p>
     <w:p>
@@ -1599,307 +1599,44 @@
       </w:r>
     </w:p>
     <w:bookmarkEnd w:id="27"/>
-    <w:bookmarkStart w:id="34" w:name="X93a3d4ef5e06a67ae6b891e46b41b74b3674f55"/>
+    <w:bookmarkStart w:id="41" w:name="sec-subscripts-parentheses"/>
     <w:p>
       <w:pPr>
         <w:pStyle w:val="Heading2"/>
       </w:pPr>
       <w:r>
-        <w:t xml:space="preserve">2 Why is notation in probability and statistics so inconsistent and disorganized?</w:t>
+        <w:t xml:space="preserve">2 Subscripts and parentheses</w:t>
       </w:r>
     </w:p>
+    <w:bookmarkStart w:id="30" w:name="rem-subscript-parentheses-convention"/>
     <w:p>
       <w:pPr>
         <w:pStyle w:val="FirstParagraph"/>
       </w:pPr>
       <w:r>
-        <w:t xml:space="preserve">In grad school,</w:t>
-      </w:r>
-      <w:r>
-        <w:t xml:space="preserve"> </w:t>
-      </w:r>
-      <w:r>
-        <w:t xml:space="preserve">we are asked to learn</w:t>
-      </w:r>
-      <w:r>
-        <w:t xml:space="preserve"> </w:t>
-      </w:r>
-      <w:r>
-        <w:t xml:space="preserve">from increasingly disorganized materials and lectures.</w:t>
-      </w:r>
-      <w:r>
-        <w:t xml:space="preserve"> </w:t>
-      </w:r>
-      <w:r>
-        <w:t xml:space="preserve">Not coincidentally,</w:t>
-      </w:r>
-      <w:r>
-        <w:t xml:space="preserve"> </w:t>
-      </w:r>
-      <w:r>
-        <w:t xml:space="preserve">as the amount of organization decreases,</w:t>
-      </w:r>
-      <w:r>
-        <w:t xml:space="preserve"> </w:t>
-      </w:r>
-      <w:r>
-        <w:t xml:space="preserve">the amount of complexity increases,</w:t>
-      </w:r>
-      <w:r>
-        <w:t xml:space="preserve"> </w:t>
-      </w:r>
-      <w:r>
-        <w:t xml:space="preserve">the amount of difficulty increases,</w:t>
-      </w:r>
-      <w:r>
-        <w:t xml:space="preserve"> </w:t>
-      </w:r>
-      <w:r>
-        <w:t xml:space="preserve">the number of reliable references decreases,</w:t>
-      </w:r>
-      <w:r>
-        <w:t xml:space="preserve"> </w:t>
-      </w:r>
-      <w:r>
-        <w:t xml:space="preserve">and the amount of inconsistency in notation and content increases</w:t>
-      </w:r>
-      <w:r>
-        <w:t xml:space="preserve"> </w:t>
-      </w:r>
-      <w:r>
-        <w:t xml:space="preserve">(both between multiple references and within single references!).</w:t>
-      </w:r>
-      <w:r>
-        <w:t xml:space="preserve"> </w:t>
-      </w:r>
-      <w:r>
-        <w:t xml:space="preserve">In other words,</w:t>
-      </w:r>
-      <w:r>
-        <w:t xml:space="preserve"> </w:t>
-      </w:r>
-      <w:r>
-        <w:t xml:space="preserve">as you approach the cutting-edge of most fields,</w:t>
-      </w:r>
-      <w:r>
-        <w:t xml:space="preserve"> </w:t>
-      </w:r>
-      <w:r>
-        <w:t xml:space="preserve">you start to run into content</w:t>
-      </w:r>
-      <w:r>
-        <w:t xml:space="preserve"> </w:t>
-      </w:r>
-      <w:r>
-        <w:t xml:space="preserve">that hasn’t been fully thought through or standardized.</w:t>
-      </w:r>
-      <w:r>
-        <w:t xml:space="preserve"> </w:t>
-      </w:r>
-      <w:r>
-        <w:t xml:space="preserve">This lack of clarity</w:t>
-      </w:r>
-      <w:r>
-        <w:t xml:space="preserve"> </w:t>
-      </w:r>
-      <w:r>
-        <w:t xml:space="preserve">is unfortunate and undesirable,</w:t>
-      </w:r>
-      <w:r>
-        <w:t xml:space="preserve"> </w:t>
-      </w:r>
-      <w:r>
-        <w:t xml:space="preserve">but it is understandable and inevitable.</w:t>
-      </w:r>
-    </w:p>
-    <w:p>
-      <w:pPr>
-        <w:pStyle w:val="BodyText"/>
-      </w:pPr>
-      <w:r>
-        <w:t xml:space="preserve">It’s worth noting</w:t>
-      </w:r>
-      <w:r>
-        <w:t xml:space="preserve"> </w:t>
-      </w:r>
-      <w:r>
-        <w:t xml:space="preserve">that calculus was formalized in the</w:t>
-      </w:r>
-      <w:r>
-        <w:t xml:space="preserve"> </w:t>
-      </w:r>
-      <w:hyperlink r:id="rId28">
-        <w:r>
-          <w:rPr>
-            <w:rStyle w:val="Hyperlink"/>
-          </w:rPr>
-          <w:t xml:space="preserve">1600s</w:t>
-        </w:r>
-      </w:hyperlink>
-      <w:r>
-        <w:t xml:space="preserve">,</w:t>
-      </w:r>
-      <w:r>
-        <w:t xml:space="preserve"> </w:t>
-      </w:r>
-      <w:r>
-        <w:t xml:space="preserve">elementary algebra was formalized around</w:t>
-      </w:r>
-      <w:r>
-        <w:t xml:space="preserve"> </w:t>
-      </w:r>
-      <w:hyperlink r:id="rId29">
-        <w:r>
-          <w:rPr>
-            <w:rStyle w:val="Hyperlink"/>
-          </w:rPr>
-          <w:t xml:space="preserve">820</w:t>
-        </w:r>
-      </w:hyperlink>
-      <w:r>
-        <w:t xml:space="preserve">,</w:t>
-      </w:r>
-      <w:r>
-        <w:t xml:space="preserve"> </w:t>
-      </w:r>
-      <w:r>
-        <w:t xml:space="preserve">and arithmetic</w:t>
-      </w:r>
-      <w:r>
-        <w:t xml:space="preserve"> </w:t>
-      </w:r>
-      <w:hyperlink r:id="rId30">
-        <w:r>
-          <w:rPr>
-            <w:rStyle w:val="Hyperlink"/>
-          </w:rPr>
-          <w:t xml:space="preserve">even earlier</w:t>
-        </w:r>
-      </w:hyperlink>
-      <w:r>
-        <w:t xml:space="preserve">.</w:t>
-      </w:r>
-      <w:r>
-        <w:t xml:space="preserve"> </w:t>
-      </w:r>
-      <w:r>
-        <w:t xml:space="preserve">And calculus still has</w:t>
-      </w:r>
-      <w:r>
-        <w:t xml:space="preserve"> </w:t>
-      </w:r>
-      <w:hyperlink r:id="rId31">
-        <w:r>
-          <w:rPr>
-            <w:rStyle w:val="Hyperlink"/>
-          </w:rPr>
-          <w:t xml:space="preserve">several competing notation systems</w:t>
-        </w:r>
-      </w:hyperlink>
-      <w:r>
-        <w:t xml:space="preserve">.</w:t>
-      </w:r>
-      <w:r>
-        <w:t xml:space="preserve"> </w:t>
-      </w:r>
-      <w:r>
-        <w:t xml:space="preserve">In contrast, the field of statistics only emerged in the</w:t>
-      </w:r>
-      <w:r>
-        <w:t xml:space="preserve"> </w:t>
-      </w:r>
-      <w:hyperlink r:id="rId32">
-        <w:r>
-          <w:rPr>
-            <w:rStyle w:val="Hyperlink"/>
-          </w:rPr>
-          <w:t xml:space="preserve">late 1800s and early 1900s</w:t>
-        </w:r>
-      </w:hyperlink>
-      <w:r>
-        <w:t xml:space="preserve">,</w:t>
-      </w:r>
-      <w:r>
-        <w:t xml:space="preserve"> </w:t>
-      </w:r>
-      <w:r>
-        <w:t xml:space="preserve">so it’s not surprising that the notation and terminology is still developing.</w:t>
-      </w:r>
-      <w:r>
-        <w:t xml:space="preserve"> </w:t>
-      </w:r>
-      <w:r>
-        <w:t xml:space="preserve">Generalized linear models were only formalized in 1972</w:t>
-      </w:r>
-      <w:r>
-        <w:t xml:space="preserve"> </w:t>
-      </w:r>
-      <w:r>
-        <w:t xml:space="preserve">(Nelder and Wedderburn 1972)</w:t>
-      </w:r>
-      <w:r>
-        <w:t xml:space="preserve">,</w:t>
-      </w:r>
-      <w:r>
-        <w:t xml:space="preserve"> </w:t>
-      </w:r>
-      <w:r>
-        <w:t xml:space="preserve">which is very recent in terms of the</w:t>
-      </w:r>
-      <w:r>
-        <w:t xml:space="preserve"> </w:t>
-      </w:r>
-      <w:hyperlink r:id="rId33">
-        <w:r>
-          <w:rPr>
-            <w:rStyle w:val="Hyperlink"/>
-          </w:rPr>
-          <w:t xml:space="preserve">pace of scientific development</w:t>
-        </w:r>
-      </w:hyperlink>
-      <w:r>
-        <w:t xml:space="preserve">.</w:t>
-      </w:r>
-    </w:p>
-    <w:bookmarkEnd w:id="34"/>
-    <w:bookmarkStart w:id="41" w:name="sec-further-reading"/>
-    <w:p>
-      <w:pPr>
-        <w:pStyle w:val="Heading2"/>
-      </w:pPr>
-      <w:r>
-        <w:t xml:space="preserve">3 Further reading</w:t>
-      </w:r>
-    </w:p>
-    <w:p>
-      <w:pPr>
-        <w:pStyle w:val="FirstParagraph"/>
-      </w:pPr>
-      <w:r>
-        <w:t xml:space="preserve">For the logical symbols and proof conventions used in these notes</w:t>
-      </w:r>
-      <w:r>
-        <w:t xml:space="preserve"> </w:t>
-      </w:r>
-      <w:r>
-        <w:t xml:space="preserve">(whose definitions are on the</w:t>
-      </w:r>
-      <w:r>
-        <w:t xml:space="preserve"> </w:t>
-      </w:r>
-      <w:hyperlink r:id="rId35">
-        <w:r>
-          <w:rPr>
-            <w:rStyle w:val="Hyperlink"/>
-          </w:rPr>
-          <w:t xml:space="preserve">Proof Writing</w:t>
-        </w:r>
-      </w:hyperlink>
-      <w:r>
-        <w:t xml:space="preserve"> </w:t>
-      </w:r>
-      <w:r>
-        <w:t xml:space="preserve">page):</w:t>
+        <w:rPr>
+          <w:i/>
+          <w:iCs/>
+        </w:rPr>
+        <w:t xml:space="preserve">Remark 1</w:t>
+      </w:r>
+      <w:r>
+        <w:t xml:space="preserve"> (Our convention for subscripts and parentheses). </w:t>
+      </w:r>
+      <w:r>
+        <w:t xml:space="preserve">Subscripts and parentheses both attach extra information to a symbol,</w:t>
+      </w:r>
+      <w:r>
+        <w:t xml:space="preserve"> </w:t>
+      </w:r>
+      <w:r>
+        <w:t xml:space="preserve">and sources divide the work between them differently.</w:t>
+      </w:r>
+      <w:r>
+        <w:t xml:space="preserve"> </w:t>
+      </w:r>
+      <w:r>
+        <w:t xml:space="preserve">These notes follow two rules of thumb:</w:t>
       </w:r>
     </w:p>
     <w:p>
@@ -1911,47 +1648,127 @@
         </w:numPr>
       </w:pPr>
       <w:r>
-        <w:t xml:space="preserve">Velleman (2019)</w:t>
-      </w:r>
-      <w:r>
-        <w:t xml:space="preserve"> </w:t>
-      </w:r>
-      <w:r>
-        <w:t xml:space="preserve">explains how mathematical statements are built from</w:t>
-      </w:r>
-      <w:r>
-        <w:t xml:space="preserve"> </w:t>
-      </w:r>
-      <w:r>
-        <w:t xml:space="preserve">logical connectives (</w:t>
-      </w:r>
-      <w:hyperlink r:id="rId36">
+        <w:t xml:space="preserve">A subscript names which member of an</w:t>
+      </w:r>
+      <w:r>
+        <w:t xml:space="preserve"> </w:t>
+      </w:r>
+      <w:hyperlink r:id="rId28">
         <w:r>
           <w:rPr>
             <w:rStyle w:val="Hyperlink"/>
           </w:rPr>
-          <w:t xml:space="preserve">definition</w:t>
+          <w:t xml:space="preserve">indexed family</w:t>
         </w:r>
       </w:hyperlink>
       <w:r>
-        <w:t xml:space="preserve">) and quantifiers (</w:t>
-      </w:r>
-      <w:hyperlink r:id="rId37">
+        <w:t xml:space="preserve"> </w:t>
+      </w:r>
+      <w:r>
+        <w:t xml:space="preserve">we mean.</w:t>
+      </w:r>
+      <w:r>
+        <w:t xml:space="preserve"> </w:t>
+      </w:r>
+      <w:r>
+        <w:t xml:space="preserve">It holds an index, such as the</w:t>
+      </w:r>
+      <w:r>
+        <w:t xml:space="preserve"> </w:t>
+      </w:r>
+      <m:oMath>
+        <m:r>
+          <m:t>i</m:t>
+        </m:r>
+      </m:oMath>
+      <w:r>
+        <w:t xml:space="preserve"> </w:t>
+      </w:r>
+      <w:r>
+        <w:t xml:space="preserve">in</w:t>
+      </w:r>
+      <w:r>
+        <w:t xml:space="preserve"> </w:t>
+      </w:r>
+      <m:oMath>
+        <m:sSub>
+          <m:e>
+            <m:r>
+              <m:t>x</m:t>
+            </m:r>
+          </m:e>
+          <m:sub>
+            <m:r>
+              <m:t>i</m:t>
+            </m:r>
+          </m:sub>
+        </m:sSub>
+      </m:oMath>
+      <w:r>
+        <w:t xml:space="preserve">,</w:t>
+      </w:r>
+      <w:r>
+        <w:t xml:space="preserve"> </w:t>
+      </w:r>
+      <w:r>
+        <w:t xml:space="preserve">or a parameter that picks one</w:t>
+      </w:r>
+      <w:r>
+        <w:t xml:space="preserve"> </w:t>
+      </w:r>
+      <w:hyperlink r:id="rId29">
         <w:r>
           <w:rPr>
             <w:rStyle w:val="Hyperlink"/>
           </w:rPr>
-          <w:t xml:space="preserve">definition</w:t>
+          <w:t xml:space="preserve">function</w:t>
         </w:r>
       </w:hyperlink>
       <w:r>
-        <w:t xml:space="preserve">),</w:t>
-      </w:r>
-      <w:r>
-        <w:t xml:space="preserve"> </w:t>
-      </w:r>
-      <w:r>
-        <w:t xml:space="preserve">and how to read and write them.</w:t>
+        <w:t xml:space="preserve"> </w:t>
+      </w:r>
+      <w:r>
+        <w:t xml:space="preserve">or distribution out of the family,</w:t>
+      </w:r>
+      <w:r>
+        <w:t xml:space="preserve"> </w:t>
+      </w:r>
+      <w:r>
+        <w:t xml:space="preserve">such as the</w:t>
+      </w:r>
+      <w:r>
+        <w:t xml:space="preserve"> </w:t>
+      </w:r>
+      <m:oMath>
+        <m:r>
+          <m:t>θ</m:t>
+        </m:r>
+      </m:oMath>
+      <w:r>
+        <w:t xml:space="preserve"> </w:t>
+      </w:r>
+      <w:r>
+        <w:t xml:space="preserve">in</w:t>
+      </w:r>
+      <w:r>
+        <w:t xml:space="preserve"> </w:t>
+      </w:r>
+      <m:oMath>
+        <m:sSub>
+          <m:e>
+            <m:r>
+              <m:t>f</m:t>
+            </m:r>
+          </m:e>
+          <m:sub>
+            <m:r>
+              <m:t>θ</m:t>
+            </m:r>
+          </m:sub>
+        </m:sSub>
+      </m:oMath>
+      <w:r>
+        <w:t xml:space="preserve">.</w:t>
       </w:r>
     </w:p>
     <w:p>
@@ -1963,25 +1780,39 @@
         </w:numPr>
       </w:pPr>
       <w:r>
-        <w:t xml:space="preserve">Barker-Plummer et al. (2011)</w:t>
-      </w:r>
-      <w:r>
-        <w:t xml:space="preserve"> </w:t>
-      </w:r>
-      <w:r>
-        <w:t xml:space="preserve">covers the same symbols as a formal language,</w:t>
-      </w:r>
-      <w:r>
-        <w:t xml:space="preserve"> </w:t>
-      </w:r>
-      <w:r>
-        <w:t xml:space="preserve">with propositional logic (the logic of connectives)</w:t>
-      </w:r>
-      <w:r>
-        <w:t xml:space="preserve"> </w:t>
-      </w:r>
-      <w:r>
-        <w:t xml:space="preserve">and first-order logic (which adds quantifiers).</w:t>
+        <w:t xml:space="preserve">Parentheses hold the input a function is evaluated at,</w:t>
+      </w:r>
+      <w:r>
+        <w:t xml:space="preserve"> </w:t>
+      </w:r>
+      <w:r>
+        <w:t xml:space="preserve">as in</w:t>
+      </w:r>
+      <w:r>
+        <w:t xml:space="preserve"> </w:t>
+      </w:r>
+      <m:oMath>
+        <m:r>
+          <m:t>f</m:t>
+        </m:r>
+        <m:r>
+          <m:rPr>
+            <m:sty m:val="p"/>
+          </m:rPr>
+          <m:t>(</m:t>
+        </m:r>
+        <m:r>
+          <m:t>x</m:t>
+        </m:r>
+        <m:r>
+          <m:rPr>
+            <m:sty m:val="p"/>
+          </m:rPr>
+          <m:t>)</m:t>
+        </m:r>
+      </m:oMath>
+      <w:r>
+        <w:t xml:space="preserve">.</w:t>
       </w:r>
     </w:p>
     <w:p>
@@ -1989,12 +1820,2193 @@
         <w:pStyle w:val="FirstParagraph"/>
       </w:pPr>
       <w:r>
+        <w:t xml:space="preserve">Under these rules,</w:t>
+      </w:r>
+      <w:r>
+        <w:t xml:space="preserve"> </w:t>
+      </w:r>
+      <m:oMath>
+        <m:sSub>
+          <m:e>
+            <m:r>
+              <m:t>f</m:t>
+            </m:r>
+          </m:e>
+          <m:sub>
+            <m:r>
+              <m:t>θ</m:t>
+            </m:r>
+          </m:sub>
+        </m:sSub>
+        <m:r>
+          <m:rPr>
+            <m:sty m:val="p"/>
+          </m:rPr>
+          <m:t>(</m:t>
+        </m:r>
+        <m:r>
+          <m:t>x</m:t>
+        </m:r>
+        <m:r>
+          <m:rPr>
+            <m:sty m:val="p"/>
+          </m:rPr>
+          <m:t>)</m:t>
+        </m:r>
+      </m:oMath>
+      <w:r>
+        <w:t xml:space="preserve"> </w:t>
+      </w:r>
+      <w:r>
+        <w:t xml:space="preserve">reads</w:t>
+      </w:r>
+      <w:r>
+        <w:t xml:space="preserve"> </w:t>
+      </w:r>
+      <w:r>
+        <w:t xml:space="preserve">“the member of the family labeled</w:t>
+      </w:r>
+      <w:r>
+        <w:t xml:space="preserve"> </w:t>
+      </w:r>
+      <m:oMath>
+        <m:r>
+          <m:t>θ</m:t>
+        </m:r>
+      </m:oMath>
+      <w:r>
+        <w:t xml:space="preserve">, evaluated at</w:t>
+      </w:r>
+      <w:r>
+        <w:t xml:space="preserve"> </w:t>
+      </w:r>
+      <m:oMath>
+        <m:r>
+          <m:t>x</m:t>
+        </m:r>
+      </m:oMath>
+      <w:r>
+        <w:t xml:space="preserve">”</w:t>
+      </w:r>
+      <w:r>
+        <w:t xml:space="preserve">.</w:t>
+      </w:r>
+      <w:r>
+        <w:t xml:space="preserve"> </w:t>
+      </w:r>
+      <w:r>
+        <w:t xml:space="preserve">Nothing forces this split.</w:t>
+      </w:r>
+      <w:r>
+        <w:t xml:space="preserve"> </w:t>
+      </w:r>
+      <w:r>
+        <w:t xml:space="preserve">It is a convention for keeping a formula readable,</w:t>
+      </w:r>
+      <w:r>
+        <w:t xml:space="preserve"> </w:t>
+      </w:r>
+      <w:r>
+        <w:t xml:space="preserve">and you will meet the same objects written the other way around.</w:t>
+      </w:r>
+    </w:p>
+    <w:bookmarkEnd w:id="30"/>
+    <w:tbl>
+      <w:tblPr>
+        <w:tblStyle w:val="Table"/>
+        <w:tblW w:type="pct" w:w="5000"/>
+        <w:tblLayout w:type="fixed"/>
+        <w:tblLook w:firstRow="0" w:lastRow="0" w:firstColumn="0" w:lastColumn="0" w:noHBand="0" w:noVBand="0" w:val="0000"/>
+      </w:tblPr>
+      <w:tblGrid>
+        <w:gridCol w:w="7920"/>
+      </w:tblGrid>
+      <w:tr>
+        <w:tc>
+          <w:tcPr/>
+          <w:bookmarkStart w:id="32" w:name="tbl-subscript-parentheses"/>
+          <w:p>
+            <w:pPr>
+              <w:jc w:val="center"/>
+            </w:pPr>
+            <w:pPr>
+              <w:jc w:val="left"/>
+              <w:spacing w:before="200"/>
+              <w:pStyle w:val="ImageCaption"/>
+            </w:pPr>
+            <w:r>
+              <w:t xml:space="preserve">Table 2: Subscripts and parentheses in these notes, and the alternatives</w:t>
+            </w:r>
+          </w:p>
+          <w:tbl>
+            <w:tblPr>
+              <w:tblStyle w:val="Table"/>
+              <w:tblW w:type="pct" w:w="5000"/>
+              <w:tblLayout w:type="fixed"/>
+              <w:tblLook w:firstRow="1" w:lastRow="0" w:firstColumn="0" w:lastColumn="0" w:noHBand="0" w:noVBand="0" w:val="0020"/>
+            </w:tblPr>
+            <w:tblGrid>
+              <w:gridCol w:w="2640"/>
+              <w:gridCol w:w="2640"/>
+              <w:gridCol w:w="2640"/>
+            </w:tblGrid>
+            <w:tr>
+              <w:trPr>
+                <w:tblHeader w:val="on"/>
+              </w:trPr>
+              <w:tc>
+                <w:tcPr/>
+                <w:p>
+                  <w:pPr>
+                    <w:pStyle w:val="Compact"/>
+                    <w:jc w:val="center"/>
+                  </w:pPr>
+                  <w:r>
+                    <w:t xml:space="preserve">object</w:t>
+                  </w:r>
+                </w:p>
+              </w:tc>
+              <w:tc>
+                <w:tcPr/>
+                <w:p>
+                  <w:pPr>
+                    <w:pStyle w:val="Compact"/>
+                    <w:jc w:val="center"/>
+                  </w:pPr>
+                  <w:r>
+                    <w:t xml:space="preserve">our form</w:t>
+                  </w:r>
+                </w:p>
+              </w:tc>
+              <w:tc>
+                <w:tcPr/>
+                <w:p>
+                  <w:pPr>
+                    <w:pStyle w:val="Compact"/>
+                    <w:jc w:val="center"/>
+                  </w:pPr>
+                  <w:r>
+                    <w:t xml:space="preserve">other forms you may meet</w:t>
+                  </w:r>
+                </w:p>
+              </w:tc>
+            </w:tr>
+            <w:tr>
+              <w:tc>
+                <w:tcPr/>
+                <w:p>
+                  <w:pPr>
+                    <w:pStyle w:val="Compact"/>
+                    <w:jc w:val="center"/>
+                  </w:pPr>
+                  <w:r>
+                    <w:t xml:space="preserve">entry of a vector or matrix</w:t>
+                  </w:r>
+                </w:p>
+              </w:tc>
+              <w:tc>
+                <w:tcPr/>
+                <w:p>
+                  <w:pPr>
+                    <w:pStyle w:val="Compact"/>
+                    <w:jc w:val="center"/>
+                  </w:pPr>
+                  <m:oMath>
+                    <m:sSub>
+                      <m:e>
+                        <m:r>
+                          <m:t>x</m:t>
+                        </m:r>
+                      </m:e>
+                      <m:sub>
+                        <m:r>
+                          <m:t>i</m:t>
+                        </m:r>
+                      </m:sub>
+                    </m:sSub>
+                  </m:oMath>
+                  <w:r>
+                    <w:t xml:space="preserve">,</w:t>
+                  </w:r>
+                  <w:r>
+                    <w:t xml:space="preserve"> </w:t>
+                  </w:r>
+                  <m:oMath>
+                    <m:sSub>
+                      <m:e>
+                        <m:r>
+                          <m:t>A</m:t>
+                        </m:r>
+                      </m:e>
+                      <m:sub>
+                        <m:r>
+                          <m:t>i</m:t>
+                        </m:r>
+                        <m:r>
+                          <m:t>j</m:t>
+                        </m:r>
+                      </m:sub>
+                    </m:sSub>
+                  </m:oMath>
+                </w:p>
+              </w:tc>
+              <w:tc>
+                <w:tcPr/>
+                <w:p>
+                  <w:pPr>
+                    <w:pStyle w:val="Compact"/>
+                    <w:jc w:val="center"/>
+                  </w:pPr>
+                  <m:oMath>
+                    <m:r>
+                      <m:t>x</m:t>
+                    </m:r>
+                    <m:r>
+                      <m:rPr>
+                        <m:sty m:val="p"/>
+                      </m:rPr>
+                      <m:t>(</m:t>
+                    </m:r>
+                    <m:r>
+                      <m:t>i</m:t>
+                    </m:r>
+                    <m:r>
+                      <m:rPr>
+                        <m:sty m:val="p"/>
+                      </m:rPr>
+                      <m:t>)</m:t>
+                    </m:r>
+                  </m:oMath>
+                  <w:r>
+                    <w:t xml:space="preserve">,</w:t>
+                  </w:r>
+                  <w:r>
+                    <w:t xml:space="preserve"> </w:t>
+                  </w:r>
+                  <m:oMath>
+                    <m:r>
+                      <m:t>A</m:t>
+                    </m:r>
+                    <m:r>
+                      <m:rPr>
+                        <m:sty m:val="p"/>
+                      </m:rPr>
+                      <m:t>(</m:t>
+                    </m:r>
+                    <m:r>
+                      <m:t>i</m:t>
+                    </m:r>
+                    <m:r>
+                      <m:rPr>
+                        <m:sty m:val="p"/>
+                      </m:rPr>
+                      <m:t>,</m:t>
+                    </m:r>
+                    <m:r>
+                      <m:t>j</m:t>
+                    </m:r>
+                    <m:r>
+                      <m:rPr>
+                        <m:sty m:val="p"/>
+                      </m:rPr>
+                      <m:t>)</m:t>
+                    </m:r>
+                  </m:oMath>
+                  <w:r>
+                    <w:t xml:space="preserve">, and</w:t>
+                  </w:r>
+                  <w:r>
+                    <w:t xml:space="preserve"> </w:t>
+                  </w:r>
+                  <w:r>
+                    <w:rPr>
+                      <w:rStyle w:val="VerbatimChar"/>
+                    </w:rPr>
+                    <w:t xml:space="preserve">A[i, j]</w:t>
+                  </w:r>
+                  <w:r>
+                    <w:t xml:space="preserve"> </w:t>
+                  </w:r>
+                  <w:r>
+                    <w:t xml:space="preserve">in code</w:t>
+                  </w:r>
+                </w:p>
+              </w:tc>
+            </w:tr>
+            <w:tr>
+              <w:tc>
+                <w:tcPr/>
+                <w:p>
+                  <w:pPr>
+                    <w:pStyle w:val="Compact"/>
+                    <w:jc w:val="center"/>
+                  </w:pPr>
+                  <w:r>
+                    <w:t xml:space="preserve">term of a</w:t>
+                  </w:r>
+                  <w:r>
+                    <w:t xml:space="preserve"> </w:t>
+                  </w:r>
+                  <w:hyperlink r:id="rId31">
+                    <w:r>
+                      <w:rPr>
+                        <w:rStyle w:val="Hyperlink"/>
+                      </w:rPr>
+                      <w:t xml:space="preserve">sequence</w:t>
+                    </w:r>
+                  </w:hyperlink>
+                </w:p>
+              </w:tc>
+              <w:tc>
+                <w:tcPr/>
+                <w:p>
+                  <w:pPr>
+                    <w:pStyle w:val="Compact"/>
+                    <w:jc w:val="center"/>
+                  </w:pPr>
+                  <m:oMath>
+                    <m:sSub>
+                      <m:e>
+                        <m:r>
+                          <m:t>a</m:t>
+                        </m:r>
+                      </m:e>
+                      <m:sub>
+                        <m:r>
+                          <m:t>n</m:t>
+                        </m:r>
+                      </m:sub>
+                    </m:sSub>
+                  </m:oMath>
+                  <w:r>
+                    <w:t xml:space="preserve">​</w:t>
+                  </w:r>
+                </w:p>
+              </w:tc>
+              <w:tc>
+                <w:tcPr/>
+                <w:p>
+                  <w:pPr>
+                    <w:pStyle w:val="Compact"/>
+                    <w:jc w:val="center"/>
+                  </w:pPr>
+                  <m:oMath>
+                    <m:r>
+                      <m:t>a</m:t>
+                    </m:r>
+                    <m:r>
+                      <m:rPr>
+                        <m:sty m:val="p"/>
+                      </m:rPr>
+                      <m:t>(</m:t>
+                    </m:r>
+                    <m:r>
+                      <m:t>n</m:t>
+                    </m:r>
+                    <m:r>
+                      <m:rPr>
+                        <m:sty m:val="p"/>
+                      </m:rPr>
+                      <m:t>)</m:t>
+                    </m:r>
+                  </m:oMath>
+                  <w:r>
+                    <w:t xml:space="preserve">​</w:t>
+                  </w:r>
+                </w:p>
+              </w:tc>
+            </w:tr>
+            <w:tr>
+              <w:tc>
+                <w:tcPr/>
+                <w:p>
+                  <w:pPr>
+                    <w:pStyle w:val="Compact"/>
+                    <w:jc w:val="center"/>
+                  </w:pPr>
+                  <w:r>
+                    <w:t xml:space="preserve">function with a parameter</w:t>
+                  </w:r>
+                </w:p>
+              </w:tc>
+              <w:tc>
+                <w:tcPr/>
+                <w:p>
+                  <w:pPr>
+                    <w:pStyle w:val="Compact"/>
+                    <w:jc w:val="center"/>
+                  </w:pPr>
+                  <m:oMath>
+                    <m:sSub>
+                      <m:e>
+                        <m:r>
+                          <m:t>f</m:t>
+                        </m:r>
+                      </m:e>
+                      <m:sub>
+                        <m:r>
+                          <m:t>θ</m:t>
+                        </m:r>
+                      </m:sub>
+                    </m:sSub>
+                    <m:r>
+                      <m:rPr>
+                        <m:sty m:val="p"/>
+                      </m:rPr>
+                      <m:t>(</m:t>
+                    </m:r>
+                    <m:r>
+                      <m:t>x</m:t>
+                    </m:r>
+                    <m:r>
+                      <m:rPr>
+                        <m:sty m:val="p"/>
+                      </m:rPr>
+                      <m:t>)</m:t>
+                    </m:r>
+                  </m:oMath>
+                  <w:r>
+                    <w:t xml:space="preserve">​</w:t>
+                  </w:r>
+                </w:p>
+              </w:tc>
+              <w:tc>
+                <w:tcPr/>
+                <w:p>
+                  <w:pPr>
+                    <w:pStyle w:val="Compact"/>
+                    <w:jc w:val="center"/>
+                  </w:pPr>
+                  <m:oMath>
+                    <m:r>
+                      <m:t>f</m:t>
+                    </m:r>
+                    <m:r>
+                      <m:rPr>
+                        <m:sty m:val="p"/>
+                      </m:rPr>
+                      <m:t>(</m:t>
+                    </m:r>
+                    <m:r>
+                      <m:t>x</m:t>
+                    </m:r>
+                    <m:r>
+                      <m:rPr>
+                        <m:sty m:val="p"/>
+                      </m:rPr>
+                      <m:t>;</m:t>
+                    </m:r>
+                    <m:r>
+                      <m:t>θ</m:t>
+                    </m:r>
+                    <m:r>
+                      <m:rPr>
+                        <m:sty m:val="p"/>
+                      </m:rPr>
+                      <m:t>)</m:t>
+                    </m:r>
+                  </m:oMath>
+                  <w:r>
+                    <w:t xml:space="preserve">,</w:t>
+                  </w:r>
+                  <w:r>
+                    <w:t xml:space="preserve"> </w:t>
+                  </w:r>
+                  <m:oMath>
+                    <m:r>
+                      <m:t>f</m:t>
+                    </m:r>
+                    <m:r>
+                      <m:rPr>
+                        <m:sty m:val="p"/>
+                      </m:rPr>
+                      <m:t>(</m:t>
+                    </m:r>
+                    <m:r>
+                      <m:t>x</m:t>
+                    </m:r>
+                    <m:r>
+                      <m:rPr>
+                        <m:sty m:val="p"/>
+                      </m:rPr>
+                      <m:t>∣</m:t>
+                    </m:r>
+                    <m:r>
+                      <m:t>θ</m:t>
+                    </m:r>
+                    <m:r>
+                      <m:rPr>
+                        <m:sty m:val="p"/>
+                      </m:rPr>
+                      <m:t>)</m:t>
+                    </m:r>
+                  </m:oMath>
+                  <w:r>
+                    <w:t xml:space="preserve">,</w:t>
+                  </w:r>
+                  <w:r>
+                    <w:t xml:space="preserve"> </w:t>
+                  </w:r>
+                  <m:oMath>
+                    <m:r>
+                      <m:t>f</m:t>
+                    </m:r>
+                    <m:r>
+                      <m:rPr>
+                        <m:sty m:val="p"/>
+                      </m:rPr>
+                      <m:t>(</m:t>
+                    </m:r>
+                    <m:r>
+                      <m:t>x</m:t>
+                    </m:r>
+                    <m:r>
+                      <m:rPr>
+                        <m:sty m:val="p"/>
+                      </m:rPr>
+                      <m:t>,</m:t>
+                    </m:r>
+                    <m:r>
+                      <m:t>θ</m:t>
+                    </m:r>
+                    <m:r>
+                      <m:rPr>
+                        <m:sty m:val="p"/>
+                      </m:rPr>
+                      <m:t>)</m:t>
+                    </m:r>
+                  </m:oMath>
+                </w:p>
+              </w:tc>
+            </w:tr>
+            <w:tr>
+              <w:tc>
+                <w:tcPr/>
+                <w:p>
+                  <w:pPr>
+                    <w:pStyle w:val="Compact"/>
+                    <w:jc w:val="center"/>
+                  </w:pPr>
+                  <w:r>
+                    <w:t xml:space="preserve">probability under a parameter</w:t>
+                  </w:r>
+                </w:p>
+              </w:tc>
+              <w:tc>
+                <w:tcPr/>
+                <w:p>
+                  <w:pPr>
+                    <w:pStyle w:val="Compact"/>
+                    <w:jc w:val="center"/>
+                  </w:pPr>
+                  <m:oMath>
+                    <m:sSub>
+                      <m:e>
+                        <m:r>
+                          <m:rPr>
+                            <m:sty m:val="p"/>
+                          </m:rPr>
+                          <m:t>Pr</m:t>
+                        </m:r>
+                      </m:e>
+                      <m:sub>
+                        <m:r>
+                          <m:t>θ</m:t>
+                        </m:r>
+                      </m:sub>
+                    </m:sSub>
+                    <m:r>
+                      <m:rPr>
+                        <m:sty m:val="p"/>
+                      </m:rPr>
+                      <m:t>(</m:t>
+                    </m:r>
+                    <m:r>
+                      <m:t>A</m:t>
+                    </m:r>
+                    <m:r>
+                      <m:rPr>
+                        <m:sty m:val="p"/>
+                      </m:rPr>
+                      <m:t>)</m:t>
+                    </m:r>
+                  </m:oMath>
+                  <w:r>
+                    <w:t xml:space="preserve">​</w:t>
+                  </w:r>
+                </w:p>
+              </w:tc>
+              <w:tc>
+                <w:tcPr/>
+                <w:p>
+                  <w:pPr>
+                    <w:pStyle w:val="Compact"/>
+                    <w:jc w:val="center"/>
+                  </w:pPr>
+                  <m:oMath>
+                    <m:r>
+                      <m:rPr>
+                        <m:sty m:val="p"/>
+                      </m:rPr>
+                      <m:t>Pr</m:t>
+                    </m:r>
+                    <m:r>
+                      <m:rPr>
+                        <m:sty m:val="p"/>
+                      </m:rPr>
+                      <m:t>(</m:t>
+                    </m:r>
+                    <m:r>
+                      <m:t>A</m:t>
+                    </m:r>
+                    <m:r>
+                      <m:rPr>
+                        <m:sty m:val="p"/>
+                      </m:rPr>
+                      <m:t>;</m:t>
+                    </m:r>
+                    <m:r>
+                      <m:t>θ</m:t>
+                    </m:r>
+                    <m:r>
+                      <m:rPr>
+                        <m:sty m:val="p"/>
+                      </m:rPr>
+                      <m:t>)</m:t>
+                    </m:r>
+                  </m:oMath>
+                  <w:r>
+                    <w:t xml:space="preserve">,</w:t>
+                  </w:r>
+                  <w:r>
+                    <w:t xml:space="preserve"> </w:t>
+                  </w:r>
+                  <m:oMath>
+                    <m:r>
+                      <m:rPr>
+                        <m:sty m:val="p"/>
+                      </m:rPr>
+                      <m:t>Pr</m:t>
+                    </m:r>
+                    <m:r>
+                      <m:rPr>
+                        <m:sty m:val="p"/>
+                      </m:rPr>
+                      <m:t>(</m:t>
+                    </m:r>
+                    <m:r>
+                      <m:t>A</m:t>
+                    </m:r>
+                    <m:r>
+                      <m:rPr>
+                        <m:sty m:val="p"/>
+                      </m:rPr>
+                      <m:t>∣</m:t>
+                    </m:r>
+                    <m:r>
+                      <m:t>θ</m:t>
+                    </m:r>
+                    <m:r>
+                      <m:rPr>
+                        <m:sty m:val="p"/>
+                      </m:rPr>
+                      <m:t>)</m:t>
+                    </m:r>
+                  </m:oMath>
+                </w:p>
+              </w:tc>
+            </w:tr>
+            <w:tr>
+              <w:tc>
+                <w:tcPr/>
+                <w:p>
+                  <w:pPr>
+                    <w:pStyle w:val="Compact"/>
+                    <w:jc w:val="center"/>
+                  </w:pPr>
+                  <w:r>
+                    <w:t xml:space="preserve">derivative of order</w:t>
+                  </w:r>
+                  <w:r>
+                    <w:t xml:space="preserve"> </w:t>
+                  </w:r>
+                  <m:oMath>
+                    <m:r>
+                      <m:t>k</m:t>
+                    </m:r>
+                  </m:oMath>
+                </w:p>
+              </w:tc>
+              <w:tc>
+                <w:tcPr/>
+                <w:p>
+                  <w:pPr>
+                    <w:pStyle w:val="Compact"/>
+                    <w:jc w:val="center"/>
+                  </w:pPr>
+                  <m:oMath>
+                    <m:sSup>
+                      <m:e>
+                        <m:r>
+                          <m:t>f</m:t>
+                        </m:r>
+                      </m:e>
+                      <m:sup>
+                        <m:r>
+                          <m:rPr>
+                            <m:sty m:val="p"/>
+                          </m:rPr>
+                          <m:t>(</m:t>
+                        </m:r>
+                        <m:r>
+                          <m:t>k</m:t>
+                        </m:r>
+                        <m:r>
+                          <m:rPr>
+                            <m:sty m:val="p"/>
+                          </m:rPr>
+                          <m:t>)</m:t>
+                        </m:r>
+                      </m:sup>
+                    </m:sSup>
+                    <m:r>
+                      <m:rPr>
+                        <m:sty m:val="p"/>
+                      </m:rPr>
+                      <m:t>(</m:t>
+                    </m:r>
+                    <m:r>
+                      <m:t>x</m:t>
+                    </m:r>
+                    <m:r>
+                      <m:rPr>
+                        <m:sty m:val="p"/>
+                      </m:rPr>
+                      <m:t>)</m:t>
+                    </m:r>
+                  </m:oMath>
+                  <w:r>
+                    <w:t xml:space="preserve">​</w:t>
+                  </w:r>
+                </w:p>
+              </w:tc>
+              <w:tc>
+                <w:tcPr/>
+                <w:p>
+                  <w:pPr>
+                    <w:pStyle w:val="Compact"/>
+                    <w:jc w:val="center"/>
+                  </w:pPr>
+                  <m:oMath>
+                    <m:sSup>
+                      <m:e>
+                        <m:r>
+                          <m:t>f</m:t>
+                        </m:r>
+                      </m:e>
+                      <m:sup>
+                        <m:r>
+                          <m:rPr>
+                            <m:sty m:val="p"/>
+                          </m:rPr>
+                          <m:t>[</m:t>
+                        </m:r>
+                        <m:r>
+                          <m:t>k</m:t>
+                        </m:r>
+                        <m:r>
+                          <m:rPr>
+                            <m:sty m:val="p"/>
+                          </m:rPr>
+                          <m:t>]</m:t>
+                        </m:r>
+                      </m:sup>
+                    </m:sSup>
+                    <m:r>
+                      <m:rPr>
+                        <m:sty m:val="p"/>
+                      </m:rPr>
+                      <m:t>(</m:t>
+                    </m:r>
+                    <m:r>
+                      <m:t>x</m:t>
+                    </m:r>
+                    <m:r>
+                      <m:rPr>
+                        <m:sty m:val="p"/>
+                      </m:rPr>
+                      <m:t>)</m:t>
+                    </m:r>
+                  </m:oMath>
+                  <w:r>
+                    <w:t xml:space="preserve">,</w:t>
+                  </w:r>
+                  <w:r>
+                    <w:t xml:space="preserve"> </w:t>
+                  </w:r>
+                  <m:oMath>
+                    <m:sSup>
+                      <m:e>
+                        <m:r>
+                          <m:rPr>
+                            <m:sty m:val="p"/>
+                          </m:rPr>
+                          <m:t>D</m:t>
+                        </m:r>
+                      </m:e>
+                      <m:sup>
+                        <m:r>
+                          <m:t>k</m:t>
+                        </m:r>
+                      </m:sup>
+                    </m:sSup>
+                    <m:r>
+                      <m:t>f</m:t>
+                    </m:r>
+                    <m:r>
+                      <m:rPr>
+                        <m:sty m:val="p"/>
+                      </m:rPr>
+                      <m:t>(</m:t>
+                    </m:r>
+                    <m:r>
+                      <m:t>x</m:t>
+                    </m:r>
+                    <m:r>
+                      <m:rPr>
+                        <m:sty m:val="p"/>
+                      </m:rPr>
+                      <m:t>)</m:t>
+                    </m:r>
+                  </m:oMath>
+                </w:p>
+              </w:tc>
+            </w:tr>
+            <w:tr>
+              <w:tc>
+                <w:tcPr/>
+                <w:p>
+                  <w:pPr>
+                    <w:pStyle w:val="Compact"/>
+                    <w:jc w:val="center"/>
+                  </w:pPr>
+                  <w:r>
+                    <w:t xml:space="preserve">order statistic</w:t>
+                  </w:r>
+                </w:p>
+              </w:tc>
+              <w:tc>
+                <w:tcPr/>
+                <w:p>
+                  <w:pPr>
+                    <w:pStyle w:val="Compact"/>
+                    <w:jc w:val="center"/>
+                  </w:pPr>
+                  <m:oMath>
+                    <m:sSub>
+                      <m:e>
+                        <m:r>
+                          <m:t>X</m:t>
+                        </m:r>
+                      </m:e>
+                      <m:sub>
+                        <m:r>
+                          <m:rPr>
+                            <m:sty m:val="p"/>
+                          </m:rPr>
+                          <m:t>(</m:t>
+                        </m:r>
+                        <m:r>
+                          <m:t>i</m:t>
+                        </m:r>
+                        <m:r>
+                          <m:rPr>
+                            <m:sty m:val="p"/>
+                          </m:rPr>
+                          <m:t>)</m:t>
+                        </m:r>
+                      </m:sub>
+                    </m:sSub>
+                  </m:oMath>
+                  <w:r>
+                    <w:t xml:space="preserve">​</w:t>
+                  </w:r>
+                </w:p>
+              </w:tc>
+              <w:tc>
+                <w:tcPr/>
+                <w:p>
+                  <w:pPr>
+                    <w:pStyle w:val="Compact"/>
+                    <w:jc w:val="center"/>
+                  </w:pPr>
+                  <m:oMath>
+                    <m:sSub>
+                      <m:e>
+                        <m:r>
+                          <m:t>X</m:t>
+                        </m:r>
+                      </m:e>
+                      <m:sub>
+                        <m:r>
+                          <m:t>i</m:t>
+                        </m:r>
+                        <m:r>
+                          <m:rPr>
+                            <m:sty m:val="p"/>
+                          </m:rPr>
+                          <m:t>:</m:t>
+                        </m:r>
+                        <m:r>
+                          <m:t>n</m:t>
+                        </m:r>
+                      </m:sub>
+                    </m:sSub>
+                  </m:oMath>
+                  <w:r>
+                    <w:t xml:space="preserve">​</w:t>
+                  </w:r>
+                </w:p>
+              </w:tc>
+            </w:tr>
+            <w:tr>
+              <w:tc>
+                <w:tcPr/>
+                <w:p>
+                  <w:pPr>
+                    <w:pStyle w:val="Compact"/>
+                    <w:jc w:val="center"/>
+                  </w:pPr>
+                  <w:r>
+                    <w:t xml:space="preserve">sample index</w:t>
+                  </w:r>
+                </w:p>
+              </w:tc>
+              <w:tc>
+                <w:tcPr/>
+                <w:p>
+                  <w:pPr>
+                    <w:pStyle w:val="Compact"/>
+                    <w:jc w:val="center"/>
+                  </w:pPr>
+                  <m:oMath>
+                    <m:sSub>
+                      <m:e>
+                        <m:r>
+                          <m:t>x</m:t>
+                        </m:r>
+                      </m:e>
+                      <m:sub>
+                        <m:r>
+                          <m:t>i</m:t>
+                        </m:r>
+                      </m:sub>
+                    </m:sSub>
+                  </m:oMath>
+                  <w:r>
+                    <w:t xml:space="preserve">​</w:t>
+                  </w:r>
+                </w:p>
+              </w:tc>
+              <w:tc>
+                <w:tcPr/>
+                <w:p>
+                  <w:pPr>
+                    <w:pStyle w:val="Compact"/>
+                    <w:jc w:val="center"/>
+                  </w:pPr>
+                  <m:oMath>
+                    <m:sSup>
+                      <m:e>
+                        <m:r>
+                          <m:t>x</m:t>
+                        </m:r>
+                      </m:e>
+                      <m:sup>
+                        <m:r>
+                          <m:rPr>
+                            <m:sty m:val="p"/>
+                          </m:rPr>
+                          <m:t>(</m:t>
+                        </m:r>
+                        <m:r>
+                          <m:t>i</m:t>
+                        </m:r>
+                        <m:r>
+                          <m:rPr>
+                            <m:sty m:val="p"/>
+                          </m:rPr>
+                          <m:t>)</m:t>
+                        </m:r>
+                      </m:sup>
+                    </m:sSup>
+                  </m:oMath>
+                  <w:r>
+                    <w:t xml:space="preserve">​</w:t>
+                  </w:r>
+                </w:p>
+              </w:tc>
+            </w:tr>
+          </w:tbl>
+          <w:bookmarkEnd w:id="32"/>
+          <w:p/>
+        </w:tc>
+      </w:tr>
+    </w:tbl>
+    <w:bookmarkStart w:id="38" w:name="rem-process-notation"/>
+    <w:p>
+      <w:pPr>
+        <w:pStyle w:val="BodyText"/>
+      </w:pPr>
+      <w:r>
+        <w:rPr>
+          <w:i/>
+          <w:iCs/>
+        </w:rPr>
+        <w:t xml:space="preserve">Remark 2</w:t>
+      </w:r>
+      <w:r>
+        <w:t xml:space="preserve"> (Subscripts and parentheses for a stochastic process). </w:t>
+      </w:r>
+      <w:r>
+        <w:t xml:space="preserve">The notation for a</w:t>
+      </w:r>
+      <w:r>
+        <w:t xml:space="preserve"> </w:t>
+      </w:r>
+      <w:hyperlink r:id="rId33">
+        <w:r>
+          <w:rPr>
+            <w:rStyle w:val="Hyperlink"/>
+          </w:rPr>
+          <w:t xml:space="preserve">stochastic process</w:t>
+        </w:r>
+      </w:hyperlink>
+      <w:r>
+        <w:t xml:space="preserve"> </w:t>
+      </w:r>
+      <w:r>
+        <w:t xml:space="preserve">uses both slots at once.</w:t>
+      </w:r>
+      <w:r>
+        <w:t xml:space="preserve"> </w:t>
+      </w:r>
+      <w:r>
+        <w:t xml:space="preserve">A stochastic process is an</w:t>
+      </w:r>
+      <w:r>
+        <w:t xml:space="preserve"> </w:t>
+      </w:r>
+      <w:hyperlink r:id="rId28">
+        <w:r>
+          <w:rPr>
+            <w:rStyle w:val="Hyperlink"/>
+          </w:rPr>
+          <w:t xml:space="preserve">indexed family</w:t>
+        </w:r>
+      </w:hyperlink>
+      <w:r>
+        <w:t xml:space="preserve"> </w:t>
+      </w:r>
+      <w:r>
+        <w:t xml:space="preserve">of</w:t>
+      </w:r>
+      <w:r>
+        <w:t xml:space="preserve"> </w:t>
+      </w:r>
+      <w:hyperlink r:id="rId14">
+        <w:r>
+          <w:rPr>
+            <w:rStyle w:val="Hyperlink"/>
+          </w:rPr>
+          <w:t xml:space="preserve">random variables</w:t>
+        </w:r>
+      </w:hyperlink>
+      <w:r>
+        <w:t xml:space="preserve"> </w:t>
+      </w:r>
+      <m:oMath>
+        <m:sSub>
+          <m:e>
+            <m:r>
+              <m:t>X</m:t>
+            </m:r>
+          </m:e>
+          <m:sub>
+            <m:r>
+              <m:t>t</m:t>
+            </m:r>
+          </m:sub>
+        </m:sSub>
+      </m:oMath>
+      <w:r>
+        <w:t xml:space="preserve">,</w:t>
+      </w:r>
+      <w:r>
+        <w:t xml:space="preserve"> </w:t>
+      </w:r>
+      <w:r>
+        <w:t xml:space="preserve">one for each index</w:t>
+      </w:r>
+      <w:r>
+        <w:t xml:space="preserve"> </w:t>
+      </w:r>
+      <m:oMath>
+        <m:r>
+          <m:t>t</m:t>
+        </m:r>
+      </m:oMath>
+      <w:r>
+        <w:t xml:space="preserve"> </w:t>
+      </w:r>
+      <w:r>
+        <w:t xml:space="preserve">in some</w:t>
+      </w:r>
+      <w:r>
+        <w:t xml:space="preserve"> </w:t>
+      </w:r>
+      <w:hyperlink r:id="rId34">
+        <w:r>
+          <w:rPr>
+            <w:rStyle w:val="Hyperlink"/>
+          </w:rPr>
+          <w:t xml:space="preserve">index set</w:t>
+        </w:r>
+      </w:hyperlink>
+      <w:r>
+        <w:t xml:space="preserve">, such as time.</w:t>
+      </w:r>
+      <w:r>
+        <w:t xml:space="preserve"> </w:t>
+      </w:r>
+      <w:r>
+        <w:t xml:space="preserve">The index goes in the subscript, because it picks a member of the family.</w:t>
+      </w:r>
+      <w:r>
+        <w:t xml:space="preserve"> </w:t>
+      </w:r>
+      <w:r>
+        <w:t xml:space="preserve">Each</w:t>
+      </w:r>
+      <w:r>
+        <w:t xml:space="preserve"> </w:t>
+      </w:r>
+      <m:oMath>
+        <m:sSub>
+          <m:e>
+            <m:r>
+              <m:t>X</m:t>
+            </m:r>
+          </m:e>
+          <m:sub>
+            <m:r>
+              <m:t>t</m:t>
+            </m:r>
+          </m:sub>
+        </m:sSub>
+      </m:oMath>
+      <w:r>
+        <w:t xml:space="preserve"> </w:t>
+      </w:r>
+      <w:r>
+        <w:t xml:space="preserve">is itself a</w:t>
+      </w:r>
+      <w:r>
+        <w:t xml:space="preserve"> </w:t>
+      </w:r>
+      <w:hyperlink r:id="rId29">
+        <w:r>
+          <w:rPr>
+            <w:rStyle w:val="Hyperlink"/>
+          </w:rPr>
+          <w:t xml:space="preserve">function</w:t>
+        </w:r>
+      </w:hyperlink>
+      <w:r>
+        <w:t xml:space="preserve"> </w:t>
+      </w:r>
+      <w:r>
+        <w:t xml:space="preserve">of the</w:t>
+      </w:r>
+      <w:r>
+        <w:t xml:space="preserve"> </w:t>
+      </w:r>
+      <w:hyperlink r:id="rId35">
+        <w:r>
+          <w:rPr>
+            <w:rStyle w:val="Hyperlink"/>
+          </w:rPr>
+          <w:t xml:space="preserve">outcome</w:t>
+        </w:r>
+      </w:hyperlink>
+      <w:r>
+        <w:t xml:space="preserve"> </w:t>
+      </w:r>
+      <m:oMath>
+        <m:r>
+          <m:t>ω</m:t>
+        </m:r>
+      </m:oMath>
+      <w:r>
+        <w:t xml:space="preserve"> </w:t>
+      </w:r>
+      <w:r>
+        <w:t xml:space="preserve">of a</w:t>
+      </w:r>
+      <w:r>
+        <w:t xml:space="preserve"> </w:t>
+      </w:r>
+      <w:hyperlink r:id="rId36">
+        <w:r>
+          <w:rPr>
+            <w:rStyle w:val="Hyperlink"/>
+          </w:rPr>
+          <w:t xml:space="preserve">random experiment</w:t>
+        </w:r>
+      </w:hyperlink>
+      <w:r>
+        <w:t xml:space="preserve">,</w:t>
+      </w:r>
+      <w:r>
+        <w:t xml:space="preserve"> </w:t>
+      </w:r>
+      <w:r>
+        <w:t xml:space="preserve">that is, an element of the</w:t>
+      </w:r>
+      <w:r>
+        <w:t xml:space="preserve"> </w:t>
+      </w:r>
+      <w:hyperlink r:id="rId37">
+        <w:r>
+          <w:rPr>
+            <w:rStyle w:val="Hyperlink"/>
+          </w:rPr>
+          <w:t xml:space="preserve">sample space</w:t>
+        </w:r>
+      </w:hyperlink>
+      <w:r>
+        <w:t xml:space="preserve">,</w:t>
+      </w:r>
+      <w:r>
+        <w:t xml:space="preserve"> </w:t>
+      </w:r>
+      <w:r>
+        <w:t xml:space="preserve">so the outcome goes in the parentheses:</w:t>
+      </w:r>
+      <w:r>
+        <w:t xml:space="preserve"> </w:t>
+      </w:r>
+      <m:oMath>
+        <m:sSub>
+          <m:e>
+            <m:r>
+              <m:t>X</m:t>
+            </m:r>
+          </m:e>
+          <m:sub>
+            <m:r>
+              <m:t>t</m:t>
+            </m:r>
+          </m:sub>
+        </m:sSub>
+        <m:r>
+          <m:rPr>
+            <m:sty m:val="p"/>
+          </m:rPr>
+          <m:t>(</m:t>
+        </m:r>
+        <m:r>
+          <m:t>ω</m:t>
+        </m:r>
+        <m:r>
+          <m:rPr>
+            <m:sty m:val="p"/>
+          </m:rPr>
+          <m:t>)</m:t>
+        </m:r>
+      </m:oMath>
+      <w:r>
+        <w:t xml:space="preserve">.</w:t>
+      </w:r>
+      <w:r>
+        <w:t xml:space="preserve"> </w:t>
+      </w:r>
+      <w:r>
+        <w:t xml:space="preserve">Fixing</w:t>
+      </w:r>
+      <w:r>
+        <w:t xml:space="preserve"> </w:t>
+      </w:r>
+      <m:oMath>
+        <m:r>
+          <m:t>ω</m:t>
+        </m:r>
+      </m:oMath>
+      <w:r>
+        <w:t xml:space="preserve"> </w:t>
+      </w:r>
+      <w:r>
+        <w:t xml:space="preserve">and letting</w:t>
+      </w:r>
+      <w:r>
+        <w:t xml:space="preserve"> </w:t>
+      </w:r>
+      <m:oMath>
+        <m:r>
+          <m:t>t</m:t>
+        </m:r>
+      </m:oMath>
+      <w:r>
+        <w:t xml:space="preserve"> </w:t>
+      </w:r>
+      <w:r>
+        <w:t xml:space="preserve">vary traces out one path of the process.</w:t>
+      </w:r>
+      <w:r>
+        <w:t xml:space="preserve"> </w:t>
+      </w:r>
+      <w:r>
+        <w:t xml:space="preserve">Many sources drop</w:t>
+      </w:r>
+      <w:r>
+        <w:t xml:space="preserve"> </w:t>
+      </w:r>
+      <m:oMath>
+        <m:r>
+          <m:t>ω</m:t>
+        </m:r>
+      </m:oMath>
+      <w:r>
+        <w:t xml:space="preserve"> </w:t>
+      </w:r>
+      <w:r>
+        <w:t xml:space="preserve">and write</w:t>
+      </w:r>
+      <w:r>
+        <w:t xml:space="preserve"> </w:t>
+      </w:r>
+      <m:oMath>
+        <m:sSub>
+          <m:e>
+            <m:r>
+              <m:t>X</m:t>
+            </m:r>
+          </m:e>
+          <m:sub>
+            <m:r>
+              <m:t>t</m:t>
+            </m:r>
+          </m:sub>
+        </m:sSub>
+      </m:oMath>
+      <w:r>
+        <w:t xml:space="preserve">, or write</w:t>
+      </w:r>
+      <w:r>
+        <w:t xml:space="preserve"> </w:t>
+      </w:r>
+      <m:oMath>
+        <m:r>
+          <m:t>X</m:t>
+        </m:r>
+        <m:r>
+          <m:rPr>
+            <m:sty m:val="p"/>
+          </m:rPr>
+          <m:t>(</m:t>
+        </m:r>
+        <m:r>
+          <m:t>t</m:t>
+        </m:r>
+        <m:r>
+          <m:rPr>
+            <m:sty m:val="p"/>
+          </m:rPr>
+          <m:t>)</m:t>
+        </m:r>
+      </m:oMath>
+      <w:r>
+        <w:t xml:space="preserve"> </w:t>
+      </w:r>
+      <w:r>
+        <w:t xml:space="preserve">when</w:t>
+      </w:r>
+      <w:r>
+        <w:t xml:space="preserve"> </w:t>
+      </w:r>
+      <m:oMath>
+        <m:r>
+          <m:t>t</m:t>
+        </m:r>
+      </m:oMath>
+      <w:r>
+        <w:t xml:space="preserve"> </w:t>
+      </w:r>
+      <w:r>
+        <w:t xml:space="preserve">is continuous.</w:t>
+      </w:r>
+    </w:p>
+    <w:bookmarkEnd w:id="38"/>
+    <w:bookmarkStart w:id="39" w:name="exm-process-notation"/>
+    <w:p>
+      <w:pPr>
+        <w:pStyle w:val="BodyText"/>
+      </w:pPr>
+      <w:r>
+        <w:rPr>
+          <w:b/>
+          <w:bCs/>
+        </w:rPr>
+        <w:t xml:space="preserve">Example 1 (Reading</w:t>
+      </w:r>
+      <w:r>
+        <w:rPr>
+          <w:b/>
+          <w:bCs/>
+        </w:rPr>
+        <w:t xml:space="preserve"> </w:t>
+      </w:r>
+      <m:oMath>
+        <m:sSub>
+          <m:e>
+            <m:r>
+              <m:t>X</m:t>
+            </m:r>
+          </m:e>
+          <m:sub>
+            <m:r>
+              <m:t>t</m:t>
+            </m:r>
+          </m:sub>
+        </m:sSub>
+        <m:r>
+          <m:rPr>
+            <m:sty m:val="p"/>
+          </m:rPr>
+          <m:t>(</m:t>
+        </m:r>
+        <m:r>
+          <m:t>ω</m:t>
+        </m:r>
+        <m:r>
+          <m:rPr>
+            <m:sty m:val="p"/>
+          </m:rPr>
+          <m:t>)</m:t>
+        </m:r>
+      </m:oMath>
+      <w:r>
+        <w:rPr>
+          <w:b/>
+          <w:bCs/>
+        </w:rPr>
+        <w:t xml:space="preserve">)</w:t>
+      </w:r>
+      <w:r>
+        <w:t xml:space="preserve"> </w:t>
+      </w:r>
+      <w:r>
+        <w:t xml:space="preserve">Let</w:t>
+      </w:r>
+      <w:r>
+        <w:t xml:space="preserve"> </w:t>
+      </w:r>
+      <m:oMath>
+        <m:sSub>
+          <m:e>
+            <m:r>
+              <m:t>X</m:t>
+            </m:r>
+          </m:e>
+          <m:sub>
+            <m:r>
+              <m:t>t</m:t>
+            </m:r>
+          </m:sub>
+        </m:sSub>
+      </m:oMath>
+      <w:r>
+        <w:t xml:space="preserve"> </w:t>
+      </w:r>
+      <w:r>
+        <w:t xml:space="preserve">be the position of a particle at time</w:t>
+      </w:r>
+      <w:r>
+        <w:t xml:space="preserve"> </w:t>
+      </w:r>
+      <m:oMath>
+        <m:r>
+          <m:t>t</m:t>
+        </m:r>
+        <m:r>
+          <m:rPr>
+            <m:sty m:val="p"/>
+          </m:rPr>
+          <m:t>≥</m:t>
+        </m:r>
+        <m:r>
+          <m:t>0</m:t>
+        </m:r>
+      </m:oMath>
+      <w:r>
+        <w:t xml:space="preserve">.</w:t>
+      </w:r>
+      <w:r>
+        <w:t xml:space="preserve"> </w:t>
+      </w:r>
+      <w:r>
+        <w:t xml:space="preserve">Then</w:t>
+      </w:r>
+      <w:r>
+        <w:t xml:space="preserve"> </w:t>
+      </w:r>
+      <m:oMath>
+        <m:sSub>
+          <m:e>
+            <m:r>
+              <m:t>X</m:t>
+            </m:r>
+          </m:e>
+          <m:sub>
+            <m:r>
+              <m:t>3</m:t>
+            </m:r>
+          </m:sub>
+        </m:sSub>
+      </m:oMath>
+      <w:r>
+        <w:t xml:space="preserve"> </w:t>
+      </w:r>
+      <w:r>
+        <w:t xml:space="preserve">is the random position at time 3,</w:t>
+      </w:r>
+      <w:r>
+        <w:t xml:space="preserve"> </w:t>
+      </w:r>
+      <w:r>
+        <w:t xml:space="preserve">and</w:t>
+      </w:r>
+      <w:r>
+        <w:t xml:space="preserve"> </w:t>
+      </w:r>
+      <m:oMath>
+        <m:sSub>
+          <m:e>
+            <m:r>
+              <m:t>X</m:t>
+            </m:r>
+          </m:e>
+          <m:sub>
+            <m:r>
+              <m:t>3</m:t>
+            </m:r>
+          </m:sub>
+        </m:sSub>
+        <m:r>
+          <m:rPr>
+            <m:sty m:val="p"/>
+          </m:rPr>
+          <m:t>(</m:t>
+        </m:r>
+        <m:r>
+          <m:t>ω</m:t>
+        </m:r>
+        <m:r>
+          <m:rPr>
+            <m:sty m:val="p"/>
+          </m:rPr>
+          <m:t>)</m:t>
+        </m:r>
+      </m:oMath>
+      <w:r>
+        <w:t xml:space="preserve"> </w:t>
+      </w:r>
+      <w:r>
+        <w:t xml:space="preserve">is its value when the experiment’s</w:t>
+      </w:r>
+      <w:r>
+        <w:t xml:space="preserve"> </w:t>
+      </w:r>
+      <w:hyperlink r:id="rId35">
+        <w:r>
+          <w:rPr>
+            <w:rStyle w:val="Hyperlink"/>
+          </w:rPr>
+          <w:t xml:space="preserve">outcome</w:t>
+        </w:r>
+      </w:hyperlink>
+      <w:r>
+        <w:t xml:space="preserve"> </w:t>
+      </w:r>
+      <w:r>
+        <w:t xml:space="preserve">is</w:t>
+      </w:r>
+      <w:r>
+        <w:t xml:space="preserve"> </w:t>
+      </w:r>
+      <m:oMath>
+        <m:r>
+          <m:t>ω</m:t>
+        </m:r>
+      </m:oMath>
+      <w:r>
+        <w:t xml:space="preserve">.</w:t>
+      </w:r>
+      <w:r>
+        <w:t xml:space="preserve"> </w:t>
+      </w:r>
+      <w:r>
+        <w:t xml:space="preserve">Holding</w:t>
+      </w:r>
+      <w:r>
+        <w:t xml:space="preserve"> </w:t>
+      </w:r>
+      <m:oMath>
+        <m:r>
+          <m:t>ω</m:t>
+        </m:r>
+      </m:oMath>
+      <w:r>
+        <w:t xml:space="preserve"> </w:t>
+      </w:r>
+      <w:r>
+        <w:t xml:space="preserve">fixed and letting</w:t>
+      </w:r>
+      <w:r>
+        <w:t xml:space="preserve"> </w:t>
+      </w:r>
+      <m:oMath>
+        <m:r>
+          <m:t>t</m:t>
+        </m:r>
+      </m:oMath>
+      <w:r>
+        <w:t xml:space="preserve"> </w:t>
+      </w:r>
+      <w:r>
+        <w:t xml:space="preserve">vary gives the particle’s whole path for that outcome.</w:t>
+      </w:r>
+      <w:r>
+        <w:t xml:space="preserve"> </w:t>
+      </w:r>
+      <w:r>
+        <w:t xml:space="preserve">A source that writes</w:t>
+      </w:r>
+      <w:r>
+        <w:t xml:space="preserve"> </w:t>
+      </w:r>
+      <m:oMath>
+        <m:r>
+          <m:t>X</m:t>
+        </m:r>
+        <m:r>
+          <m:rPr>
+            <m:sty m:val="p"/>
+          </m:rPr>
+          <m:t>(</m:t>
+        </m:r>
+        <m:r>
+          <m:t>t</m:t>
+        </m:r>
+        <m:r>
+          <m:rPr>
+            <m:sty m:val="p"/>
+          </m:rPr>
+          <m:t>,</m:t>
+        </m:r>
+        <m:r>
+          <m:t>ω</m:t>
+        </m:r>
+        <m:r>
+          <m:rPr>
+            <m:sty m:val="p"/>
+          </m:rPr>
+          <m:t>)</m:t>
+        </m:r>
+      </m:oMath>
+      <w:r>
+        <w:t xml:space="preserve"> </w:t>
+      </w:r>
+      <w:r>
+        <w:t xml:space="preserve">means the same thing,</w:t>
+      </w:r>
+      <w:r>
+        <w:t xml:space="preserve"> </w:t>
+      </w:r>
+      <w:r>
+        <w:t xml:space="preserve">with both arguments in parentheses.</w:t>
+      </w:r>
+    </w:p>
+    <w:bookmarkEnd w:id="39"/>
+    <w:bookmarkStart w:id="40" w:name="rem-reading-other-sources"/>
+    <w:p>
+      <w:pPr>
+        <w:pStyle w:val="BodyText"/>
+      </w:pPr>
+      <w:r>
+        <w:rPr>
+          <w:i/>
+          <w:iCs/>
+        </w:rPr>
+        <w:t xml:space="preserve">Remark 3</w:t>
+      </w:r>
+      <w:r>
+        <w:t xml:space="preserve"> (Reading another source’s subscripts and parentheses). </w:t>
+      </w:r>
+      <w:r>
+        <w:t xml:space="preserve">When you read a formula from another source,</w:t>
+      </w:r>
+      <w:r>
+        <w:t xml:space="preserve"> </w:t>
+      </w:r>
+      <w:r>
+        <w:t xml:space="preserve">first work out what each subscript and each argument is doing:</w:t>
+      </w:r>
+      <w:r>
+        <w:t xml:space="preserve"> </w:t>
+      </w:r>
+      <w:r>
+        <w:t xml:space="preserve">labeling a member of an</w:t>
+      </w:r>
+      <w:r>
+        <w:t xml:space="preserve"> </w:t>
+      </w:r>
+      <w:hyperlink r:id="rId28">
+        <w:r>
+          <w:rPr>
+            <w:rStyle w:val="Hyperlink"/>
+          </w:rPr>
+          <w:t xml:space="preserve">indexed family</w:t>
+        </w:r>
+      </w:hyperlink>
+      <w:r>
+        <w:t xml:space="preserve">, or being the input of a</w:t>
+      </w:r>
+      <w:r>
+        <w:t xml:space="preserve"> </w:t>
+      </w:r>
+      <w:hyperlink r:id="rId29">
+        <w:r>
+          <w:rPr>
+            <w:rStyle w:val="Hyperlink"/>
+          </w:rPr>
+          <w:t xml:space="preserve">function</w:t>
+        </w:r>
+      </w:hyperlink>
+      <w:r>
+        <w:t xml:space="preserve">.</w:t>
+      </w:r>
+      <w:r>
+        <w:t xml:space="preserve"> </w:t>
+      </w:r>
+      <w:r>
+        <w:t xml:space="preserve">That tells you which convention the source follows,</w:t>
+      </w:r>
+      <w:r>
+        <w:t xml:space="preserve"> </w:t>
+      </w:r>
+      <w:r>
+        <w:t xml:space="preserve">whatever its layout.</w:t>
+      </w:r>
+    </w:p>
+    <w:bookmarkEnd w:id="40"/>
+    <w:bookmarkEnd w:id="41"/>
+    <w:bookmarkStart w:id="48" w:name="X93a3d4ef5e06a67ae6b891e46b41b74b3674f55"/>
+    <w:p>
+      <w:pPr>
+        <w:pStyle w:val="Heading2"/>
+      </w:pPr>
+      <w:r>
+        <w:t xml:space="preserve">3 Why is notation in probability and statistics so inconsistent and disorganized?</w:t>
+      </w:r>
+    </w:p>
+    <w:p>
+      <w:pPr>
+        <w:pStyle w:val="FirstParagraph"/>
+      </w:pPr>
+      <w:r>
+        <w:t xml:space="preserve">In grad school,</w:t>
+      </w:r>
+      <w:r>
+        <w:t xml:space="preserve"> </w:t>
+      </w:r>
+      <w:r>
+        <w:t xml:space="preserve">we are asked to learn</w:t>
+      </w:r>
+      <w:r>
+        <w:t xml:space="preserve"> </w:t>
+      </w:r>
+      <w:r>
+        <w:t xml:space="preserve">from increasingly disorganized materials and lectures.</w:t>
+      </w:r>
+      <w:r>
+        <w:t xml:space="preserve"> </w:t>
+      </w:r>
+      <w:r>
+        <w:t xml:space="preserve">Not coincidentally,</w:t>
+      </w:r>
+      <w:r>
+        <w:t xml:space="preserve"> </w:t>
+      </w:r>
+      <w:r>
+        <w:t xml:space="preserve">as the amount of organization decreases,</w:t>
+      </w:r>
+      <w:r>
+        <w:t xml:space="preserve"> </w:t>
+      </w:r>
+      <w:r>
+        <w:t xml:space="preserve">the amount of complexity increases,</w:t>
+      </w:r>
+      <w:r>
+        <w:t xml:space="preserve"> </w:t>
+      </w:r>
+      <w:r>
+        <w:t xml:space="preserve">the amount of difficulty increases,</w:t>
+      </w:r>
+      <w:r>
+        <w:t xml:space="preserve"> </w:t>
+      </w:r>
+      <w:r>
+        <w:t xml:space="preserve">the number of reliable references decreases,</w:t>
+      </w:r>
+      <w:r>
+        <w:t xml:space="preserve"> </w:t>
+      </w:r>
+      <w:r>
+        <w:t xml:space="preserve">and the amount of inconsistency in notation and content increases</w:t>
+      </w:r>
+      <w:r>
+        <w:t xml:space="preserve"> </w:t>
+      </w:r>
+      <w:r>
+        <w:t xml:space="preserve">(both between multiple references and within single references!).</w:t>
+      </w:r>
+      <w:r>
+        <w:t xml:space="preserve"> </w:t>
+      </w:r>
+      <w:r>
+        <w:t xml:space="preserve">In other words,</w:t>
+      </w:r>
+      <w:r>
+        <w:t xml:space="preserve"> </w:t>
+      </w:r>
+      <w:r>
+        <w:t xml:space="preserve">as you approach the cutting-edge of most fields,</w:t>
+      </w:r>
+      <w:r>
+        <w:t xml:space="preserve"> </w:t>
+      </w:r>
+      <w:r>
+        <w:t xml:space="preserve">you start to run into content</w:t>
+      </w:r>
+      <w:r>
+        <w:t xml:space="preserve"> </w:t>
+      </w:r>
+      <w:r>
+        <w:t xml:space="preserve">that hasn’t been fully thought through or standardized.</w:t>
+      </w:r>
+      <w:r>
+        <w:t xml:space="preserve"> </w:t>
+      </w:r>
+      <w:r>
+        <w:t xml:space="preserve">This lack of clarity</w:t>
+      </w:r>
+      <w:r>
+        <w:t xml:space="preserve"> </w:t>
+      </w:r>
+      <w:r>
+        <w:t xml:space="preserve">is unfortunate and undesirable,</w:t>
+      </w:r>
+      <w:r>
+        <w:t xml:space="preserve"> </w:t>
+      </w:r>
+      <w:r>
+        <w:t xml:space="preserve">but it is understandable and inevitable.</w:t>
+      </w:r>
+    </w:p>
+    <w:p>
+      <w:pPr>
+        <w:pStyle w:val="BodyText"/>
+      </w:pPr>
+      <w:r>
+        <w:t xml:space="preserve">It’s worth noting</w:t>
+      </w:r>
+      <w:r>
+        <w:t xml:space="preserve"> </w:t>
+      </w:r>
+      <w:r>
+        <w:t xml:space="preserve">that calculus was formalized in the</w:t>
+      </w:r>
+      <w:r>
+        <w:t xml:space="preserve"> </w:t>
+      </w:r>
+      <w:hyperlink r:id="rId42">
+        <w:r>
+          <w:rPr>
+            <w:rStyle w:val="Hyperlink"/>
+          </w:rPr>
+          <w:t xml:space="preserve">1600s</w:t>
+        </w:r>
+      </w:hyperlink>
+      <w:r>
+        <w:t xml:space="preserve">,</w:t>
+      </w:r>
+      <w:r>
+        <w:t xml:space="preserve"> </w:t>
+      </w:r>
+      <w:r>
+        <w:t xml:space="preserve">elementary algebra was formalized around</w:t>
+      </w:r>
+      <w:r>
+        <w:t xml:space="preserve"> </w:t>
+      </w:r>
+      <w:hyperlink r:id="rId43">
+        <w:r>
+          <w:rPr>
+            <w:rStyle w:val="Hyperlink"/>
+          </w:rPr>
+          <w:t xml:space="preserve">820</w:t>
+        </w:r>
+      </w:hyperlink>
+      <w:r>
+        <w:t xml:space="preserve">,</w:t>
+      </w:r>
+      <w:r>
+        <w:t xml:space="preserve"> </w:t>
+      </w:r>
+      <w:r>
+        <w:t xml:space="preserve">and arithmetic</w:t>
+      </w:r>
+      <w:r>
+        <w:t xml:space="preserve"> </w:t>
+      </w:r>
+      <w:hyperlink r:id="rId44">
+        <w:r>
+          <w:rPr>
+            <w:rStyle w:val="Hyperlink"/>
+          </w:rPr>
+          <w:t xml:space="preserve">even earlier</w:t>
+        </w:r>
+      </w:hyperlink>
+      <w:r>
+        <w:t xml:space="preserve">.</w:t>
+      </w:r>
+      <w:r>
+        <w:t xml:space="preserve"> </w:t>
+      </w:r>
+      <w:r>
+        <w:t xml:space="preserve">And calculus still has</w:t>
+      </w:r>
+      <w:r>
+        <w:t xml:space="preserve"> </w:t>
+      </w:r>
+      <w:hyperlink r:id="rId45">
+        <w:r>
+          <w:rPr>
+            <w:rStyle w:val="Hyperlink"/>
+          </w:rPr>
+          <w:t xml:space="preserve">several competing notation systems</w:t>
+        </w:r>
+      </w:hyperlink>
+      <w:r>
+        <w:t xml:space="preserve">.</w:t>
+      </w:r>
+      <w:r>
+        <w:t xml:space="preserve"> </w:t>
+      </w:r>
+      <w:r>
+        <w:t xml:space="preserve">In contrast, the field of statistics only emerged in the</w:t>
+      </w:r>
+      <w:r>
+        <w:t xml:space="preserve"> </w:t>
+      </w:r>
+      <w:hyperlink r:id="rId46">
+        <w:r>
+          <w:rPr>
+            <w:rStyle w:val="Hyperlink"/>
+          </w:rPr>
+          <w:t xml:space="preserve">late 1800s and early 1900s</w:t>
+        </w:r>
+      </w:hyperlink>
+      <w:r>
+        <w:t xml:space="preserve">,</w:t>
+      </w:r>
+      <w:r>
+        <w:t xml:space="preserve"> </w:t>
+      </w:r>
+      <w:r>
+        <w:t xml:space="preserve">so it’s not surprising that the notation and terminology is still developing.</w:t>
+      </w:r>
+      <w:r>
+        <w:t xml:space="preserve"> </w:t>
+      </w:r>
+      <w:r>
+        <w:t xml:space="preserve">Generalized linear models were only formalized in 1972</w:t>
+      </w:r>
+      <w:r>
+        <w:t xml:space="preserve"> </w:t>
+      </w:r>
+      <w:r>
+        <w:t xml:space="preserve">(Nelder and Wedderburn 1972)</w:t>
+      </w:r>
+      <w:r>
+        <w:t xml:space="preserve">,</w:t>
+      </w:r>
+      <w:r>
+        <w:t xml:space="preserve"> </w:t>
+      </w:r>
+      <w:r>
+        <w:t xml:space="preserve">which is very recent in terms of the</w:t>
+      </w:r>
+      <w:r>
+        <w:t xml:space="preserve"> </w:t>
+      </w:r>
+      <w:hyperlink r:id="rId47">
+        <w:r>
+          <w:rPr>
+            <w:rStyle w:val="Hyperlink"/>
+          </w:rPr>
+          <w:t xml:space="preserve">pace of scientific development</w:t>
+        </w:r>
+      </w:hyperlink>
+      <w:r>
+        <w:t xml:space="preserve">.</w:t>
+      </w:r>
+    </w:p>
+    <w:bookmarkEnd w:id="48"/>
+    <w:bookmarkStart w:id="55" w:name="sec-further-reading"/>
+    <w:p>
+      <w:pPr>
+        <w:pStyle w:val="Heading2"/>
+      </w:pPr>
+      <w:r>
+        <w:t xml:space="preserve">4 Further reading</w:t>
+      </w:r>
+    </w:p>
+    <w:p>
+      <w:pPr>
+        <w:pStyle w:val="FirstParagraph"/>
+      </w:pPr>
+      <w:r>
+        <w:t xml:space="preserve">For the logical symbols and proof conventions used in these notes</w:t>
+      </w:r>
+      <w:r>
+        <w:t xml:space="preserve"> </w:t>
+      </w:r>
+      <w:r>
+        <w:t xml:space="preserve">(whose definitions are on the</w:t>
+      </w:r>
+      <w:r>
+        <w:t xml:space="preserve"> </w:t>
+      </w:r>
+      <w:hyperlink r:id="rId49">
+        <w:r>
+          <w:rPr>
+            <w:rStyle w:val="Hyperlink"/>
+          </w:rPr>
+          <w:t xml:space="preserve">Proof Writing</w:t>
+        </w:r>
+      </w:hyperlink>
+      <w:r>
+        <w:t xml:space="preserve"> </w:t>
+      </w:r>
+      <w:r>
+        <w:t xml:space="preserve">page):</w:t>
+      </w:r>
+    </w:p>
+    <w:p>
+      <w:pPr>
+        <w:pStyle w:val="Compact"/>
+        <w:numPr>
+          <w:ilvl w:val="0"/>
+          <w:numId w:val="1002"/>
+        </w:numPr>
+      </w:pPr>
+      <w:r>
+        <w:t xml:space="preserve">Velleman (2019)</w:t>
+      </w:r>
+      <w:r>
+        <w:t xml:space="preserve"> </w:t>
+      </w:r>
+      <w:r>
+        <w:t xml:space="preserve">explains how mathematical statements are built from</w:t>
+      </w:r>
+      <w:r>
+        <w:t xml:space="preserve"> </w:t>
+      </w:r>
+      <w:r>
+        <w:t xml:space="preserve">logical connectives (</w:t>
+      </w:r>
+      <w:hyperlink r:id="rId50">
+        <w:r>
+          <w:rPr>
+            <w:rStyle w:val="Hyperlink"/>
+          </w:rPr>
+          <w:t xml:space="preserve">definition</w:t>
+        </w:r>
+      </w:hyperlink>
+      <w:r>
+        <w:t xml:space="preserve">) and quantifiers (</w:t>
+      </w:r>
+      <w:hyperlink r:id="rId51">
+        <w:r>
+          <w:rPr>
+            <w:rStyle w:val="Hyperlink"/>
+          </w:rPr>
+          <w:t xml:space="preserve">definition</w:t>
+        </w:r>
+      </w:hyperlink>
+      <w:r>
+        <w:t xml:space="preserve">),</w:t>
+      </w:r>
+      <w:r>
+        <w:t xml:space="preserve"> </w:t>
+      </w:r>
+      <w:r>
+        <w:t xml:space="preserve">and how to read and write them.</w:t>
+      </w:r>
+    </w:p>
+    <w:p>
+      <w:pPr>
+        <w:pStyle w:val="Compact"/>
+        <w:numPr>
+          <w:ilvl w:val="0"/>
+          <w:numId w:val="1002"/>
+        </w:numPr>
+      </w:pPr>
+      <w:r>
+        <w:t xml:space="preserve">Barker-Plummer et al. (2011)</w:t>
+      </w:r>
+      <w:r>
+        <w:t xml:space="preserve"> </w:t>
+      </w:r>
+      <w:r>
+        <w:t xml:space="preserve">covers the same symbols as a formal language,</w:t>
+      </w:r>
+      <w:r>
+        <w:t xml:space="preserve"> </w:t>
+      </w:r>
+      <w:r>
+        <w:t xml:space="preserve">with propositional logic (the logic of connectives)</w:t>
+      </w:r>
+      <w:r>
+        <w:t xml:space="preserve"> </w:t>
+      </w:r>
+      <w:r>
+        <w:t xml:space="preserve">and first-order logic (which adds quantifiers).</w:t>
+      </w:r>
+    </w:p>
+    <w:p>
+      <w:pPr>
+        <w:pStyle w:val="FirstParagraph"/>
+      </w:pPr>
+      <w:r>
         <w:t xml:space="preserve">For set and function notation, see the</w:t>
       </w:r>
       <w:r>
         <w:t xml:space="preserve"> </w:t>
       </w:r>
-      <w:hyperlink r:id="rId38">
+      <w:hyperlink r:id="rId52">
         <w:r>
           <w:rPr>
             <w:rStyle w:val="Hyperlink"/>
@@ -2008,7 +4020,7 @@
       <w:r>
         <w:t xml:space="preserve"> </w:t>
       </w:r>
-      <w:hyperlink r:id="rId39">
+      <w:hyperlink r:id="rId53">
         <w:r>
           <w:rPr>
             <w:rStyle w:val="Hyperlink"/>
@@ -2022,7 +4034,7 @@
       <w:r>
         <w:t xml:space="preserve"> </w:t>
       </w:r>
-      <w:hyperlink r:id="rId40">
+      <w:hyperlink r:id="rId54">
         <w:r>
           <w:rPr>
             <w:rStyle w:val="Hyperlink"/>
@@ -2037,8 +4049,8 @@
         <w:t xml:space="preserve">pages.</w:t>
       </w:r>
     </w:p>
-    <w:bookmarkEnd w:id="41"/>
-    <w:bookmarkStart w:id="49" w:name="references"/>
+    <w:bookmarkEnd w:id="55"/>
+    <w:bookmarkStart w:id="63" w:name="references"/>
     <w:p>
       <w:pPr>
         <w:pStyle w:val="Heading2"/>
@@ -2047,8 +4059,8 @@
         <w:t xml:space="preserve">References</w:t>
       </w:r>
     </w:p>
-    <w:bookmarkStart w:id="48" w:name="refs"/>
-    <w:bookmarkStart w:id="43" w:name="ref-barkerplummer2011language"/>
+    <w:bookmarkStart w:id="62" w:name="refs"/>
+    <w:bookmarkStart w:id="57" w:name="ref-barkerplummer2011language"/>
     <w:p>
       <w:pPr>
         <w:pStyle w:val="Bibliography"/>
@@ -2072,7 +4084,7 @@
       <w:r>
         <w:t xml:space="preserve"> </w:t>
       </w:r>
-      <w:hyperlink r:id="rId42">
+      <w:hyperlink r:id="rId56">
         <w:r>
           <w:rPr>
             <w:rStyle w:val="Hyperlink"/>
@@ -2084,8 +4096,8 @@
         <w:t xml:space="preserve">.</w:t>
       </w:r>
     </w:p>
-    <w:bookmarkEnd w:id="43"/>
-    <w:bookmarkStart w:id="45" w:name="ref-nelder1972generalized"/>
+    <w:bookmarkEnd w:id="57"/>
+    <w:bookmarkStart w:id="59" w:name="ref-nelder1972generalized"/>
     <w:p>
       <w:pPr>
         <w:pStyle w:val="Bibliography"/>
@@ -2118,7 +4130,7 @@
       <w:r>
         <w:t xml:space="preserve"> </w:t>
       </w:r>
-      <w:hyperlink r:id="rId44">
+      <w:hyperlink r:id="rId58">
         <w:r>
           <w:rPr>
             <w:rStyle w:val="Hyperlink"/>
@@ -2130,8 +4142,8 @@
         <w:t xml:space="preserve">.</w:t>
       </w:r>
     </w:p>
-    <w:bookmarkEnd w:id="45"/>
-    <w:bookmarkStart w:id="47" w:name="ref-velleman2019prove"/>
+    <w:bookmarkEnd w:id="59"/>
+    <w:bookmarkStart w:id="61" w:name="ref-velleman2019prove"/>
     <w:p>
       <w:pPr>
         <w:pStyle w:val="Bibliography"/>
@@ -2155,7 +4167,7 @@
       <w:r>
         <w:t xml:space="preserve"> </w:t>
       </w:r>
-      <w:hyperlink r:id="rId46">
+      <w:hyperlink r:id="rId60">
         <w:r>
           <w:rPr>
             <w:rStyle w:val="Hyperlink"/>
@@ -2167,9 +4179,9 @@
         <w:t xml:space="preserve">.</w:t>
       </w:r>
     </w:p>
-    <w:bookmarkEnd w:id="47"/>
-    <w:bookmarkEnd w:id="48"/>
-    <w:bookmarkEnd w:id="49"/>
+    <w:bookmarkEnd w:id="61"/>
+    <w:bookmarkEnd w:id="62"/>
+    <w:bookmarkEnd w:id="63"/>
     <w:sectPr>
       <w:footnotePr>
         <w:numRestart w:val="eachSect"/>
@@ -2586,6 +4598,9 @@
     <w:abstractNumId w:val="990"/>
   </w:num>
   <w:num w:numId="1001">
+    <w:abstractNumId w:val="991"/>
+  </w:num>
+  <w:num w:numId="1002">
     <w:abstractNumId w:val="991"/>
   </w:num>
 </w:numbering>

</xml_diff>

<commit_message>
Deploying to gh-pages from @ Morrison-Lab/mds@dc51c7d0472ae6dc2880330537495b2a5cca8674 🚀
</commit_message>
<xml_diff>
--- a/notation.docx
+++ b/notation.docx
@@ -15,7 +15,7 @@
         <w:pStyle w:val="Date"/>
       </w:pPr>
       <w:r>
-        <w:t xml:space="preserve">Last modified: 2026-10-17 15:54:57 (PDT)</w:t>
+        <w:t xml:space="preserve">Last modified: 2026-10-17 22:01:17 (PDT)</w:t>
       </w:r>
     </w:p>
     <w:p>
@@ -1599,7 +1599,7 @@
       </w:r>
     </w:p>
     <w:bookmarkEnd w:id="27"/>
-    <w:bookmarkStart w:id="41" w:name="sec-subscripts-parentheses"/>
+    <w:bookmarkStart w:id="36" w:name="sec-subscripts-parentheses"/>
     <w:p>
       <w:pPr>
         <w:pStyle w:val="Heading2"/>
@@ -1608,7 +1608,7 @@
         <w:t xml:space="preserve">2 Subscripts and parentheses</w:t>
       </w:r>
     </w:p>
-    <w:bookmarkStart w:id="30" w:name="rem-subscript-parentheses-convention"/>
+    <w:bookmarkStart w:id="31" w:name="rem-subscript-parentheses-convention"/>
     <w:p>
       <w:pPr>
         <w:pStyle w:val="FirstParagraph"/>
@@ -1895,22 +1895,27 @@
         <w:t xml:space="preserve"> </w:t>
       </w:r>
       <w:r>
-        <w:t xml:space="preserve">Nothing forces this split.</w:t>
-      </w:r>
-      <w:r>
-        <w:t xml:space="preserve"> </w:t>
-      </w:r>
-      <w:r>
-        <w:t xml:space="preserve">It is a convention for keeping a formula readable,</w:t>
-      </w:r>
-      <w:r>
-        <w:t xml:space="preserve"> </w:t>
-      </w:r>
-      <w:r>
-        <w:t xml:space="preserve">and you will meet the same objects written the other way around.</w:t>
+        <w:t xml:space="preserve">The</w:t>
+      </w:r>
+      <w:r>
+        <w:t xml:space="preserve"> </w:t>
+      </w:r>
+      <w:hyperlink r:id="rId30">
+        <w:r>
+          <w:rPr>
+            <w:rStyle w:val="Hyperlink"/>
+          </w:rPr>
+          <w:t xml:space="preserve">notation choices page</w:t>
+        </w:r>
+      </w:hyperlink>
+      <w:r>
+        <w:t xml:space="preserve"> </w:t>
+      </w:r>
+      <w:r>
+        <w:t xml:space="preserve">gives the reason for this split and explains how to read a source that divides the work differently.</w:t>
       </w:r>
     </w:p>
-    <w:bookmarkEnd w:id="30"/>
+    <w:bookmarkEnd w:id="31"/>
     <w:tbl>
       <w:tblPr>
         <w:tblStyle w:val="Table"/>
@@ -1924,7 +1929,7 @@
       <w:tr>
         <w:tc>
           <w:tcPr/>
-          <w:bookmarkStart w:id="32" w:name="tbl-subscript-parentheses"/>
+          <w:bookmarkStart w:id="33" w:name="tbl-subscript-parentheses"/>
           <w:p>
             <w:pPr>
               <w:jc w:val="center"/>
@@ -2147,7 +2152,7 @@
                   <w:r>
                     <w:t xml:space="preserve"> </w:t>
                   </w:r>
-                  <w:hyperlink r:id="rId31">
+                  <w:hyperlink r:id="rId32">
                     <w:r>
                       <w:rPr>
                         <w:rStyle w:val="Hyperlink"/>
@@ -2848,252 +2853,28 @@
               </w:tc>
             </w:tr>
           </w:tbl>
-          <w:bookmarkEnd w:id="32"/>
+          <w:bookmarkEnd w:id="33"/>
           <w:p/>
         </w:tc>
       </w:tr>
     </w:tbl>
-    <w:bookmarkStart w:id="38" w:name="rem-process-notation"/>
+    <w:bookmarkStart w:id="35" w:name="exm-process-notation"/>
     <w:p>
       <w:pPr>
         <w:pStyle w:val="BodyText"/>
       </w:pPr>
       <w:r>
         <w:rPr>
-          <w:i/>
-          <w:iCs/>
+          <w:b/>
+          <w:bCs/>
         </w:rPr>
-        <w:t xml:space="preserve">Remark 2</w:t>
-      </w:r>
-      <w:r>
-        <w:t xml:space="preserve"> (Subscripts and parentheses for a stochastic process). </w:t>
-      </w:r>
-      <w:r>
-        <w:t xml:space="preserve">The notation for a</w:t>
-      </w:r>
-      <w:r>
-        <w:t xml:space="preserve"> </w:t>
-      </w:r>
-      <w:hyperlink r:id="rId33">
-        <w:r>
-          <w:rPr>
-            <w:rStyle w:val="Hyperlink"/>
-          </w:rPr>
-          <w:t xml:space="preserve">stochastic process</w:t>
-        </w:r>
-      </w:hyperlink>
-      <w:r>
-        <w:t xml:space="preserve"> </w:t>
-      </w:r>
-      <w:r>
-        <w:t xml:space="preserve">uses both slots at once.</w:t>
-      </w:r>
-      <w:r>
-        <w:t xml:space="preserve"> </w:t>
-      </w:r>
-      <w:r>
-        <w:t xml:space="preserve">A stochastic process is an</w:t>
-      </w:r>
-      <w:r>
-        <w:t xml:space="preserve"> </w:t>
-      </w:r>
-      <w:hyperlink r:id="rId28">
-        <w:r>
-          <w:rPr>
-            <w:rStyle w:val="Hyperlink"/>
-          </w:rPr>
-          <w:t xml:space="preserve">indexed family</w:t>
-        </w:r>
-      </w:hyperlink>
-      <w:r>
-        <w:t xml:space="preserve"> </w:t>
-      </w:r>
-      <w:r>
-        <w:t xml:space="preserve">of</w:t>
-      </w:r>
-      <w:r>
-        <w:t xml:space="preserve"> </w:t>
-      </w:r>
-      <w:hyperlink r:id="rId14">
-        <w:r>
-          <w:rPr>
-            <w:rStyle w:val="Hyperlink"/>
-          </w:rPr>
-          <w:t xml:space="preserve">random variables</w:t>
-        </w:r>
-      </w:hyperlink>
-      <w:r>
-        <w:t xml:space="preserve"> </w:t>
-      </w:r>
-      <m:oMath>
-        <m:sSub>
-          <m:e>
-            <m:r>
-              <m:t>X</m:t>
-            </m:r>
-          </m:e>
-          <m:sub>
-            <m:r>
-              <m:t>t</m:t>
-            </m:r>
-          </m:sub>
-        </m:sSub>
-      </m:oMath>
-      <w:r>
-        <w:t xml:space="preserve">,</w:t>
-      </w:r>
-      <w:r>
-        <w:t xml:space="preserve"> </w:t>
-      </w:r>
-      <w:r>
-        <w:t xml:space="preserve">one for each index</w:t>
-      </w:r>
-      <w:r>
-        <w:t xml:space="preserve"> </w:t>
-      </w:r>
-      <m:oMath>
-        <m:r>
-          <m:t>t</m:t>
-        </m:r>
-      </m:oMath>
-      <w:r>
-        <w:t xml:space="preserve"> </w:t>
-      </w:r>
-      <w:r>
-        <w:t xml:space="preserve">in some</w:t>
-      </w:r>
-      <w:r>
-        <w:t xml:space="preserve"> </w:t>
-      </w:r>
-      <w:hyperlink r:id="rId34">
-        <w:r>
-          <w:rPr>
-            <w:rStyle w:val="Hyperlink"/>
-          </w:rPr>
-          <w:t xml:space="preserve">index set</w:t>
-        </w:r>
-      </w:hyperlink>
-      <w:r>
-        <w:t xml:space="preserve">, such as time.</w:t>
-      </w:r>
-      <w:r>
-        <w:t xml:space="preserve"> </w:t>
-      </w:r>
-      <w:r>
-        <w:t xml:space="preserve">The index goes in the subscript, because it picks a member of the family.</w:t>
-      </w:r>
-      <w:r>
-        <w:t xml:space="preserve"> </w:t>
-      </w:r>
-      <w:r>
-        <w:t xml:space="preserve">Each</w:t>
-      </w:r>
-      <w:r>
-        <w:t xml:space="preserve"> </w:t>
-      </w:r>
-      <m:oMath>
-        <m:sSub>
-          <m:e>
-            <m:r>
-              <m:t>X</m:t>
-            </m:r>
-          </m:e>
-          <m:sub>
-            <m:r>
-              <m:t>t</m:t>
-            </m:r>
-          </m:sub>
-        </m:sSub>
-      </m:oMath>
-      <w:r>
-        <w:t xml:space="preserve"> </w:t>
-      </w:r>
-      <w:r>
-        <w:t xml:space="preserve">is itself a</w:t>
-      </w:r>
-      <w:r>
-        <w:t xml:space="preserve"> </w:t>
-      </w:r>
-      <w:hyperlink r:id="rId29">
-        <w:r>
-          <w:rPr>
-            <w:rStyle w:val="Hyperlink"/>
-          </w:rPr>
-          <w:t xml:space="preserve">function</w:t>
-        </w:r>
-      </w:hyperlink>
-      <w:r>
-        <w:t xml:space="preserve"> </w:t>
-      </w:r>
-      <w:r>
-        <w:t xml:space="preserve">of the</w:t>
-      </w:r>
-      <w:r>
-        <w:t xml:space="preserve"> </w:t>
-      </w:r>
-      <w:hyperlink r:id="rId35">
-        <w:r>
-          <w:rPr>
-            <w:rStyle w:val="Hyperlink"/>
-          </w:rPr>
-          <w:t xml:space="preserve">outcome</w:t>
-        </w:r>
-      </w:hyperlink>
-      <w:r>
-        <w:t xml:space="preserve"> </w:t>
-      </w:r>
-      <m:oMath>
-        <m:r>
-          <m:t>ω</m:t>
-        </m:r>
-      </m:oMath>
-      <w:r>
-        <w:t xml:space="preserve"> </w:t>
-      </w:r>
-      <w:r>
-        <w:t xml:space="preserve">of a</w:t>
-      </w:r>
-      <w:r>
-        <w:t xml:space="preserve"> </w:t>
-      </w:r>
-      <w:hyperlink r:id="rId36">
-        <w:r>
-          <w:rPr>
-            <w:rStyle w:val="Hyperlink"/>
-          </w:rPr>
-          <w:t xml:space="preserve">random experiment</w:t>
-        </w:r>
-      </w:hyperlink>
-      <w:r>
-        <w:t xml:space="preserve">,</w:t>
-      </w:r>
-      <w:r>
-        <w:t xml:space="preserve"> </w:t>
-      </w:r>
-      <w:r>
-        <w:t xml:space="preserve">that is, an element of the</w:t>
-      </w:r>
-      <w:r>
-        <w:t xml:space="preserve"> </w:t>
-      </w:r>
-      <w:hyperlink r:id="rId37">
-        <w:r>
-          <w:rPr>
-            <w:rStyle w:val="Hyperlink"/>
-          </w:rPr>
-          <w:t xml:space="preserve">sample space</w:t>
-        </w:r>
-      </w:hyperlink>
-      <w:r>
-        <w:t xml:space="preserve">,</w:t>
-      </w:r>
-      <w:r>
-        <w:t xml:space="preserve"> </w:t>
-      </w:r>
-      <w:r>
-        <w:t xml:space="preserve">so the outcome goes in the parentheses:</w:t>
-      </w:r>
-      <w:r>
+        <w:t xml:space="preserve">Example 1 (Reading</w:t>
+      </w:r>
+      <w:r>
+        <w:rPr>
+          <w:b/>
+          <w:bCs/>
+        </w:rPr>
         <w:t xml:space="preserve"> </w:t>
       </w:r>
       <m:oMath>
@@ -3126,176 +2907,6 @@
         </m:r>
       </m:oMath>
       <w:r>
-        <w:t xml:space="preserve">.</w:t>
-      </w:r>
-      <w:r>
-        <w:t xml:space="preserve"> </w:t>
-      </w:r>
-      <w:r>
-        <w:t xml:space="preserve">Fixing</w:t>
-      </w:r>
-      <w:r>
-        <w:t xml:space="preserve"> </w:t>
-      </w:r>
-      <m:oMath>
-        <m:r>
-          <m:t>ω</m:t>
-        </m:r>
-      </m:oMath>
-      <w:r>
-        <w:t xml:space="preserve"> </w:t>
-      </w:r>
-      <w:r>
-        <w:t xml:space="preserve">and letting</w:t>
-      </w:r>
-      <w:r>
-        <w:t xml:space="preserve"> </w:t>
-      </w:r>
-      <m:oMath>
-        <m:r>
-          <m:t>t</m:t>
-        </m:r>
-      </m:oMath>
-      <w:r>
-        <w:t xml:space="preserve"> </w:t>
-      </w:r>
-      <w:r>
-        <w:t xml:space="preserve">vary traces out one path of the process.</w:t>
-      </w:r>
-      <w:r>
-        <w:t xml:space="preserve"> </w:t>
-      </w:r>
-      <w:r>
-        <w:t xml:space="preserve">Many sources drop</w:t>
-      </w:r>
-      <w:r>
-        <w:t xml:space="preserve"> </w:t>
-      </w:r>
-      <m:oMath>
-        <m:r>
-          <m:t>ω</m:t>
-        </m:r>
-      </m:oMath>
-      <w:r>
-        <w:t xml:space="preserve"> </w:t>
-      </w:r>
-      <w:r>
-        <w:t xml:space="preserve">and write</w:t>
-      </w:r>
-      <w:r>
-        <w:t xml:space="preserve"> </w:t>
-      </w:r>
-      <m:oMath>
-        <m:sSub>
-          <m:e>
-            <m:r>
-              <m:t>X</m:t>
-            </m:r>
-          </m:e>
-          <m:sub>
-            <m:r>
-              <m:t>t</m:t>
-            </m:r>
-          </m:sub>
-        </m:sSub>
-      </m:oMath>
-      <w:r>
-        <w:t xml:space="preserve">, or write</w:t>
-      </w:r>
-      <w:r>
-        <w:t xml:space="preserve"> </w:t>
-      </w:r>
-      <m:oMath>
-        <m:r>
-          <m:t>X</m:t>
-        </m:r>
-        <m:r>
-          <m:rPr>
-            <m:sty m:val="p"/>
-          </m:rPr>
-          <m:t>(</m:t>
-        </m:r>
-        <m:r>
-          <m:t>t</m:t>
-        </m:r>
-        <m:r>
-          <m:rPr>
-            <m:sty m:val="p"/>
-          </m:rPr>
-          <m:t>)</m:t>
-        </m:r>
-      </m:oMath>
-      <w:r>
-        <w:t xml:space="preserve"> </w:t>
-      </w:r>
-      <w:r>
-        <w:t xml:space="preserve">when</w:t>
-      </w:r>
-      <w:r>
-        <w:t xml:space="preserve"> </w:t>
-      </w:r>
-      <m:oMath>
-        <m:r>
-          <m:t>t</m:t>
-        </m:r>
-      </m:oMath>
-      <w:r>
-        <w:t xml:space="preserve"> </w:t>
-      </w:r>
-      <w:r>
-        <w:t xml:space="preserve">is continuous.</w:t>
-      </w:r>
-    </w:p>
-    <w:bookmarkEnd w:id="38"/>
-    <w:bookmarkStart w:id="39" w:name="exm-process-notation"/>
-    <w:p>
-      <w:pPr>
-        <w:pStyle w:val="BodyText"/>
-      </w:pPr>
-      <w:r>
-        <w:rPr>
-          <w:b/>
-          <w:bCs/>
-        </w:rPr>
-        <w:t xml:space="preserve">Example 1 (Reading</w:t>
-      </w:r>
-      <w:r>
-        <w:rPr>
-          <w:b/>
-          <w:bCs/>
-        </w:rPr>
-        <w:t xml:space="preserve"> </w:t>
-      </w:r>
-      <m:oMath>
-        <m:sSub>
-          <m:e>
-            <m:r>
-              <m:t>X</m:t>
-            </m:r>
-          </m:e>
-          <m:sub>
-            <m:r>
-              <m:t>t</m:t>
-            </m:r>
-          </m:sub>
-        </m:sSub>
-        <m:r>
-          <m:rPr>
-            <m:sty m:val="p"/>
-          </m:rPr>
-          <m:t>(</m:t>
-        </m:r>
-        <m:r>
-          <m:t>ω</m:t>
-        </m:r>
-        <m:r>
-          <m:rPr>
-            <m:sty m:val="p"/>
-          </m:rPr>
-          <m:t>)</m:t>
-        </m:r>
-      </m:oMath>
-      <w:r>
         <w:rPr>
           <w:b/>
           <w:bCs/>
@@ -3427,7 +3038,7 @@
       <w:r>
         <w:t xml:space="preserve"> </w:t>
       </w:r>
-      <w:hyperlink r:id="rId35">
+      <w:hyperlink r:id="rId34">
         <w:r>
           <w:rPr>
             <w:rStyle w:val="Hyperlink"/>
@@ -3537,81 +3148,9 @@
         <w:t xml:space="preserve">with both arguments in parentheses.</w:t>
       </w:r>
     </w:p>
-    <w:bookmarkEnd w:id="39"/>
-    <w:bookmarkStart w:id="40" w:name="rem-reading-other-sources"/>
-    <w:p>
-      <w:pPr>
-        <w:pStyle w:val="BodyText"/>
-      </w:pPr>
-      <w:r>
-        <w:rPr>
-          <w:i/>
-          <w:iCs/>
-        </w:rPr>
-        <w:t xml:space="preserve">Remark 3</w:t>
-      </w:r>
-      <w:r>
-        <w:t xml:space="preserve"> (Reading another source’s subscripts and parentheses). </w:t>
-      </w:r>
-      <w:r>
-        <w:t xml:space="preserve">When you read a formula from another source,</w:t>
-      </w:r>
-      <w:r>
-        <w:t xml:space="preserve"> </w:t>
-      </w:r>
-      <w:r>
-        <w:t xml:space="preserve">first work out what each subscript and each argument is doing:</w:t>
-      </w:r>
-      <w:r>
-        <w:t xml:space="preserve"> </w:t>
-      </w:r>
-      <w:r>
-        <w:t xml:space="preserve">labeling a member of an</w:t>
-      </w:r>
-      <w:r>
-        <w:t xml:space="preserve"> </w:t>
-      </w:r>
-      <w:hyperlink r:id="rId28">
-        <w:r>
-          <w:rPr>
-            <w:rStyle w:val="Hyperlink"/>
-          </w:rPr>
-          <w:t xml:space="preserve">indexed family</w:t>
-        </w:r>
-      </w:hyperlink>
-      <w:r>
-        <w:t xml:space="preserve">, or being the input of a</w:t>
-      </w:r>
-      <w:r>
-        <w:t xml:space="preserve"> </w:t>
-      </w:r>
-      <w:hyperlink r:id="rId29">
-        <w:r>
-          <w:rPr>
-            <w:rStyle w:val="Hyperlink"/>
-          </w:rPr>
-          <w:t xml:space="preserve">function</w:t>
-        </w:r>
-      </w:hyperlink>
-      <w:r>
-        <w:t xml:space="preserve">.</w:t>
-      </w:r>
-      <w:r>
-        <w:t xml:space="preserve"> </w:t>
-      </w:r>
-      <w:r>
-        <w:t xml:space="preserve">That tells you which convention the source follows,</w:t>
-      </w:r>
-      <w:r>
-        <w:t xml:space="preserve"> </w:t>
-      </w:r>
-      <w:r>
-        <w:t xml:space="preserve">whatever its layout.</w:t>
-      </w:r>
-    </w:p>
-    <w:bookmarkEnd w:id="40"/>
-    <w:bookmarkEnd w:id="41"/>
-    <w:bookmarkStart w:id="48" w:name="X93a3d4ef5e06a67ae6b891e46b41b74b3674f55"/>
+    <w:bookmarkEnd w:id="35"/>
+    <w:bookmarkEnd w:id="36"/>
+    <w:bookmarkStart w:id="43" w:name="X93a3d4ef5e06a67ae6b891e46b41b74b3674f55"/>
     <w:p>
       <w:pPr>
         <w:pStyle w:val="Heading2"/>
@@ -3740,7 +3279,7 @@
       <w:r>
         <w:t xml:space="preserve"> </w:t>
       </w:r>
-      <w:hyperlink r:id="rId42">
+      <w:hyperlink r:id="rId37">
         <w:r>
           <w:rPr>
             <w:rStyle w:val="Hyperlink"/>
@@ -3760,7 +3299,7 @@
       <w:r>
         <w:t xml:space="preserve"> </w:t>
       </w:r>
-      <w:hyperlink r:id="rId43">
+      <w:hyperlink r:id="rId38">
         <w:r>
           <w:rPr>
             <w:rStyle w:val="Hyperlink"/>
@@ -3780,7 +3319,7 @@
       <w:r>
         <w:t xml:space="preserve"> </w:t>
       </w:r>
-      <w:hyperlink r:id="rId44">
+      <w:hyperlink r:id="rId39">
         <w:r>
           <w:rPr>
             <w:rStyle w:val="Hyperlink"/>
@@ -3800,7 +3339,7 @@
       <w:r>
         <w:t xml:space="preserve"> </w:t>
       </w:r>
-      <w:hyperlink r:id="rId45">
+      <w:hyperlink r:id="rId40">
         <w:r>
           <w:rPr>
             <w:rStyle w:val="Hyperlink"/>
@@ -3820,7 +3359,7 @@
       <w:r>
         <w:t xml:space="preserve"> </w:t>
       </w:r>
-      <w:hyperlink r:id="rId46">
+      <w:hyperlink r:id="rId41">
         <w:r>
           <w:rPr>
             <w:rStyle w:val="Hyperlink"/>
@@ -3861,7 +3400,7 @@
       <w:r>
         <w:t xml:space="preserve"> </w:t>
       </w:r>
-      <w:hyperlink r:id="rId47">
+      <w:hyperlink r:id="rId42">
         <w:r>
           <w:rPr>
             <w:rStyle w:val="Hyperlink"/>
@@ -3873,8 +3412,8 @@
         <w:t xml:space="preserve">.</w:t>
       </w:r>
     </w:p>
-    <w:bookmarkEnd w:id="48"/>
-    <w:bookmarkStart w:id="55" w:name="sec-further-reading"/>
+    <w:bookmarkEnd w:id="43"/>
+    <w:bookmarkStart w:id="50" w:name="sec-further-reading"/>
     <w:p>
       <w:pPr>
         <w:pStyle w:val="Heading2"/>
@@ -3899,7 +3438,7 @@
       <w:r>
         <w:t xml:space="preserve"> </w:t>
       </w:r>
-      <w:hyperlink r:id="rId49">
+      <w:hyperlink r:id="rId44">
         <w:r>
           <w:rPr>
             <w:rStyle w:val="Hyperlink"/>
@@ -3937,7 +3476,7 @@
       <w:r>
         <w:t xml:space="preserve">logical connectives (</w:t>
       </w:r>
-      <w:hyperlink r:id="rId50">
+      <w:hyperlink r:id="rId45">
         <w:r>
           <w:rPr>
             <w:rStyle w:val="Hyperlink"/>
@@ -3948,7 +3487,7 @@
       <w:r>
         <w:t xml:space="preserve">) and quantifiers (</w:t>
       </w:r>
-      <w:hyperlink r:id="rId51">
+      <w:hyperlink r:id="rId46">
         <w:r>
           <w:rPr>
             <w:rStyle w:val="Hyperlink"/>
@@ -4006,7 +3545,7 @@
       <w:r>
         <w:t xml:space="preserve"> </w:t>
       </w:r>
-      <w:hyperlink r:id="rId52">
+      <w:hyperlink r:id="rId47">
         <w:r>
           <w:rPr>
             <w:rStyle w:val="Hyperlink"/>
@@ -4020,7 +3559,7 @@
       <w:r>
         <w:t xml:space="preserve"> </w:t>
       </w:r>
-      <w:hyperlink r:id="rId53">
+      <w:hyperlink r:id="rId48">
         <w:r>
           <w:rPr>
             <w:rStyle w:val="Hyperlink"/>
@@ -4034,7 +3573,7 @@
       <w:r>
         <w:t xml:space="preserve"> </w:t>
       </w:r>
-      <w:hyperlink r:id="rId54">
+      <w:hyperlink r:id="rId49">
         <w:r>
           <w:rPr>
             <w:rStyle w:val="Hyperlink"/>
@@ -4049,8 +3588,8 @@
         <w:t xml:space="preserve">pages.</w:t>
       </w:r>
     </w:p>
-    <w:bookmarkEnd w:id="55"/>
-    <w:bookmarkStart w:id="63" w:name="references"/>
+    <w:bookmarkEnd w:id="50"/>
+    <w:bookmarkStart w:id="58" w:name="references"/>
     <w:p>
       <w:pPr>
         <w:pStyle w:val="Heading2"/>
@@ -4059,8 +3598,8 @@
         <w:t xml:space="preserve">References</w:t>
       </w:r>
     </w:p>
-    <w:bookmarkStart w:id="62" w:name="refs"/>
-    <w:bookmarkStart w:id="57" w:name="ref-barkerplummer2011language"/>
+    <w:bookmarkStart w:id="57" w:name="refs"/>
+    <w:bookmarkStart w:id="52" w:name="ref-barkerplummer2011language"/>
     <w:p>
       <w:pPr>
         <w:pStyle w:val="Bibliography"/>
@@ -4084,7 +3623,7 @@
       <w:r>
         <w:t xml:space="preserve"> </w:t>
       </w:r>
-      <w:hyperlink r:id="rId56">
+      <w:hyperlink r:id="rId51">
         <w:r>
           <w:rPr>
             <w:rStyle w:val="Hyperlink"/>
@@ -4096,8 +3635,8 @@
         <w:t xml:space="preserve">.</w:t>
       </w:r>
     </w:p>
-    <w:bookmarkEnd w:id="57"/>
-    <w:bookmarkStart w:id="59" w:name="ref-nelder1972generalized"/>
+    <w:bookmarkEnd w:id="52"/>
+    <w:bookmarkStart w:id="54" w:name="ref-nelder1972generalized"/>
     <w:p>
       <w:pPr>
         <w:pStyle w:val="Bibliography"/>
@@ -4130,7 +3669,7 @@
       <w:r>
         <w:t xml:space="preserve"> </w:t>
       </w:r>
-      <w:hyperlink r:id="rId58">
+      <w:hyperlink r:id="rId53">
         <w:r>
           <w:rPr>
             <w:rStyle w:val="Hyperlink"/>
@@ -4142,8 +3681,8 @@
         <w:t xml:space="preserve">.</w:t>
       </w:r>
     </w:p>
-    <w:bookmarkEnd w:id="59"/>
-    <w:bookmarkStart w:id="61" w:name="ref-velleman2019prove"/>
+    <w:bookmarkEnd w:id="54"/>
+    <w:bookmarkStart w:id="56" w:name="ref-velleman2019prove"/>
     <w:p>
       <w:pPr>
         <w:pStyle w:val="Bibliography"/>
@@ -4167,7 +3706,7 @@
       <w:r>
         <w:t xml:space="preserve"> </w:t>
       </w:r>
-      <w:hyperlink r:id="rId60">
+      <w:hyperlink r:id="rId55">
         <w:r>
           <w:rPr>
             <w:rStyle w:val="Hyperlink"/>
@@ -4179,9 +3718,9 @@
         <w:t xml:space="preserve">.</w:t>
       </w:r>
     </w:p>
-    <w:bookmarkEnd w:id="61"/>
-    <w:bookmarkEnd w:id="62"/>
-    <w:bookmarkEnd w:id="63"/>
+    <w:bookmarkEnd w:id="56"/>
+    <w:bookmarkEnd w:id="57"/>
+    <w:bookmarkEnd w:id="58"/>
     <w:sectPr>
       <w:footnotePr>
         <w:numRestart w:val="eachSect"/>

</xml_diff>

<commit_message>
Deploying to gh-pages from @ Morrison-Lab/mds@38539244e61395d0f6079da20ab5e80f5f083477 🚀
</commit_message>
<xml_diff>
--- a/notation.docx
+++ b/notation.docx
@@ -15,7 +15,7 @@
         <w:pStyle w:val="Date"/>
       </w:pPr>
       <w:r>
-        <w:t xml:space="preserve">Last modified: 2026-10-26 10:13:13 (PDT)</w:t>
+        <w:t xml:space="preserve">Last modified: 2026-10-26 12:55:55 (PDT)</w:t>
       </w:r>
     </w:p>
     <w:p>
@@ -1601,7 +1601,7 @@
       </w:r>
     </w:p>
     <w:bookmarkEnd w:id="27"/>
-    <w:bookmarkStart w:id="36" w:name="sec-subscripts-parentheses"/>
+    <w:bookmarkStart w:id="35" w:name="sec-subscripts-parentheses"/>
     <w:p>
       <w:pPr>
         <w:pStyle w:val="Heading2"/>
@@ -1918,949 +1918,32 @@
       </w:r>
     </w:p>
     <w:bookmarkEnd w:id="31"/>
-    <w:tbl>
-      <w:tblPr>
-        <w:tblStyle w:val="Table"/>
-        <w:tblW w:type="pct" w:w="5000"/>
-        <w:tblLayout w:type="fixed"/>
-        <w:tblLook w:firstRow="0" w:lastRow="0" w:firstColumn="0" w:lastColumn="0" w:noHBand="0" w:noVBand="0" w:val="0000"/>
-      </w:tblPr>
-      <w:tblGrid>
-        <w:gridCol w:w="7920"/>
-      </w:tblGrid>
-      <w:tr>
-        <w:tc>
-          <w:tcPr/>
-          <w:bookmarkStart w:id="33" w:name="tbl-subscript-parentheses"/>
-          <w:p>
-            <w:pPr>
-              <w:jc w:val="center"/>
-            </w:pPr>
-            <w:pPr>
-              <w:jc w:val="left"/>
-              <w:spacing w:before="200"/>
-              <w:pStyle w:val="ImageCaption"/>
-            </w:pPr>
-            <w:r>
-              <w:t xml:space="preserve">Table 2: Subscripts and parentheses in these notes, and the alternatives</w:t>
-            </w:r>
-          </w:p>
-          <w:tbl>
-            <w:tblPr>
-              <w:tblStyle w:val="Table"/>
-              <w:tblW w:type="pct" w:w="5000"/>
-              <w:tblLayout w:type="fixed"/>
-              <w:tblLook w:firstRow="1" w:lastRow="0" w:firstColumn="0" w:lastColumn="0" w:noHBand="0" w:noVBand="0" w:val="0020"/>
-            </w:tblPr>
-            <w:tblGrid>
-              <w:gridCol w:w="2640"/>
-              <w:gridCol w:w="2640"/>
-              <w:gridCol w:w="2640"/>
-            </w:tblGrid>
-            <w:tr>
-              <w:trPr>
-                <w:tblHeader w:val="on"/>
-              </w:trPr>
-              <w:tc>
-                <w:tcPr/>
-                <w:p>
-                  <w:pPr>
-                    <w:pStyle w:val="Compact"/>
-                    <w:jc w:val="center"/>
-                  </w:pPr>
-                  <w:r>
-                    <w:t xml:space="preserve">object</w:t>
-                  </w:r>
-                </w:p>
-              </w:tc>
-              <w:tc>
-                <w:tcPr/>
-                <w:p>
-                  <w:pPr>
-                    <w:pStyle w:val="Compact"/>
-                    <w:jc w:val="center"/>
-                  </w:pPr>
-                  <w:r>
-                    <w:t xml:space="preserve">our form</w:t>
-                  </w:r>
-                </w:p>
-              </w:tc>
-              <w:tc>
-                <w:tcPr/>
-                <w:p>
-                  <w:pPr>
-                    <w:pStyle w:val="Compact"/>
-                    <w:jc w:val="center"/>
-                  </w:pPr>
-                  <w:r>
-                    <w:t xml:space="preserve">other forms you may meet</w:t>
-                  </w:r>
-                </w:p>
-              </w:tc>
-            </w:tr>
-            <w:tr>
-              <w:tc>
-                <w:tcPr/>
-                <w:p>
-                  <w:pPr>
-                    <w:pStyle w:val="Compact"/>
-                    <w:jc w:val="center"/>
-                  </w:pPr>
-                  <w:r>
-                    <w:t xml:space="preserve">entry of a vector or matrix</w:t>
-                  </w:r>
-                </w:p>
-              </w:tc>
-              <w:tc>
-                <w:tcPr/>
-                <w:p>
-                  <w:pPr>
-                    <w:pStyle w:val="Compact"/>
-                    <w:jc w:val="center"/>
-                  </w:pPr>
-                  <m:oMath>
-                    <m:sSub>
-                      <m:e>
-                        <m:r>
-                          <m:t>x</m:t>
-                        </m:r>
-                      </m:e>
-                      <m:sub>
-                        <m:r>
-                          <m:t>i</m:t>
-                        </m:r>
-                      </m:sub>
-                    </m:sSub>
-                  </m:oMath>
-                  <w:r>
-                    <w:t xml:space="preserve">,</w:t>
-                  </w:r>
-                  <w:r>
-                    <w:t xml:space="preserve"> </w:t>
-                  </w:r>
-                  <m:oMath>
-                    <m:sSub>
-                      <m:e>
-                        <m:r>
-                          <m:t>A</m:t>
-                        </m:r>
-                      </m:e>
-                      <m:sub>
-                        <m:r>
-                          <m:t>i</m:t>
-                        </m:r>
-                        <m:r>
-                          <m:t>j</m:t>
-                        </m:r>
-                      </m:sub>
-                    </m:sSub>
-                  </m:oMath>
-                </w:p>
-              </w:tc>
-              <w:tc>
-                <w:tcPr/>
-                <w:p>
-                  <w:pPr>
-                    <w:pStyle w:val="Compact"/>
-                    <w:jc w:val="center"/>
-                  </w:pPr>
-                  <m:oMath>
-                    <m:r>
-                      <m:t>x</m:t>
-                    </m:r>
-                    <m:r>
-                      <m:rPr>
-                        <m:sty m:val="p"/>
-                      </m:rPr>
-                      <m:t>(</m:t>
-                    </m:r>
-                    <m:r>
-                      <m:t>i</m:t>
-                    </m:r>
-                    <m:r>
-                      <m:rPr>
-                        <m:sty m:val="p"/>
-                      </m:rPr>
-                      <m:t>)</m:t>
-                    </m:r>
-                  </m:oMath>
-                  <w:r>
-                    <w:t xml:space="preserve">,</w:t>
-                  </w:r>
-                  <w:r>
-                    <w:t xml:space="preserve"> </w:t>
-                  </w:r>
-                  <m:oMath>
-                    <m:r>
-                      <m:t>A</m:t>
-                    </m:r>
-                    <m:r>
-                      <m:rPr>
-                        <m:sty m:val="p"/>
-                      </m:rPr>
-                      <m:t>(</m:t>
-                    </m:r>
-                    <m:r>
-                      <m:t>i</m:t>
-                    </m:r>
-                    <m:r>
-                      <m:rPr>
-                        <m:sty m:val="p"/>
-                      </m:rPr>
-                      <m:t>,</m:t>
-                    </m:r>
-                    <m:r>
-                      <m:t>j</m:t>
-                    </m:r>
-                    <m:r>
-                      <m:rPr>
-                        <m:sty m:val="p"/>
-                      </m:rPr>
-                      <m:t>)</m:t>
-                    </m:r>
-                  </m:oMath>
-                  <w:r>
-                    <w:t xml:space="preserve">, and</w:t>
-                  </w:r>
-                  <w:r>
-                    <w:t xml:space="preserve"> </w:t>
-                  </w:r>
-                  <w:r>
-                    <w:rPr>
-                      <w:rStyle w:val="VerbatimChar"/>
-                    </w:rPr>
-                    <w:t xml:space="preserve">A[i, j]</w:t>
-                  </w:r>
-                  <w:r>
-                    <w:t xml:space="preserve"> </w:t>
-                  </w:r>
-                  <w:r>
-                    <w:t xml:space="preserve">in code</w:t>
-                  </w:r>
-                </w:p>
-              </w:tc>
-            </w:tr>
-            <w:tr>
-              <w:tc>
-                <w:tcPr/>
-                <w:p>
-                  <w:pPr>
-                    <w:pStyle w:val="Compact"/>
-                    <w:jc w:val="center"/>
-                  </w:pPr>
-                  <w:r>
-                    <w:t xml:space="preserve">term of a</w:t>
-                  </w:r>
-                  <w:r>
-                    <w:t xml:space="preserve"> </w:t>
-                  </w:r>
-                  <w:hyperlink r:id="rId32">
-                    <w:r>
-                      <w:rPr>
-                        <w:rStyle w:val="Hyperlink"/>
-                      </w:rPr>
-                      <w:t xml:space="preserve">sequence</w:t>
-                    </w:r>
-                  </w:hyperlink>
-                </w:p>
-              </w:tc>
-              <w:tc>
-                <w:tcPr/>
-                <w:p>
-                  <w:pPr>
-                    <w:pStyle w:val="Compact"/>
-                    <w:jc w:val="center"/>
-                  </w:pPr>
-                  <m:oMath>
-                    <m:sSub>
-                      <m:e>
-                        <m:r>
-                          <m:t>a</m:t>
-                        </m:r>
-                      </m:e>
-                      <m:sub>
-                        <m:r>
-                          <m:t>n</m:t>
-                        </m:r>
-                      </m:sub>
-                    </m:sSub>
-                  </m:oMath>
-                  <w:r>
-                    <w:t xml:space="preserve">​</w:t>
-                  </w:r>
-                </w:p>
-              </w:tc>
-              <w:tc>
-                <w:tcPr/>
-                <w:p>
-                  <w:pPr>
-                    <w:pStyle w:val="Compact"/>
-                    <w:jc w:val="center"/>
-                  </w:pPr>
-                  <m:oMath>
-                    <m:r>
-                      <m:t>a</m:t>
-                    </m:r>
-                    <m:r>
-                      <m:rPr>
-                        <m:sty m:val="p"/>
-                      </m:rPr>
-                      <m:t>(</m:t>
-                    </m:r>
-                    <m:r>
-                      <m:t>n</m:t>
-                    </m:r>
-                    <m:r>
-                      <m:rPr>
-                        <m:sty m:val="p"/>
-                      </m:rPr>
-                      <m:t>)</m:t>
-                    </m:r>
-                  </m:oMath>
-                  <w:r>
-                    <w:t xml:space="preserve">​</w:t>
-                  </w:r>
-                </w:p>
-              </w:tc>
-            </w:tr>
-            <w:tr>
-              <w:tc>
-                <w:tcPr/>
-                <w:p>
-                  <w:pPr>
-                    <w:pStyle w:val="Compact"/>
-                    <w:jc w:val="center"/>
-                  </w:pPr>
-                  <w:r>
-                    <w:t xml:space="preserve">function with a parameter</w:t>
-                  </w:r>
-                </w:p>
-              </w:tc>
-              <w:tc>
-                <w:tcPr/>
-                <w:p>
-                  <w:pPr>
-                    <w:pStyle w:val="Compact"/>
-                    <w:jc w:val="center"/>
-                  </w:pPr>
-                  <m:oMath>
-                    <m:sSub>
-                      <m:e>
-                        <m:r>
-                          <m:t>f</m:t>
-                        </m:r>
-                      </m:e>
-                      <m:sub>
-                        <m:r>
-                          <m:t>θ</m:t>
-                        </m:r>
-                      </m:sub>
-                    </m:sSub>
-                    <m:r>
-                      <m:rPr>
-                        <m:sty m:val="p"/>
-                      </m:rPr>
-                      <m:t>(</m:t>
-                    </m:r>
-                    <m:r>
-                      <m:t>x</m:t>
-                    </m:r>
-                    <m:r>
-                      <m:rPr>
-                        <m:sty m:val="p"/>
-                      </m:rPr>
-                      <m:t>)</m:t>
-                    </m:r>
-                  </m:oMath>
-                  <w:r>
-                    <w:t xml:space="preserve">​</w:t>
-                  </w:r>
-                </w:p>
-              </w:tc>
-              <w:tc>
-                <w:tcPr/>
-                <w:p>
-                  <w:pPr>
-                    <w:pStyle w:val="Compact"/>
-                    <w:jc w:val="center"/>
-                  </w:pPr>
-                  <m:oMath>
-                    <m:r>
-                      <m:t>f</m:t>
-                    </m:r>
-                    <m:r>
-                      <m:rPr>
-                        <m:sty m:val="p"/>
-                      </m:rPr>
-                      <m:t>(</m:t>
-                    </m:r>
-                    <m:r>
-                      <m:t>x</m:t>
-                    </m:r>
-                    <m:r>
-                      <m:rPr>
-                        <m:sty m:val="p"/>
-                      </m:rPr>
-                      <m:t>;</m:t>
-                    </m:r>
-                    <m:r>
-                      <m:t>θ</m:t>
-                    </m:r>
-                    <m:r>
-                      <m:rPr>
-                        <m:sty m:val="p"/>
-                      </m:rPr>
-                      <m:t>)</m:t>
-                    </m:r>
-                  </m:oMath>
-                  <w:r>
-                    <w:t xml:space="preserve">,</w:t>
-                  </w:r>
-                  <w:r>
-                    <w:t xml:space="preserve"> </w:t>
-                  </w:r>
-                  <m:oMath>
-                    <m:r>
-                      <m:t>f</m:t>
-                    </m:r>
-                    <m:r>
-                      <m:rPr>
-                        <m:sty m:val="p"/>
-                      </m:rPr>
-                      <m:t>(</m:t>
-                    </m:r>
-                    <m:r>
-                      <m:t>x</m:t>
-                    </m:r>
-                    <m:r>
-                      <m:rPr>
-                        <m:sty m:val="p"/>
-                      </m:rPr>
-                      <m:t>∣</m:t>
-                    </m:r>
-                    <m:r>
-                      <m:t>θ</m:t>
-                    </m:r>
-                    <m:r>
-                      <m:rPr>
-                        <m:sty m:val="p"/>
-                      </m:rPr>
-                      <m:t>)</m:t>
-                    </m:r>
-                  </m:oMath>
-                  <w:r>
-                    <w:t xml:space="preserve">,</w:t>
-                  </w:r>
-                  <w:r>
-                    <w:t xml:space="preserve"> </w:t>
-                  </w:r>
-                  <m:oMath>
-                    <m:r>
-                      <m:t>f</m:t>
-                    </m:r>
-                    <m:r>
-                      <m:rPr>
-                        <m:sty m:val="p"/>
-                      </m:rPr>
-                      <m:t>(</m:t>
-                    </m:r>
-                    <m:r>
-                      <m:t>x</m:t>
-                    </m:r>
-                    <m:r>
-                      <m:rPr>
-                        <m:sty m:val="p"/>
-                      </m:rPr>
-                      <m:t>,</m:t>
-                    </m:r>
-                    <m:r>
-                      <m:t>θ</m:t>
-                    </m:r>
-                    <m:r>
-                      <m:rPr>
-                        <m:sty m:val="p"/>
-                      </m:rPr>
-                      <m:t>)</m:t>
-                    </m:r>
-                  </m:oMath>
-                </w:p>
-              </w:tc>
-            </w:tr>
-            <w:tr>
-              <w:tc>
-                <w:tcPr/>
-                <w:p>
-                  <w:pPr>
-                    <w:pStyle w:val="Compact"/>
-                    <w:jc w:val="center"/>
-                  </w:pPr>
-                  <w:r>
-                    <w:t xml:space="preserve">probability under a parameter</w:t>
-                  </w:r>
-                </w:p>
-              </w:tc>
-              <w:tc>
-                <w:tcPr/>
-                <w:p>
-                  <w:pPr>
-                    <w:pStyle w:val="Compact"/>
-                    <w:jc w:val="center"/>
-                  </w:pPr>
-                  <m:oMath>
-                    <m:sSub>
-                      <m:e>
-                        <m:r>
-                          <m:rPr>
-                            <m:sty m:val="p"/>
-                          </m:rPr>
-                          <m:t>Pr</m:t>
-                        </m:r>
-                      </m:e>
-                      <m:sub>
-                        <m:r>
-                          <m:t>θ</m:t>
-                        </m:r>
-                      </m:sub>
-                    </m:sSub>
-                    <m:r>
-                      <m:rPr>
-                        <m:sty m:val="p"/>
-                      </m:rPr>
-                      <m:t>(</m:t>
-                    </m:r>
-                    <m:r>
-                      <m:t>A</m:t>
-                    </m:r>
-                    <m:r>
-                      <m:rPr>
-                        <m:sty m:val="p"/>
-                      </m:rPr>
-                      <m:t>)</m:t>
-                    </m:r>
-                  </m:oMath>
-                  <w:r>
-                    <w:t xml:space="preserve">​</w:t>
-                  </w:r>
-                </w:p>
-              </w:tc>
-              <w:tc>
-                <w:tcPr/>
-                <w:p>
-                  <w:pPr>
-                    <w:pStyle w:val="Compact"/>
-                    <w:jc w:val="center"/>
-                  </w:pPr>
-                  <m:oMath>
-                    <m:r>
-                      <m:rPr>
-                        <m:sty m:val="p"/>
-                      </m:rPr>
-                      <m:t>Pr</m:t>
-                    </m:r>
-                    <m:r>
-                      <m:rPr>
-                        <m:sty m:val="p"/>
-                      </m:rPr>
-                      <m:t>(</m:t>
-                    </m:r>
-                    <m:r>
-                      <m:t>A</m:t>
-                    </m:r>
-                    <m:r>
-                      <m:rPr>
-                        <m:sty m:val="p"/>
-                      </m:rPr>
-                      <m:t>;</m:t>
-                    </m:r>
-                    <m:r>
-                      <m:t>θ</m:t>
-                    </m:r>
-                    <m:r>
-                      <m:rPr>
-                        <m:sty m:val="p"/>
-                      </m:rPr>
-                      <m:t>)</m:t>
-                    </m:r>
-                  </m:oMath>
-                  <w:r>
-                    <w:t xml:space="preserve">,</w:t>
-                  </w:r>
-                  <w:r>
-                    <w:t xml:space="preserve"> </w:t>
-                  </w:r>
-                  <m:oMath>
-                    <m:r>
-                      <m:rPr>
-                        <m:sty m:val="p"/>
-                      </m:rPr>
-                      <m:t>Pr</m:t>
-                    </m:r>
-                    <m:r>
-                      <m:rPr>
-                        <m:sty m:val="p"/>
-                      </m:rPr>
-                      <m:t>(</m:t>
-                    </m:r>
-                    <m:r>
-                      <m:t>A</m:t>
-                    </m:r>
-                    <m:r>
-                      <m:rPr>
-                        <m:sty m:val="p"/>
-                      </m:rPr>
-                      <m:t>∣</m:t>
-                    </m:r>
-                    <m:r>
-                      <m:t>θ</m:t>
-                    </m:r>
-                    <m:r>
-                      <m:rPr>
-                        <m:sty m:val="p"/>
-                      </m:rPr>
-                      <m:t>)</m:t>
-                    </m:r>
-                  </m:oMath>
-                </w:p>
-              </w:tc>
-            </w:tr>
-            <w:tr>
-              <w:tc>
-                <w:tcPr/>
-                <w:p>
-                  <w:pPr>
-                    <w:pStyle w:val="Compact"/>
-                    <w:jc w:val="center"/>
-                  </w:pPr>
-                  <w:r>
-                    <w:t xml:space="preserve">derivative of order</w:t>
-                  </w:r>
-                  <w:r>
-                    <w:t xml:space="preserve"> </w:t>
-                  </w:r>
-                  <m:oMath>
-                    <m:r>
-                      <m:t>k</m:t>
-                    </m:r>
-                  </m:oMath>
-                </w:p>
-              </w:tc>
-              <w:tc>
-                <w:tcPr/>
-                <w:p>
-                  <w:pPr>
-                    <w:pStyle w:val="Compact"/>
-                    <w:jc w:val="center"/>
-                  </w:pPr>
-                  <m:oMath>
-                    <m:sSup>
-                      <m:e>
-                        <m:r>
-                          <m:t>f</m:t>
-                        </m:r>
-                      </m:e>
-                      <m:sup>
-                        <m:r>
-                          <m:rPr>
-                            <m:sty m:val="p"/>
-                          </m:rPr>
-                          <m:t>(</m:t>
-                        </m:r>
-                        <m:r>
-                          <m:t>k</m:t>
-                        </m:r>
-                        <m:r>
-                          <m:rPr>
-                            <m:sty m:val="p"/>
-                          </m:rPr>
-                          <m:t>)</m:t>
-                        </m:r>
-                      </m:sup>
-                    </m:sSup>
-                    <m:r>
-                      <m:rPr>
-                        <m:sty m:val="p"/>
-                      </m:rPr>
-                      <m:t>(</m:t>
-                    </m:r>
-                    <m:r>
-                      <m:t>x</m:t>
-                    </m:r>
-                    <m:r>
-                      <m:rPr>
-                        <m:sty m:val="p"/>
-                      </m:rPr>
-                      <m:t>)</m:t>
-                    </m:r>
-                  </m:oMath>
-                  <w:r>
-                    <w:t xml:space="preserve">​</w:t>
-                  </w:r>
-                </w:p>
-              </w:tc>
-              <w:tc>
-                <w:tcPr/>
-                <w:p>
-                  <w:pPr>
-                    <w:pStyle w:val="Compact"/>
-                    <w:jc w:val="center"/>
-                  </w:pPr>
-                  <m:oMath>
-                    <m:sSup>
-                      <m:e>
-                        <m:r>
-                          <m:t>f</m:t>
-                        </m:r>
-                      </m:e>
-                      <m:sup>
-                        <m:r>
-                          <m:rPr>
-                            <m:sty m:val="p"/>
-                          </m:rPr>
-                          <m:t>[</m:t>
-                        </m:r>
-                        <m:r>
-                          <m:t>k</m:t>
-                        </m:r>
-                        <m:r>
-                          <m:rPr>
-                            <m:sty m:val="p"/>
-                          </m:rPr>
-                          <m:t>]</m:t>
-                        </m:r>
-                      </m:sup>
-                    </m:sSup>
-                    <m:r>
-                      <m:rPr>
-                        <m:sty m:val="p"/>
-                      </m:rPr>
-                      <m:t>(</m:t>
-                    </m:r>
-                    <m:r>
-                      <m:t>x</m:t>
-                    </m:r>
-                    <m:r>
-                      <m:rPr>
-                        <m:sty m:val="p"/>
-                      </m:rPr>
-                      <m:t>)</m:t>
-                    </m:r>
-                  </m:oMath>
-                  <w:r>
-                    <w:t xml:space="preserve">,</w:t>
-                  </w:r>
-                  <w:r>
-                    <w:t xml:space="preserve"> </w:t>
-                  </w:r>
-                  <m:oMath>
-                    <m:sSup>
-                      <m:e>
-                        <m:r>
-                          <m:rPr>
-                            <m:sty m:val="p"/>
-                          </m:rPr>
-                          <m:t>D</m:t>
-                        </m:r>
-                      </m:e>
-                      <m:sup>
-                        <m:r>
-                          <m:t>k</m:t>
-                        </m:r>
-                      </m:sup>
-                    </m:sSup>
-                    <m:r>
-                      <m:t>f</m:t>
-                    </m:r>
-                    <m:r>
-                      <m:rPr>
-                        <m:sty m:val="p"/>
-                      </m:rPr>
-                      <m:t>(</m:t>
-                    </m:r>
-                    <m:r>
-                      <m:t>x</m:t>
-                    </m:r>
-                    <m:r>
-                      <m:rPr>
-                        <m:sty m:val="p"/>
-                      </m:rPr>
-                      <m:t>)</m:t>
-                    </m:r>
-                  </m:oMath>
-                </w:p>
-              </w:tc>
-            </w:tr>
-            <w:tr>
-              <w:tc>
-                <w:tcPr/>
-                <w:p>
-                  <w:pPr>
-                    <w:pStyle w:val="Compact"/>
-                    <w:jc w:val="center"/>
-                  </w:pPr>
-                  <w:r>
-                    <w:t xml:space="preserve">order statistic</w:t>
-                  </w:r>
-                </w:p>
-              </w:tc>
-              <w:tc>
-                <w:tcPr/>
-                <w:p>
-                  <w:pPr>
-                    <w:pStyle w:val="Compact"/>
-                    <w:jc w:val="center"/>
-                  </w:pPr>
-                  <m:oMath>
-                    <m:sSub>
-                      <m:e>
-                        <m:r>
-                          <m:t>X</m:t>
-                        </m:r>
-                      </m:e>
-                      <m:sub>
-                        <m:r>
-                          <m:rPr>
-                            <m:sty m:val="p"/>
-                          </m:rPr>
-                          <m:t>(</m:t>
-                        </m:r>
-                        <m:r>
-                          <m:t>i</m:t>
-                        </m:r>
-                        <m:r>
-                          <m:rPr>
-                            <m:sty m:val="p"/>
-                          </m:rPr>
-                          <m:t>)</m:t>
-                        </m:r>
-                      </m:sub>
-                    </m:sSub>
-                  </m:oMath>
-                  <w:r>
-                    <w:t xml:space="preserve">​</w:t>
-                  </w:r>
-                </w:p>
-              </w:tc>
-              <w:tc>
-                <w:tcPr/>
-                <w:p>
-                  <w:pPr>
-                    <w:pStyle w:val="Compact"/>
-                    <w:jc w:val="center"/>
-                  </w:pPr>
-                  <m:oMath>
-                    <m:sSub>
-                      <m:e>
-                        <m:r>
-                          <m:t>X</m:t>
-                        </m:r>
-                      </m:e>
-                      <m:sub>
-                        <m:r>
-                          <m:t>i</m:t>
-                        </m:r>
-                        <m:r>
-                          <m:rPr>
-                            <m:sty m:val="p"/>
-                          </m:rPr>
-                          <m:t>:</m:t>
-                        </m:r>
-                        <m:r>
-                          <m:t>n</m:t>
-                        </m:r>
-                      </m:sub>
-                    </m:sSub>
-                  </m:oMath>
-                  <w:r>
-                    <w:t xml:space="preserve">​</w:t>
-                  </w:r>
-                </w:p>
-              </w:tc>
-            </w:tr>
-            <w:tr>
-              <w:tc>
-                <w:tcPr/>
-                <w:p>
-                  <w:pPr>
-                    <w:pStyle w:val="Compact"/>
-                    <w:jc w:val="center"/>
-                  </w:pPr>
-                  <w:r>
-                    <w:t xml:space="preserve">sample index</w:t>
-                  </w:r>
-                </w:p>
-              </w:tc>
-              <w:tc>
-                <w:tcPr/>
-                <w:p>
-                  <w:pPr>
-                    <w:pStyle w:val="Compact"/>
-                    <w:jc w:val="center"/>
-                  </w:pPr>
-                  <m:oMath>
-                    <m:sSub>
-                      <m:e>
-                        <m:r>
-                          <m:t>x</m:t>
-                        </m:r>
-                      </m:e>
-                      <m:sub>
-                        <m:r>
-                          <m:t>i</m:t>
-                        </m:r>
-                      </m:sub>
-                    </m:sSub>
-                  </m:oMath>
-                  <w:r>
-                    <w:t xml:space="preserve">​</w:t>
-                  </w:r>
-                </w:p>
-              </w:tc>
-              <w:tc>
-                <w:tcPr/>
-                <w:p>
-                  <w:pPr>
-                    <w:pStyle w:val="Compact"/>
-                    <w:jc w:val="center"/>
-                  </w:pPr>
-                  <m:oMath>
-                    <m:sSup>
-                      <m:e>
-                        <m:r>
-                          <m:t>x</m:t>
-                        </m:r>
-                      </m:e>
-                      <m:sup>
-                        <m:r>
-                          <m:rPr>
-                            <m:sty m:val="p"/>
-                          </m:rPr>
-                          <m:t>(</m:t>
-                        </m:r>
-                        <m:r>
-                          <m:t>i</m:t>
-                        </m:r>
-                        <m:r>
-                          <m:rPr>
-                            <m:sty m:val="p"/>
-                          </m:rPr>
-                          <m:t>)</m:t>
-                        </m:r>
-                      </m:sup>
-                    </m:sSup>
-                  </m:oMath>
-                  <w:r>
-                    <w:t xml:space="preserve">​</w:t>
-                  </w:r>
-                </w:p>
-              </w:tc>
-            </w:tr>
-          </w:tbl>
-          <w:bookmarkEnd w:id="33"/>
-          <w:p/>
-        </w:tc>
-      </w:tr>
-    </w:tbl>
-    <w:bookmarkStart w:id="35" w:name="exm-process-notation"/>
+    <w:p>
+      <w:pPr>
+        <w:pStyle w:val="BodyText"/>
+      </w:pPr>
+      <w:r>
+        <w:t xml:space="preserve">The</w:t>
+      </w:r>
+      <w:r>
+        <w:t xml:space="preserve"> </w:t>
+      </w:r>
+      <w:hyperlink r:id="rId32">
+        <w:r>
+          <w:rPr>
+            <w:rStyle w:val="Hyperlink"/>
+          </w:rPr>
+          <w:t xml:space="preserve">Notation Across Sources page</w:t>
+        </w:r>
+      </w:hyperlink>
+      <w:r>
+        <w:t xml:space="preserve"> </w:t>
+      </w:r>
+      <w:r>
+        <w:t xml:space="preserve">of the macros site tabulates our form of each object beside the other forms you may encounter.</w:t>
+      </w:r>
+    </w:p>
+    <w:bookmarkStart w:id="34" w:name="exm-process-notation"/>
     <w:p>
       <w:pPr>
         <w:pStyle w:val="BodyText"/>
@@ -3040,7 +2123,7 @@
       <w:r>
         <w:t xml:space="preserve"> </w:t>
       </w:r>
-      <w:hyperlink r:id="rId34">
+      <w:hyperlink r:id="rId33">
         <w:r>
           <w:rPr>
             <w:rStyle w:val="Hyperlink"/>
@@ -3150,9 +2233,9 @@
         <w:t xml:space="preserve">with both arguments in parentheses.</w:t>
       </w:r>
     </w:p>
+    <w:bookmarkEnd w:id="34"/>
     <w:bookmarkEnd w:id="35"/>
-    <w:bookmarkEnd w:id="36"/>
-    <w:bookmarkStart w:id="43" w:name="X93a3d4ef5e06a67ae6b891e46b41b74b3674f55"/>
+    <w:bookmarkStart w:id="42" w:name="X93a3d4ef5e06a67ae6b891e46b41b74b3674f55"/>
     <w:p>
       <w:pPr>
         <w:pStyle w:val="Heading2"/>
@@ -3281,7 +2364,7 @@
       <w:r>
         <w:t xml:space="preserve"> </w:t>
       </w:r>
-      <w:hyperlink r:id="rId37">
+      <w:hyperlink r:id="rId36">
         <w:r>
           <w:rPr>
             <w:rStyle w:val="Hyperlink"/>
@@ -3301,7 +2384,7 @@
       <w:r>
         <w:t xml:space="preserve"> </w:t>
       </w:r>
-      <w:hyperlink r:id="rId38">
+      <w:hyperlink r:id="rId37">
         <w:r>
           <w:rPr>
             <w:rStyle w:val="Hyperlink"/>
@@ -3321,7 +2404,7 @@
       <w:r>
         <w:t xml:space="preserve"> </w:t>
       </w:r>
-      <w:hyperlink r:id="rId39">
+      <w:hyperlink r:id="rId38">
         <w:r>
           <w:rPr>
             <w:rStyle w:val="Hyperlink"/>
@@ -3341,7 +2424,7 @@
       <w:r>
         <w:t xml:space="preserve"> </w:t>
       </w:r>
-      <w:hyperlink r:id="rId40">
+      <w:hyperlink r:id="rId39">
         <w:r>
           <w:rPr>
             <w:rStyle w:val="Hyperlink"/>
@@ -3361,7 +2444,7 @@
       <w:r>
         <w:t xml:space="preserve"> </w:t>
       </w:r>
-      <w:hyperlink r:id="rId41">
+      <w:hyperlink r:id="rId40">
         <w:r>
           <w:rPr>
             <w:rStyle w:val="Hyperlink"/>
@@ -3402,7 +2485,7 @@
       <w:r>
         <w:t xml:space="preserve"> </w:t>
       </w:r>
-      <w:hyperlink r:id="rId42">
+      <w:hyperlink r:id="rId41">
         <w:r>
           <w:rPr>
             <w:rStyle w:val="Hyperlink"/>
@@ -3414,8 +2497,8 @@
         <w:t xml:space="preserve">.</w:t>
       </w:r>
     </w:p>
-    <w:bookmarkEnd w:id="43"/>
-    <w:bookmarkStart w:id="50" w:name="sec-further-reading"/>
+    <w:bookmarkEnd w:id="42"/>
+    <w:bookmarkStart w:id="49" w:name="sec-further-reading"/>
     <w:p>
       <w:pPr>
         <w:pStyle w:val="Heading2"/>
@@ -3440,7 +2523,7 @@
       <w:r>
         <w:t xml:space="preserve"> </w:t>
       </w:r>
-      <w:hyperlink r:id="rId44">
+      <w:hyperlink r:id="rId43">
         <w:r>
           <w:rPr>
             <w:rStyle w:val="Hyperlink"/>
@@ -3477,6 +2560,17 @@
       </w:r>
       <w:r>
         <w:t xml:space="preserve">logical connectives (</w:t>
+      </w:r>
+      <w:hyperlink r:id="rId44">
+        <w:r>
+          <w:rPr>
+            <w:rStyle w:val="Hyperlink"/>
+          </w:rPr>
+          <w:t xml:space="preserve">definition</w:t>
+        </w:r>
+      </w:hyperlink>
+      <w:r>
+        <w:t xml:space="preserve">) and quantifiers (</w:t>
       </w:r>
       <w:hyperlink r:id="rId45">
         <w:r>
@@ -3487,17 +2581,6 @@
         </w:r>
       </w:hyperlink>
       <w:r>
-        <w:t xml:space="preserve">) and quantifiers (</w:t>
-      </w:r>
-      <w:hyperlink r:id="rId46">
-        <w:r>
-          <w:rPr>
-            <w:rStyle w:val="Hyperlink"/>
-          </w:rPr>
-          <w:t xml:space="preserve">definition</w:t>
-        </w:r>
-      </w:hyperlink>
-      <w:r>
         <w:t xml:space="preserve">),</w:t>
       </w:r>
       <w:r>
@@ -3547,7 +2630,7 @@
       <w:r>
         <w:t xml:space="preserve"> </w:t>
       </w:r>
-      <w:hyperlink r:id="rId47">
+      <w:hyperlink r:id="rId46">
         <w:r>
           <w:rPr>
             <w:rStyle w:val="Hyperlink"/>
@@ -3561,7 +2644,7 @@
       <w:r>
         <w:t xml:space="preserve"> </w:t>
       </w:r>
-      <w:hyperlink r:id="rId48">
+      <w:hyperlink r:id="rId47">
         <w:r>
           <w:rPr>
             <w:rStyle w:val="Hyperlink"/>
@@ -3575,7 +2658,7 @@
       <w:r>
         <w:t xml:space="preserve"> </w:t>
       </w:r>
-      <w:hyperlink r:id="rId49">
+      <w:hyperlink r:id="rId48">
         <w:r>
           <w:rPr>
             <w:rStyle w:val="Hyperlink"/>
@@ -3590,8 +2673,8 @@
         <w:t xml:space="preserve">pages.</w:t>
       </w:r>
     </w:p>
-    <w:bookmarkEnd w:id="50"/>
-    <w:bookmarkStart w:id="58" w:name="references"/>
+    <w:bookmarkEnd w:id="49"/>
+    <w:bookmarkStart w:id="57" w:name="references"/>
     <w:p>
       <w:pPr>
         <w:pStyle w:val="Heading2"/>
@@ -3600,8 +2683,8 @@
         <w:t xml:space="preserve">References</w:t>
       </w:r>
     </w:p>
-    <w:bookmarkStart w:id="57" w:name="refs"/>
-    <w:bookmarkStart w:id="52" w:name="ref-nelder1972generalized"/>
+    <w:bookmarkStart w:id="56" w:name="refs"/>
+    <w:bookmarkStart w:id="51" w:name="ref-nelder1972generalized"/>
     <w:p>
       <w:pPr>
         <w:pStyle w:val="Bibliography"/>
@@ -3640,7 +2723,7 @@
       <w:r>
         <w:t xml:space="preserve"> </w:t>
       </w:r>
-      <w:hyperlink r:id="rId51">
+      <w:hyperlink r:id="rId50">
         <w:r>
           <w:rPr>
             <w:rStyle w:val="Hyperlink"/>
@@ -3652,8 +2735,8 @@
         <w:t xml:space="preserve">.</w:t>
       </w:r>
     </w:p>
-    <w:bookmarkEnd w:id="52"/>
-    <w:bookmarkStart w:id="54" w:name="ref-velleman2019prove"/>
+    <w:bookmarkEnd w:id="51"/>
+    <w:bookmarkStart w:id="53" w:name="ref-velleman2019prove"/>
     <w:p>
       <w:pPr>
         <w:pStyle w:val="Bibliography"/>
@@ -3686,7 +2769,7 @@
       <w:r>
         <w:t xml:space="preserve"> </w:t>
       </w:r>
-      <w:hyperlink r:id="rId53">
+      <w:hyperlink r:id="rId52">
         <w:r>
           <w:rPr>
             <w:rStyle w:val="Hyperlink"/>
@@ -3698,8 +2781,8 @@
         <w:t xml:space="preserve">.</w:t>
       </w:r>
     </w:p>
-    <w:bookmarkEnd w:id="54"/>
-    <w:bookmarkStart w:id="56" w:name="ref-barkerplummer2011language"/>
+    <w:bookmarkEnd w:id="53"/>
+    <w:bookmarkStart w:id="55" w:name="ref-barkerplummer2011language"/>
     <w:p>
       <w:pPr>
         <w:pStyle w:val="Bibliography"/>
@@ -3732,7 +2815,7 @@
       <w:r>
         <w:t xml:space="preserve"> </w:t>
       </w:r>
-      <w:hyperlink r:id="rId55">
+      <w:hyperlink r:id="rId54">
         <w:r>
           <w:rPr>
             <w:rStyle w:val="Hyperlink"/>
@@ -3741,9 +2824,9 @@
         </w:r>
       </w:hyperlink>
     </w:p>
+    <w:bookmarkEnd w:id="55"/>
     <w:bookmarkEnd w:id="56"/>
     <w:bookmarkEnd w:id="57"/>
-    <w:bookmarkEnd w:id="58"/>
     <w:sectPr>
       <w:footnotePr>
         <w:numRestart w:val="eachSect"/>

</xml_diff>